<commit_message>
Phase 0: ingest 614-item phase ledger into hxc_registry.db (HXC-1001..1614); DB-as-source-of-truth
- docs/research/_ledger/*.json: comprehensive atomic work items for all 11 phases
  (mvp 71, p02 23, p03 55, p04 69, p05 44, p06 53, p07 39, p08 66, p08B 68, p08C 55, foundation 79)
- data/hxc_registry.db: 640 items total, item_history Opened events, metadata in forensic_anchor JSON
- scripts/docs/db_to_md.py: DB->markdown generator (§11.4.93); issues.md now 623 active (drift resolved)
- phase_02 limited to lawful distributed-systems items only (no jailbreak/exploit content)

Co-Authored-By: Claude Opus 4.8 <noreply@anthropic.com>
</commit_message>
<xml_diff>
--- a/docs/export/continuation.docx
+++ b/docs/export/continuation.docx
@@ -34,7 +34,7 @@
         <w:t xml:space="preserve"> </w:t>
       </w:r>
       <w:r>
-        <w:t xml:space="preserve">27</w:t>
+        <w:t xml:space="preserve">28</w:t>
       </w:r>
       <w:r>
         <w:t xml:space="preserve"> </w:t>
@@ -50,7 +50,7 @@
         <w:t xml:space="preserve"> </w:t>
       </w:r>
       <w:r>
-        <w:t xml:space="preserve">2026-06-01T09:36:01Z</w:t>
+        <w:t xml:space="preserve">2026-06-01T09:59:49Z</w:t>
       </w:r>
       <w:r>
         <w:t xml:space="preserve"> </w:t>
@@ -184,6 +184,33 @@
               <w:rPr>
                 <w:rStyle w:val="VerbatimChar"/>
               </w:rPr>
+              <w:t xml:space="preserve">a15c272</w:t>
+            </w:r>
+          </w:p>
+        </w:tc>
+        <w:tc>
+          <w:tcPr/>
+          <w:p>
+            <w:pPr>
+              <w:pStyle w:val="Compact"/>
+            </w:pPr>
+            <w:r>
+              <w:t xml:space="preserve">Phase 0: wire docs_chain (§11.4.106) — tracked_docs context, engine wrapper, commit gate sync+verify, canonical doc dedup manifest</w:t>
+            </w:r>
+          </w:p>
+        </w:tc>
+      </w:tr>
+      <w:tr>
+        <w:tc>
+          <w:tcPr/>
+          <w:p>
+            <w:pPr>
+              <w:pStyle w:val="Compact"/>
+            </w:pPr>
+            <w:r>
+              <w:rPr>
+                <w:rStyle w:val="VerbatimChar"/>
+              </w:rPr>
               <w:t xml:space="preserve">4554e9a</w:t>
             </w:r>
           </w:p>
@@ -412,33 +439,6 @@
             </w:pPr>
             <w:r>
               <w:t xml:space="preserve">Phase 4 gaps: 26 chaos faults, SWIM SimTransport DST, Welch regression detector, device provisioner, wasm capability sandbox (PCS-6/CLAUDE-1)</w:t>
-            </w:r>
-          </w:p>
-        </w:tc>
-      </w:tr>
-      <w:tr>
-        <w:tc>
-          <w:tcPr/>
-          <w:p>
-            <w:pPr>
-              <w:pStyle w:val="Compact"/>
-            </w:pPr>
-            <w:r>
-              <w:rPr>
-                <w:rStyle w:val="VerbatimChar"/>
-              </w:rPr>
-              <w:t xml:space="preserve">2e70be1</w:t>
-            </w:r>
-          </w:p>
-        </w:tc>
-        <w:tc>
-          <w:tcPr/>
-          <w:p>
-            <w:pPr>
-              <w:pStyle w:val="Compact"/>
-            </w:pPr>
-            <w:r>
-              <w:t xml:space="preserve">Phase 3 gaps: classads scheduler plugin, S3 storage backend (SigV4), OTLP/HTTP trace exporter (PCS-6/CLAUDE-1)</w:t>
             </w:r>
           </w:p>
         </w:tc>
@@ -548,7 +548,7 @@
               <w:rPr>
                 <w:rStyle w:val="VerbatimChar"/>
               </w:rPr>
-              <w:t xml:space="preserve">4554e9a</w:t>
+              <w:t xml:space="preserve">a15c272</w:t>
             </w:r>
           </w:p>
         </w:tc>
@@ -576,7 +576,7 @@
               <w:pStyle w:val="Compact"/>
             </w:pPr>
             <w:r>
-              <w:t xml:space="preserve">2026-06-01T09:36:01Z</w:t>
+              <w:t xml:space="preserve">2026-06-01T09:59:49Z</w:t>
             </w:r>
           </w:p>
         </w:tc>

</xml_diff>

<commit_message>
Foundation: add pkg/testing/evidence — §7.1 positive-evidence test helper (TDD + §1.1 mutation-paired)
Real-action + before/after delta + positive-evidence(not absence-of-error) + per-run UUID token +
sink-side artifact/manifest capture to qa-results/. Decoupled (QA_RESULTS_DIR configurable). green -race.
This is the shared substrate every non-unit test uses to prove features work for end users.

Co-Authored-By: Claude Opus 4.8 <noreply@anthropic.com>
</commit_message>
<xml_diff>
--- a/docs/export/continuation.docx
+++ b/docs/export/continuation.docx
@@ -34,7 +34,7 @@
         <w:t xml:space="preserve"> </w:t>
       </w:r>
       <w:r>
-        <w:t xml:space="preserve">28</w:t>
+        <w:t xml:space="preserve">29</w:t>
       </w:r>
       <w:r>
         <w:t xml:space="preserve"> </w:t>
@@ -50,7 +50,7 @@
         <w:t xml:space="preserve"> </w:t>
       </w:r>
       <w:r>
-        <w:t xml:space="preserve">2026-06-01T09:59:49Z</w:t>
+        <w:t xml:space="preserve">2026-06-01T10:16:32Z</w:t>
       </w:r>
       <w:r>
         <w:t xml:space="preserve"> </w:t>
@@ -184,6 +184,33 @@
               <w:rPr>
                 <w:rStyle w:val="VerbatimChar"/>
               </w:rPr>
+              <w:t xml:space="preserve">47b6d91</w:t>
+            </w:r>
+          </w:p>
+        </w:tc>
+        <w:tc>
+          <w:tcPr/>
+          <w:p>
+            <w:pPr>
+              <w:pStyle w:val="Compact"/>
+            </w:pPr>
+            <w:r>
+              <w:t xml:space="preserve">Phase 0: ingest 614-item phase ledger into hxc_registry.db (HXC-1001..1614); DB-as-source-of-truth</w:t>
+            </w:r>
+          </w:p>
+        </w:tc>
+      </w:tr>
+      <w:tr>
+        <w:tc>
+          <w:tcPr/>
+          <w:p>
+            <w:pPr>
+              <w:pStyle w:val="Compact"/>
+            </w:pPr>
+            <w:r>
+              <w:rPr>
+                <w:rStyle w:val="VerbatimChar"/>
+              </w:rPr>
               <w:t xml:space="preserve">a15c272</w:t>
             </w:r>
           </w:p>
@@ -412,33 +439,6 @@
             </w:pPr>
             <w:r>
               <w:t xml:space="preserve">Phase 5 gaps: device tier classifier, tier+power scheduler plugin, trust registry, cloudspot preemption, inference router (PCS-6/CLAUDE-1)</w:t>
-            </w:r>
-          </w:p>
-        </w:tc>
-      </w:tr>
-      <w:tr>
-        <w:tc>
-          <w:tcPr/>
-          <w:p>
-            <w:pPr>
-              <w:pStyle w:val="Compact"/>
-            </w:pPr>
-            <w:r>
-              <w:rPr>
-                <w:rStyle w:val="VerbatimChar"/>
-              </w:rPr>
-              <w:t xml:space="preserve">7a58d0b</w:t>
-            </w:r>
-          </w:p>
-        </w:tc>
-        <w:tc>
-          <w:tcPr/>
-          <w:p>
-            <w:pPr>
-              <w:pStyle w:val="Compact"/>
-            </w:pPr>
-            <w:r>
-              <w:t xml:space="preserve">Phase 4 gaps: 26 chaos faults, SWIM SimTransport DST, Welch regression detector, device provisioner, wasm capability sandbox (PCS-6/CLAUDE-1)</w:t>
             </w:r>
           </w:p>
         </w:tc>
@@ -548,7 +548,7 @@
               <w:rPr>
                 <w:rStyle w:val="VerbatimChar"/>
               </w:rPr>
-              <w:t xml:space="preserve">a15c272</w:t>
+              <w:t xml:space="preserve">47b6d91</w:t>
             </w:r>
           </w:p>
         </w:tc>
@@ -576,7 +576,7 @@
               <w:pStyle w:val="Compact"/>
             </w:pPr>
             <w:r>
-              <w:t xml:space="preserve">2026-06-01T09:59:49Z</w:t>
+              <w:t xml:space="preserve">2026-06-01T10:16:32Z</w:t>
             </w:r>
           </w:p>
         </w:tc>

</xml_diff>

<commit_message>
Foundation wave 1: anti-bluff remediation of etcd/lock/infra/build/security/crypto/jwt/hxcregistry/storage/wasm (verified)
4 disjoint subagent streams, all TDD + §7.1 evidence + §1.1 mutation-paired; orchestrator-verified:
- etcd/lock: no-op-lock-killer concurrency proof (fails WITHOUT -race), real-etcd integration PASS (podman)
- infra/build: real go-build→execute→token proof; container orchestrator/builder honestly t.Skip pending
- security/crypto/jwt: real mTLS negotiated-peer-identity, AES-GCM token round-trip, JWT tamper-reject (mutation-proven)
- hxcregistry/storage/wasm: real-Postgres audit-sink integration PASS, copy-contract+-race, real wasm ABI output
- pkg/testing/evidence used throughout; reports in docs/research/_ledger/_remediation/
All touched pkgs green under -race; build+vet clean repo-wide. Pending items (real container infra, Vault dep) tracked.

Co-Authored-By: Claude Opus 4.8 <noreply@anthropic.com>
</commit_message>
<xml_diff>
--- a/docs/export/continuation.docx
+++ b/docs/export/continuation.docx
@@ -34,7 +34,7 @@
         <w:t xml:space="preserve"> </w:t>
       </w:r>
       <w:r>
-        <w:t xml:space="preserve">29</w:t>
+        <w:t xml:space="preserve">30</w:t>
       </w:r>
       <w:r>
         <w:t xml:space="preserve"> </w:t>
@@ -50,7 +50,7 @@
         <w:t xml:space="preserve"> </w:t>
       </w:r>
       <w:r>
-        <w:t xml:space="preserve">2026-06-01T10:16:32Z</w:t>
+        <w:t xml:space="preserve">2026-06-01T10:27:45Z</w:t>
       </w:r>
       <w:r>
         <w:t xml:space="preserve"> </w:t>
@@ -184,6 +184,33 @@
               <w:rPr>
                 <w:rStyle w:val="VerbatimChar"/>
               </w:rPr>
+              <w:t xml:space="preserve">8d7030c</w:t>
+            </w:r>
+          </w:p>
+        </w:tc>
+        <w:tc>
+          <w:tcPr/>
+          <w:p>
+            <w:pPr>
+              <w:pStyle w:val="Compact"/>
+            </w:pPr>
+            <w:r>
+              <w:t xml:space="preserve">Foundation: add pkg/testing/evidence — §7.1 positive-evidence test helper (TDD + §1.1 mutation-paired)</w:t>
+            </w:r>
+          </w:p>
+        </w:tc>
+      </w:tr>
+      <w:tr>
+        <w:tc>
+          <w:tcPr/>
+          <w:p>
+            <w:pPr>
+              <w:pStyle w:val="Compact"/>
+            </w:pPr>
+            <w:r>
+              <w:rPr>
+                <w:rStyle w:val="VerbatimChar"/>
+              </w:rPr>
               <w:t xml:space="preserve">47b6d91</w:t>
             </w:r>
           </w:p>
@@ -412,33 +439,6 @@
             </w:pPr>
             <w:r>
               <w:t xml:space="preserve">Phase 6 gaps: HLC, CRDTs+merkle anti-entropy, federation cell registry/FSM, SWIM phi-accrual (PCS-6/CLAUDE-1)</w:t>
-            </w:r>
-          </w:p>
-        </w:tc>
-      </w:tr>
-      <w:tr>
-        <w:tc>
-          <w:tcPr/>
-          <w:p>
-            <w:pPr>
-              <w:pStyle w:val="Compact"/>
-            </w:pPr>
-            <w:r>
-              <w:rPr>
-                <w:rStyle w:val="VerbatimChar"/>
-              </w:rPr>
-              <w:t xml:space="preserve">0d543b0</w:t>
-            </w:r>
-          </w:p>
-        </w:tc>
-        <w:tc>
-          <w:tcPr/>
-          <w:p>
-            <w:pPr>
-              <w:pStyle w:val="Compact"/>
-            </w:pPr>
-            <w:r>
-              <w:t xml:space="preserve">Phase 5 gaps: device tier classifier, tier+power scheduler plugin, trust registry, cloudspot preemption, inference router (PCS-6/CLAUDE-1)</w:t>
             </w:r>
           </w:p>
         </w:tc>
@@ -548,7 +548,7 @@
               <w:rPr>
                 <w:rStyle w:val="VerbatimChar"/>
               </w:rPr>
-              <w:t xml:space="preserve">47b6d91</w:t>
+              <w:t xml:space="preserve">8d7030c</w:t>
             </w:r>
           </w:p>
         </w:tc>
@@ -576,7 +576,7 @@
               <w:pStyle w:val="Compact"/>
             </w:pPr>
             <w:r>
-              <w:t xml:space="preserve">2026-06-01T10:16:32Z</w:t>
+              <w:t xml:space="preserve">2026-06-01T10:27:45Z</w:t>
             </w:r>
           </w:p>
         </w:tc>

</xml_diff>

<commit_message>
Foundation wave 1: mark 30 verified items Completed (HXC-1001..1009/1016-1018/1021/1024/1026-1027/1030-1037/1042-1045/1062-1063)
DB-tracked closure with evidence_path -> remediation reports; commit dbed10c. Fixed now 47, active 593.
Pending (Queued): real container orchestrator/builder (infra 1010-1015, build 1020/1022/1023/1025),
Vault (1028), wasm Host.Call branch (1038), lock ctx-leak (1019), and untouched MEDIUM/LOW pkgs + -race CI gate.

Co-Authored-By: Claude Opus 4.8 <noreply@anthropic.com>
</commit_message>
<xml_diff>
--- a/docs/export/continuation.docx
+++ b/docs/export/continuation.docx
@@ -34,7 +34,7 @@
         <w:t xml:space="preserve"> </w:t>
       </w:r>
       <w:r>
-        <w:t xml:space="preserve">30</w:t>
+        <w:t xml:space="preserve">31</w:t>
       </w:r>
       <w:r>
         <w:t xml:space="preserve"> </w:t>
@@ -50,7 +50,7 @@
         <w:t xml:space="preserve"> </w:t>
       </w:r>
       <w:r>
-        <w:t xml:space="preserve">2026-06-01T10:27:45Z</w:t>
+        <w:t xml:space="preserve">2026-06-01T10:29:29Z</w:t>
       </w:r>
       <w:r>
         <w:t xml:space="preserve"> </w:t>
@@ -184,6 +184,33 @@
               <w:rPr>
                 <w:rStyle w:val="VerbatimChar"/>
               </w:rPr>
+              <w:t xml:space="preserve">dbed10c</w:t>
+            </w:r>
+          </w:p>
+        </w:tc>
+        <w:tc>
+          <w:tcPr/>
+          <w:p>
+            <w:pPr>
+              <w:pStyle w:val="Compact"/>
+            </w:pPr>
+            <w:r>
+              <w:t xml:space="preserve">Foundation wave 1: anti-bluff remediation of etcd/lock/infra/build/security/crypto/jwt/hxcregistry/storage/wasm (verified)</w:t>
+            </w:r>
+          </w:p>
+        </w:tc>
+      </w:tr>
+      <w:tr>
+        <w:tc>
+          <w:tcPr/>
+          <w:p>
+            <w:pPr>
+              <w:pStyle w:val="Compact"/>
+            </w:pPr>
+            <w:r>
+              <w:rPr>
+                <w:rStyle w:val="VerbatimChar"/>
+              </w:rPr>
               <w:t xml:space="preserve">8d7030c</w:t>
             </w:r>
           </w:p>
@@ -412,33 +439,6 @@
             </w:pPr>
             <w:r>
               <w:t xml:space="preserve">Phase 7 gaps: hashslot CRC16, largest-subcluster voting, SLURM backfill, health startup tier, N+K admission, BOINC trust (PCS-6/CLAUDE-1)</w:t>
-            </w:r>
-          </w:p>
-        </w:tc>
-      </w:tr>
-      <w:tr>
-        <w:tc>
-          <w:tcPr/>
-          <w:p>
-            <w:pPr>
-              <w:pStyle w:val="Compact"/>
-            </w:pPr>
-            <w:r>
-              <w:rPr>
-                <w:rStyle w:val="VerbatimChar"/>
-              </w:rPr>
-              <w:t xml:space="preserve">a31c0de</w:t>
-            </w:r>
-          </w:p>
-        </w:tc>
-        <w:tc>
-          <w:tcPr/>
-          <w:p>
-            <w:pPr>
-              <w:pStyle w:val="Compact"/>
-            </w:pPr>
-            <w:r>
-              <w:t xml:space="preserve">Phase 6 gaps: HLC, CRDTs+merkle anti-entropy, federation cell registry/FSM, SWIM phi-accrual (PCS-6/CLAUDE-1)</w:t>
             </w:r>
           </w:p>
         </w:tc>
@@ -548,7 +548,7 @@
               <w:rPr>
                 <w:rStyle w:val="VerbatimChar"/>
               </w:rPr>
-              <w:t xml:space="preserve">8d7030c</w:t>
+              <w:t xml:space="preserve">dbed10c</w:t>
             </w:r>
           </w:p>
         </w:tc>
@@ -576,7 +576,7 @@
               <w:pStyle w:val="Compact"/>
             </w:pPr>
             <w:r>
-              <w:t xml:space="preserve">2026-06-01T10:27:45Z</w:t>
+              <w:t xml:space="preserve">2026-06-01T10:29:29Z</w:t>
             </w:r>
           </w:p>
         </w:tc>

</xml_diff>

<commit_message>
Foundation wave 2: mark 30 items Completed (HXC-1039..1041/1046..1061/1064..1074)
DB-as-source-of-truth (§11.4.93): 30 anti-bluff items -> Completed/Fixed,
commit_sha=a084eb1, per-item evidence_path + Completed item_history (by AI).
Regenerated issues.md (563 active) / fixed.md (77) + summaries via db_to_md.py.
Registry now 77 Completed / 1 In-progress / 562 Queued.
</commit_message>
<xml_diff>
--- a/docs/export/continuation.docx
+++ b/docs/export/continuation.docx
@@ -34,7 +34,7 @@
         <w:t xml:space="preserve"> </w:t>
       </w:r>
       <w:r>
-        <w:t xml:space="preserve">32</w:t>
+        <w:t xml:space="preserve">33</w:t>
       </w:r>
       <w:r>
         <w:t xml:space="preserve"> </w:t>
@@ -50,7 +50,7 @@
         <w:t xml:space="preserve"> </w:t>
       </w:r>
       <w:r>
-        <w:t xml:space="preserve">2026-06-01T11:04:34Z</w:t>
+        <w:t xml:space="preserve">2026-06-01T11:06:09Z</w:t>
       </w:r>
       <w:r>
         <w:t xml:space="preserve"> </w:t>
@@ -184,6 +184,33 @@
               <w:rPr>
                 <w:rStyle w:val="VerbatimChar"/>
               </w:rPr>
+              <w:t xml:space="preserve">a084eb1</w:t>
+            </w:r>
+          </w:p>
+        </w:tc>
+        <w:tc>
+          <w:tcPr/>
+          <w:p>
+            <w:pPr>
+              <w:pStyle w:val="Compact"/>
+            </w:pPr>
+            <w:r>
+              <w:t xml:space="preserve">Foundation wave 2: anti-bluff harden 29 pkg test items + §1.1 mutation runner + -race CI gate</w:t>
+            </w:r>
+          </w:p>
+        </w:tc>
+      </w:tr>
+      <w:tr>
+        <w:tc>
+          <w:tcPr/>
+          <w:p>
+            <w:pPr>
+              <w:pStyle w:val="Compact"/>
+            </w:pPr>
+            <w:r>
+              <w:rPr>
+                <w:rStyle w:val="VerbatimChar"/>
+              </w:rPr>
               <w:t xml:space="preserve">3fb815d</w:t>
             </w:r>
           </w:p>
@@ -412,33 +439,6 @@
             </w:pPr>
             <w:r>
               <w:t xml:space="preserve">Phase 8B gaps: GPU pool manager, cost broker, burst hysteresis, local GPU TCO, provider adapter (PCS-6/CLAUDE-1)</w:t>
-            </w:r>
-          </w:p>
-        </w:tc>
-      </w:tr>
-      <w:tr>
-        <w:tc>
-          <w:tcPr/>
-          <w:p>
-            <w:pPr>
-              <w:pStyle w:val="Compact"/>
-            </w:pPr>
-            <w:r>
-              <w:rPr>
-                <w:rStyle w:val="VerbatimChar"/>
-              </w:rPr>
-              <w:t xml:space="preserve">8b04418</w:t>
-            </w:r>
-          </w:p>
-        </w:tc>
-        <w:tc>
-          <w:tcPr/>
-          <w:p>
-            <w:pPr>
-              <w:pStyle w:val="Compact"/>
-            </w:pPr>
-            <w:r>
-              <w:t xml:space="preserve">Phase 8 gaps: chutes inference client+SSE+crypto seams, marketplace adapter+scorer, GPU dual-class reservation (PCS-6/CLAUDE-1)</w:t>
             </w:r>
           </w:p>
         </w:tc>
@@ -548,7 +548,7 @@
               <w:rPr>
                 <w:rStyle w:val="VerbatimChar"/>
               </w:rPr>
-              <w:t xml:space="preserve">3fb815d</w:t>
+              <w:t xml:space="preserve">a084eb1</w:t>
             </w:r>
           </w:p>
         </w:tc>
@@ -576,7 +576,7 @@
               <w:pStyle w:val="Compact"/>
             </w:pPr>
             <w:r>
-              <w:t xml:space="preserve">2026-06-01T11:04:34Z</w:t>
+              <w:t xml:space="preserve">2026-06-01T11:06:09Z</w:t>
             </w:r>
           </w:p>
         </w:tc>

</xml_diff>

<commit_message>
Foundation wave 3a: mark 6 items Completed (HXC-1019/1022/1023/1025/1029/1038)
DB-as-source-of-truth: 6 items -> Completed/Fixed, commit_sha=32feec3, per-item
evidence_path + Completed history. Regenerated issues.md (557 active)/fixed.md (83).
Registry now 83 Completed / 1 In-progress / 556 Queued.
</commit_message>
<xml_diff>
--- a/docs/export/continuation.docx
+++ b/docs/export/continuation.docx
@@ -34,7 +34,7 @@
         <w:t xml:space="preserve"> </w:t>
       </w:r>
       <w:r>
-        <w:t xml:space="preserve">34</w:t>
+        <w:t xml:space="preserve">35</w:t>
       </w:r>
       <w:r>
         <w:t xml:space="preserve"> </w:t>
@@ -50,7 +50,7 @@
         <w:t xml:space="preserve"> </w:t>
       </w:r>
       <w:r>
-        <w:t xml:space="preserve">2026-06-01T11:23:17Z</w:t>
+        <w:t xml:space="preserve">2026-06-01T11:24:02Z</w:t>
       </w:r>
       <w:r>
         <w:t xml:space="preserve"> </w:t>
@@ -184,6 +184,33 @@
               <w:rPr>
                 <w:rStyle w:val="VerbatimChar"/>
               </w:rPr>
+              <w:t xml:space="preserve">32feec3</w:t>
+            </w:r>
+          </w:p>
+        </w:tc>
+        <w:tc>
+          <w:tcPr/>
+          <w:p>
+            <w:pPr>
+              <w:pStyle w:val="Compact"/>
+            </w:pPr>
+            <w:r>
+              <w:t xml:space="preserve">Foundation wave 3a: real fixes for lock leak + build sync/cancel + security/wasm coverage</w:t>
+            </w:r>
+          </w:p>
+        </w:tc>
+      </w:tr>
+      <w:tr>
+        <w:tc>
+          <w:tcPr/>
+          <w:p>
+            <w:pPr>
+              <w:pStyle w:val="Compact"/>
+            </w:pPr>
+            <w:r>
+              <w:rPr>
+                <w:rStyle w:val="VerbatimChar"/>
+              </w:rPr>
               <w:t xml:space="preserve">930a7ac</w:t>
             </w:r>
           </w:p>
@@ -412,33 +439,6 @@
             </w:pPr>
             <w:r>
               <w:t xml:space="preserve">Bump security submodule -&gt; fb1f3ce (Phase 8C e2ee interop + gpuattest spot-check/seal)</w:t>
-            </w:r>
-          </w:p>
-        </w:tc>
-      </w:tr>
-      <w:tr>
-        <w:tc>
-          <w:tcPr/>
-          <w:p>
-            <w:pPr>
-              <w:pStyle w:val="Compact"/>
-            </w:pPr>
-            <w:r>
-              <w:rPr>
-                <w:rStyle w:val="VerbatimChar"/>
-              </w:rPr>
-              <w:t xml:space="preserve">f73806e</w:t>
-            </w:r>
-          </w:p>
-        </w:tc>
-        <w:tc>
-          <w:tcPr/>
-          <w:p>
-            <w:pPr>
-              <w:pStyle w:val="Compact"/>
-            </w:pPr>
-            <w:r>
-              <w:t xml:space="preserve">Phase 8C gaps: model-integrity gate, attestation-gated admission, GPU class model, fiber stake admission, inference proxy (PCS-6/CLAUDE-1)</w:t>
             </w:r>
           </w:p>
         </w:tc>
@@ -548,7 +548,7 @@
               <w:rPr>
                 <w:rStyle w:val="VerbatimChar"/>
               </w:rPr>
-              <w:t xml:space="preserve">930a7ac</w:t>
+              <w:t xml:space="preserve">32feec3</w:t>
             </w:r>
           </w:p>
         </w:tc>
@@ -576,7 +576,7 @@
               <w:pStyle w:val="Compact"/>
             </w:pPr>
             <w:r>
-              <w:t xml:space="preserve">2026-06-01T11:23:17Z</w:t>
+              <w:t xml:space="preserve">2026-06-01T11:24:02Z</w:t>
             </w:r>
           </w:p>
         </w:tc>

</xml_diff>

<commit_message>
Disable all active CI per operator directive: park race.yml in disabled/
Operator: 'any GitHub actions or GitLab pipelines fully disabled'. The only active
pipeline in this repo was .github/workflows/race.yml (added for HXC-1074); moved to
.github/workflows/disabled/race.yml so GitHub Actions will not run it. No .gitlab-ci.yml
exists in this repo. (Third-party CI under Herald/submodules/* and web/node_modules/*
belongs to vendored upstream repos and does not run for us — left untouched.)

HXC-1074 remains satisfied LOCALLY: the substantive -race detection is proven and
runnable via scripts/test.sh mutation (test/mutation/run_mutations.sh, 5/5 caught) and
make test (go test -race ./...). race.yml is ready to re-enable when CI is turned on.
DB history annotated; commit_sha kept at a084eb1 (where gate+runner shipped).
</commit_message>
<xml_diff>
--- a/docs/export/continuation.docx
+++ b/docs/export/continuation.docx
@@ -34,7 +34,7 @@
         <w:t xml:space="preserve"> </w:t>
       </w:r>
       <w:r>
-        <w:t xml:space="preserve">35</w:t>
+        <w:t xml:space="preserve">36</w:t>
       </w:r>
       <w:r>
         <w:t xml:space="preserve"> </w:t>
@@ -50,7 +50,7 @@
         <w:t xml:space="preserve"> </w:t>
       </w:r>
       <w:r>
-        <w:t xml:space="preserve">2026-06-01T11:24:02Z</w:t>
+        <w:t xml:space="preserve">2026-06-01T11:29:14Z</w:t>
       </w:r>
       <w:r>
         <w:t xml:space="preserve"> </w:t>
@@ -184,6 +184,33 @@
               <w:rPr>
                 <w:rStyle w:val="VerbatimChar"/>
               </w:rPr>
+              <w:t xml:space="preserve">7cc8147</w:t>
+            </w:r>
+          </w:p>
+        </w:tc>
+        <w:tc>
+          <w:tcPr/>
+          <w:p>
+            <w:pPr>
+              <w:pStyle w:val="Compact"/>
+            </w:pPr>
+            <w:r>
+              <w:t xml:space="preserve">Foundation wave 3a: mark 6 items Completed (HXC-1019/1022/1023/1025/1029/1038)</w:t>
+            </w:r>
+          </w:p>
+        </w:tc>
+      </w:tr>
+      <w:tr>
+        <w:tc>
+          <w:tcPr/>
+          <w:p>
+            <w:pPr>
+              <w:pStyle w:val="Compact"/>
+            </w:pPr>
+            <w:r>
+              <w:rPr>
+                <w:rStyle w:val="VerbatimChar"/>
+              </w:rPr>
               <w:t xml:space="preserve">32feec3</w:t>
             </w:r>
           </w:p>
@@ -412,33 +439,6 @@
             </w:pPr>
             <w:r>
               <w:t xml:space="preserve">Phase 0 enabling: integrate constitution upstream (§11.4.106 Docs Chain + workable-items DB), add docs_chain + helixqa submodules, purge stale test binaries, gitignore docs_chain runtime</w:t>
-            </w:r>
-          </w:p>
-        </w:tc>
-      </w:tr>
-      <w:tr>
-        <w:tc>
-          <w:tcPr/>
-          <w:p>
-            <w:pPr>
-              <w:pStyle w:val="Compact"/>
-            </w:pPr>
-            <w:r>
-              <w:rPr>
-                <w:rStyle w:val="VerbatimChar"/>
-              </w:rPr>
-              <w:t xml:space="preserve">279bce8</w:t>
-            </w:r>
-          </w:p>
-        </w:tc>
-        <w:tc>
-          <w:tcPr/>
-          <w:p>
-            <w:pPr>
-              <w:pStyle w:val="Compact"/>
-            </w:pPr>
-            <w:r>
-              <w:t xml:space="preserve">Bump security submodule -&gt; fb1f3ce (Phase 8C e2ee interop + gpuattest spot-check/seal)</w:t>
             </w:r>
           </w:p>
         </w:tc>
@@ -548,7 +548,7 @@
               <w:rPr>
                 <w:rStyle w:val="VerbatimChar"/>
               </w:rPr>
-              <w:t xml:space="preserve">32feec3</w:t>
+              <w:t xml:space="preserve">7cc8147</w:t>
             </w:r>
           </w:p>
         </w:tc>
@@ -576,7 +576,7 @@
               <w:pStyle w:val="Compact"/>
             </w:pPr>
             <w:r>
-              <w:t xml:space="preserve">2026-06-01T11:24:02Z</w:t>
+              <w:t xml:space="preserve">2026-06-01T11:29:14Z</w:t>
             </w:r>
           </w:p>
         </w:tc>

</xml_diff>

<commit_message>
Foundation wave 3b: mark 7 items Completed (HXC-1010/1011/1012/1013/1015/1020/1028)
Integration-proven against real podman + dev Vault; HXC-1014 (VMSSH real session) left Queued honestly (VMSpawn fabricates IPs — no real node). Registry: 90 Completed / 549 Queued.

Co-Authored-By: Claude Opus 4.8 <noreply@anthropic.com>
</commit_message>
<xml_diff>
--- a/docs/export/continuation.docx
+++ b/docs/export/continuation.docx
@@ -34,7 +34,7 @@
         <w:t xml:space="preserve"> </w:t>
       </w:r>
       <w:r>
-        <w:t xml:space="preserve">37</w:t>
+        <w:t xml:space="preserve">38</w:t>
       </w:r>
       <w:r>
         <w:t xml:space="preserve"> </w:t>
@@ -50,7 +50,7 @@
         <w:t xml:space="preserve"> </w:t>
       </w:r>
       <w:r>
-        <w:t xml:space="preserve">2026-06-01T12:10:33Z</w:t>
+        <w:t xml:space="preserve">2026-06-01T12:11:59Z</w:t>
       </w:r>
       <w:r>
         <w:t xml:space="preserve"> </w:t>
@@ -184,6 +184,33 @@
               <w:rPr>
                 <w:rStyle w:val="VerbatimChar"/>
               </w:rPr>
+              <w:t xml:space="preserve">85ee85e</w:t>
+            </w:r>
+          </w:p>
+        </w:tc>
+        <w:tc>
+          <w:tcPr/>
+          <w:p>
+            <w:pPr>
+              <w:pStyle w:val="Compact"/>
+            </w:pPr>
+            <w:r>
+              <w:t xml:space="preserve">Foundation wave 3b: real-infra impl (infra orchestrator / podman builder / vault api) — integration-proven</w:t>
+            </w:r>
+          </w:p>
+        </w:tc>
+      </w:tr>
+      <w:tr>
+        <w:tc>
+          <w:tcPr/>
+          <w:p>
+            <w:pPr>
+              <w:pStyle w:val="Compact"/>
+            </w:pPr>
+            <w:r>
+              <w:rPr>
+                <w:rStyle w:val="VerbatimChar"/>
+              </w:rPr>
               <w:t xml:space="preserve">909d107</w:t>
             </w:r>
           </w:p>
@@ -412,33 +439,6 @@
             </w:pPr>
             <w:r>
               <w:t xml:space="preserve">Phase 0: ingest 614-item phase ledger into hxc_registry.db (HXC-1001..1614); DB-as-source-of-truth</w:t>
-            </w:r>
-          </w:p>
-        </w:tc>
-      </w:tr>
-      <w:tr>
-        <w:tc>
-          <w:tcPr/>
-          <w:p>
-            <w:pPr>
-              <w:pStyle w:val="Compact"/>
-            </w:pPr>
-            <w:r>
-              <w:rPr>
-                <w:rStyle w:val="VerbatimChar"/>
-              </w:rPr>
-              <w:t xml:space="preserve">a15c272</w:t>
-            </w:r>
-          </w:p>
-        </w:tc>
-        <w:tc>
-          <w:tcPr/>
-          <w:p>
-            <w:pPr>
-              <w:pStyle w:val="Compact"/>
-            </w:pPr>
-            <w:r>
-              <w:t xml:space="preserve">Phase 0: wire docs_chain (§11.4.106) — tracked_docs context, engine wrapper, commit gate sync+verify, canonical doc dedup manifest</w:t>
             </w:r>
           </w:p>
         </w:tc>
@@ -548,7 +548,7 @@
               <w:rPr>
                 <w:rStyle w:val="VerbatimChar"/>
               </w:rPr>
-              <w:t xml:space="preserve">909d107</w:t>
+              <w:t xml:space="preserve">85ee85e</w:t>
             </w:r>
           </w:p>
         </w:tc>
@@ -576,7 +576,7 @@
               <w:pStyle w:val="Compact"/>
             </w:pPr>
             <w:r>
-              <w:t xml:space="preserve">2026-06-01T12:10:33Z</w:t>
+              <w:t xml:space="preserve">2026-06-01T12:11:59Z</w:t>
             </w:r>
           </w:p>
         </w:tc>

</xml_diff>

<commit_message>
CLAUDE-2: Cross-Platform Parity Guarantee — no Linux-only feature may fall back to a mock/stub on macOS
Operator mandate codified: every OS must use real native system equivalents (macOS: sysctl/host_statistics64/mach/vm_stat/IOKit/Metal/wireguard-go). A !linux mock/stub for a real-operation feature is a CLAUDE-1 PASS-bluff and is forbidden. Tests must prove the feature on the host OS vs an OS oracle, not blanket-skip non-Linux. Flags pkg/resources (proc_mock.go/drm_other.go) + pkg/wireguard as remediation targets.

Co-Authored-By: Claude Opus 4.8 <noreply@anthropic.com>
</commit_message>
<xml_diff>
--- a/docs/export/continuation.docx
+++ b/docs/export/continuation.docx
@@ -34,7 +34,7 @@
         <w:t xml:space="preserve"> </w:t>
       </w:r>
       <w:r>
-        <w:t xml:space="preserve">38</w:t>
+        <w:t xml:space="preserve">39</w:t>
       </w:r>
       <w:r>
         <w:t xml:space="preserve"> </w:t>
@@ -50,7 +50,7 @@
         <w:t xml:space="preserve"> </w:t>
       </w:r>
       <w:r>
-        <w:t xml:space="preserve">2026-06-01T12:11:59Z</w:t>
+        <w:t xml:space="preserve">2026-06-01T12:24:58Z</w:t>
       </w:r>
       <w:r>
         <w:t xml:space="preserve"> </w:t>
@@ -184,6 +184,33 @@
               <w:rPr>
                 <w:rStyle w:val="VerbatimChar"/>
               </w:rPr>
+              <w:t xml:space="preserve">f6209f6</w:t>
+            </w:r>
+          </w:p>
+        </w:tc>
+        <w:tc>
+          <w:tcPr/>
+          <w:p>
+            <w:pPr>
+              <w:pStyle w:val="Compact"/>
+            </w:pPr>
+            <w:r>
+              <w:t xml:space="preserve">Foundation wave 3b: mark 7 items Completed (HXC-1010/1011/1012/1013/1015/1020/1028)</w:t>
+            </w:r>
+          </w:p>
+        </w:tc>
+      </w:tr>
+      <w:tr>
+        <w:tc>
+          <w:tcPr/>
+          <w:p>
+            <w:pPr>
+              <w:pStyle w:val="Compact"/>
+            </w:pPr>
+            <w:r>
+              <w:rPr>
+                <w:rStyle w:val="VerbatimChar"/>
+              </w:rPr>
               <w:t xml:space="preserve">85ee85e</w:t>
             </w:r>
           </w:p>
@@ -412,33 +439,6 @@
             </w:pPr>
             <w:r>
               <w:t xml:space="preserve">Foundation: add pkg/testing/evidence — §7.1 positive-evidence test helper (TDD + §1.1 mutation-paired)</w:t>
-            </w:r>
-          </w:p>
-        </w:tc>
-      </w:tr>
-      <w:tr>
-        <w:tc>
-          <w:tcPr/>
-          <w:p>
-            <w:pPr>
-              <w:pStyle w:val="Compact"/>
-            </w:pPr>
-            <w:r>
-              <w:rPr>
-                <w:rStyle w:val="VerbatimChar"/>
-              </w:rPr>
-              <w:t xml:space="preserve">47b6d91</w:t>
-            </w:r>
-          </w:p>
-        </w:tc>
-        <w:tc>
-          <w:tcPr/>
-          <w:p>
-            <w:pPr>
-              <w:pStyle w:val="Compact"/>
-            </w:pPr>
-            <w:r>
-              <w:t xml:space="preserve">Phase 0: ingest 614-item phase ledger into hxc_registry.db (HXC-1001..1614); DB-as-source-of-truth</w:t>
             </w:r>
           </w:p>
         </w:tc>
@@ -548,7 +548,7 @@
               <w:rPr>
                 <w:rStyle w:val="VerbatimChar"/>
               </w:rPr>
-              <w:t xml:space="preserve">85ee85e</w:t>
+              <w:t xml:space="preserve">f6209f6</w:t>
             </w:r>
           </w:p>
         </w:tc>
@@ -576,7 +576,7 @@
               <w:pStyle w:val="Compact"/>
             </w:pPr>
             <w:r>
-              <w:t xml:space="preserve">2026-06-01T12:11:59Z</w:t>
+              <w:t xml:space="preserve">2026-06-01T12:24:58Z</w:t>
             </w:r>
           </w:p>
         </w:tc>

</xml_diff>

<commit_message>
Foundation wave 4 + parity: mark 10 items Completed (HXC-1014/1075-1083)
Integration-proven vs real NATS/etcd/Kafka/podman + macOS sysctl/system_profiler. Registry: 100 Completed.

Co-Authored-By: Claude Opus 4.8 <noreply@anthropic.com>
</commit_message>
<xml_diff>
--- a/docs/export/continuation.docx
+++ b/docs/export/continuation.docx
@@ -34,7 +34,7 @@
         <w:t xml:space="preserve"> </w:t>
       </w:r>
       <w:r>
-        <w:t xml:space="preserve">40</w:t>
+        <w:t xml:space="preserve">41</w:t>
       </w:r>
       <w:r>
         <w:t xml:space="preserve"> </w:t>
@@ -50,7 +50,7 @@
         <w:t xml:space="preserve"> </w:t>
       </w:r>
       <w:r>
-        <w:t xml:space="preserve">2026-06-01T13:02:42Z</w:t>
+        <w:t xml:space="preserve">2026-06-01T13:04:06Z</w:t>
       </w:r>
       <w:r>
         <w:t xml:space="preserve"> </w:t>
@@ -184,6 +184,33 @@
               <w:rPr>
                 <w:rStyle w:val="VerbatimChar"/>
               </w:rPr>
+              <w:t xml:space="preserve">44db918</w:t>
+            </w:r>
+          </w:p>
+        </w:tc>
+        <w:tc>
+          <w:tcPr/>
+          <w:p>
+            <w:pPr>
+              <w:pStyle w:val="Compact"/>
+            </w:pPr>
+            <w:r>
+              <w:t xml:space="preserve">Foundation wave 4 + cross-platform parity: 9 real-infra items + macOS GPU/resources + real VMSSH — integration-proven</w:t>
+            </w:r>
+          </w:p>
+        </w:tc>
+      </w:tr>
+      <w:tr>
+        <w:tc>
+          <w:tcPr/>
+          <w:p>
+            <w:pPr>
+              <w:pStyle w:val="Compact"/>
+            </w:pPr>
+            <w:r>
+              <w:rPr>
+                <w:rStyle w:val="VerbatimChar"/>
+              </w:rPr>
               <w:t xml:space="preserve">366a436</w:t>
             </w:r>
           </w:p>
@@ -412,33 +439,6 @@
             </w:pPr>
             <w:r>
               <w:t xml:space="preserve">Foundation wave 1: mark 30 verified items Completed (HXC-1001..1009/1016-1018/1021/1024/1026-1027/1030-1037/1042-1045/1062-1063)</w:t>
-            </w:r>
-          </w:p>
-        </w:tc>
-      </w:tr>
-      <w:tr>
-        <w:tc>
-          <w:tcPr/>
-          <w:p>
-            <w:pPr>
-              <w:pStyle w:val="Compact"/>
-            </w:pPr>
-            <w:r>
-              <w:rPr>
-                <w:rStyle w:val="VerbatimChar"/>
-              </w:rPr>
-              <w:t xml:space="preserve">dbed10c</w:t>
-            </w:r>
-          </w:p>
-        </w:tc>
-        <w:tc>
-          <w:tcPr/>
-          <w:p>
-            <w:pPr>
-              <w:pStyle w:val="Compact"/>
-            </w:pPr>
-            <w:r>
-              <w:t xml:space="preserve">Foundation wave 1: anti-bluff remediation of etcd/lock/infra/build/security/crypto/jwt/hxcregistry/storage/wasm (verified)</w:t>
             </w:r>
           </w:p>
         </w:tc>
@@ -548,7 +548,7 @@
               <w:rPr>
                 <w:rStyle w:val="VerbatimChar"/>
               </w:rPr>
-              <w:t xml:space="preserve">366a436</w:t>
+              <w:t xml:space="preserve">44db918</w:t>
             </w:r>
           </w:p>
         </w:tc>
@@ -576,7 +576,7 @@
               <w:pStyle w:val="Compact"/>
             </w:pPr>
             <w:r>
-              <w:t xml:space="preserve">2026-06-01T13:02:42Z</w:t>
+              <w:t xml:space="preserve">2026-06-01T13:04:06Z</w:t>
             </w:r>
           </w:p>
         </w:tc>

</xml_diff>

<commit_message>
fix(pkg/infra): isolate VMSpawn integration tests against deterministic vm-1 collision
VMSpawn now creates a REAL node container named deterministically (vm-1); TestRealVMSSH and TestRealOrchestrator_Partition both spawned vm-1 and the Partition test never cleaned up, leaking a container that collided on the next run ('name already in use'). Add pre-clean + defer cleanup in both. Verified: go test -tags=integration ./pkg/infra/ green across repeated runs, no leftover containers.

Co-Authored-By: Claude Opus 4.8 <noreply@anthropic.com>
</commit_message>
<xml_diff>
--- a/docs/export/continuation.docx
+++ b/docs/export/continuation.docx
@@ -34,7 +34,7 @@
         <w:t xml:space="preserve"> </w:t>
       </w:r>
       <w:r>
-        <w:t xml:space="preserve">41</w:t>
+        <w:t xml:space="preserve">42</w:t>
       </w:r>
       <w:r>
         <w:t xml:space="preserve"> </w:t>
@@ -50,7 +50,7 @@
         <w:t xml:space="preserve"> </w:t>
       </w:r>
       <w:r>
-        <w:t xml:space="preserve">2026-06-01T13:04:06Z</w:t>
+        <w:t xml:space="preserve">2026-06-01T13:12:11Z</w:t>
       </w:r>
       <w:r>
         <w:t xml:space="preserve"> </w:t>
@@ -184,6 +184,33 @@
               <w:rPr>
                 <w:rStyle w:val="VerbatimChar"/>
               </w:rPr>
+              <w:t xml:space="preserve">23668fa</w:t>
+            </w:r>
+          </w:p>
+        </w:tc>
+        <w:tc>
+          <w:tcPr/>
+          <w:p>
+            <w:pPr>
+              <w:pStyle w:val="Compact"/>
+            </w:pPr>
+            <w:r>
+              <w:t xml:space="preserve">Foundation wave 4 + parity: mark 10 items Completed (HXC-1014/1075-1083)</w:t>
+            </w:r>
+          </w:p>
+        </w:tc>
+      </w:tr>
+      <w:tr>
+        <w:tc>
+          <w:tcPr/>
+          <w:p>
+            <w:pPr>
+              <w:pStyle w:val="Compact"/>
+            </w:pPr>
+            <w:r>
+              <w:rPr>
+                <w:rStyle w:val="VerbatimChar"/>
+              </w:rPr>
               <w:t xml:space="preserve">44db918</w:t>
             </w:r>
           </w:p>
@@ -412,33 +439,6 @@
             </w:pPr>
             <w:r>
               <w:t xml:space="preserve">Foundation wave 2: anti-bluff harden 29 pkg test items + §1.1 mutation runner + -race CI gate</w:t>
-            </w:r>
-          </w:p>
-        </w:tc>
-      </w:tr>
-      <w:tr>
-        <w:tc>
-          <w:tcPr/>
-          <w:p>
-            <w:pPr>
-              <w:pStyle w:val="Compact"/>
-            </w:pPr>
-            <w:r>
-              <w:rPr>
-                <w:rStyle w:val="VerbatimChar"/>
-              </w:rPr>
-              <w:t xml:space="preserve">3fb815d</w:t>
-            </w:r>
-          </w:p>
-        </w:tc>
-        <w:tc>
-          <w:tcPr/>
-          <w:p>
-            <w:pPr>
-              <w:pStyle w:val="Compact"/>
-            </w:pPr>
-            <w:r>
-              <w:t xml:space="preserve">Foundation wave 1: mark 30 verified items Completed (HXC-1001..1009/1016-1018/1021/1024/1026-1027/1030-1037/1042-1045/1062-1063)</w:t>
             </w:r>
           </w:p>
         </w:tc>
@@ -548,7 +548,7 @@
               <w:rPr>
                 <w:rStyle w:val="VerbatimChar"/>
               </w:rPr>
-              <w:t xml:space="preserve">44db918</w:t>
+              <w:t xml:space="preserve">23668fa</w:t>
             </w:r>
           </w:p>
         </w:tc>
@@ -576,7 +576,7 @@
               <w:pStyle w:val="Compact"/>
             </w:pPr>
             <w:r>
-              <w:t xml:space="preserve">2026-06-01T13:04:06Z</w:t>
+              <w:t xml:space="preserve">2026-06-01T13:12:11Z</w:t>
             </w:r>
           </w:p>
         </w:tc>

</xml_diff>

<commit_message>
Foundation wave 5: mark 5 items Completed (HXC-1087/1089/1091/1092/1094); 1086/1088/1093 stay Queued (integration WIP)
Integration-proven vs real etcd/JWT/wgtypes. Registry: 105 Completed. leader(1093)+swim(1088)+node WatchNodes(1086) deferred with repro notes — real-dep integration failing, not bluff-completed.

Co-Authored-By: Claude Opus 4.8 <noreply@anthropic.com>
</commit_message>
<xml_diff>
--- a/docs/export/continuation.docx
+++ b/docs/export/continuation.docx
@@ -34,7 +34,7 @@
         <w:t xml:space="preserve"> </w:t>
       </w:r>
       <w:r>
-        <w:t xml:space="preserve">43</w:t>
+        <w:t xml:space="preserve">44</w:t>
       </w:r>
       <w:r>
         <w:t xml:space="preserve"> </w:t>
@@ -50,7 +50,7 @@
         <w:t xml:space="preserve"> </w:t>
       </w:r>
       <w:r>
-        <w:t xml:space="preserve">2026-06-01T13:52:26Z</w:t>
+        <w:t xml:space="preserve">2026-06-01T13:53:27Z</w:t>
       </w:r>
       <w:r>
         <w:t xml:space="preserve"> </w:t>
@@ -184,6 +184,33 @@
               <w:rPr>
                 <w:rStyle w:val="VerbatimChar"/>
               </w:rPr>
+              <w:t xml:space="preserve">2f27ac9</w:t>
+            </w:r>
+          </w:p>
+        </w:tc>
+        <w:tc>
+          <w:tcPr/>
+          <w:p>
+            <w:pPr>
+              <w:pStyle w:val="Compact"/>
+            </w:pPr>
+            <w:r>
+              <w:t xml:space="preserve">Foundation wave 5: 5 control-plane streams (gateway/lock/wireguard/node-registry proven; leader+swim+node-watch WIP)</w:t>
+            </w:r>
+          </w:p>
+        </w:tc>
+      </w:tr>
+      <w:tr>
+        <w:tc>
+          <w:tcPr/>
+          <w:p>
+            <w:pPr>
+              <w:pStyle w:val="Compact"/>
+            </w:pPr>
+            <w:r>
+              <w:rPr>
+                <w:rStyle w:val="VerbatimChar"/>
+              </w:rPr>
               <w:t xml:space="preserve">8f570cb</w:t>
             </w:r>
           </w:p>
@@ -412,33 +439,6 @@
             </w:pPr>
             <w:r>
               <w:t xml:space="preserve">Foundation wave 3a: real fixes for lock leak + build sync/cancel + security/wasm coverage</w:t>
-            </w:r>
-          </w:p>
-        </w:tc>
-      </w:tr>
-      <w:tr>
-        <w:tc>
-          <w:tcPr/>
-          <w:p>
-            <w:pPr>
-              <w:pStyle w:val="Compact"/>
-            </w:pPr>
-            <w:r>
-              <w:rPr>
-                <w:rStyle w:val="VerbatimChar"/>
-              </w:rPr>
-              <w:t xml:space="preserve">930a7ac</w:t>
-            </w:r>
-          </w:p>
-        </w:tc>
-        <w:tc>
-          <w:tcPr/>
-          <w:p>
-            <w:pPr>
-              <w:pStyle w:val="Compact"/>
-            </w:pPr>
-            <w:r>
-              <w:t xml:space="preserve">Foundation wave 2: mark 30 items Completed (HXC-1039..1041/1046..1061/1064..1074)</w:t>
             </w:r>
           </w:p>
         </w:tc>
@@ -548,7 +548,7 @@
               <w:rPr>
                 <w:rStyle w:val="VerbatimChar"/>
               </w:rPr>
-              <w:t xml:space="preserve">8f570cb</w:t>
+              <w:t xml:space="preserve">2f27ac9</w:t>
             </w:r>
           </w:p>
         </w:tc>
@@ -576,7 +576,7 @@
               <w:pStyle w:val="Compact"/>
             </w:pPr>
             <w:r>
-              <w:t xml:space="preserve">2026-06-01T13:52:26Z</w:t>
+              <w:t xml:space="preserve">2026-06-01T13:53:27Z</w:t>
             </w:r>
           </w:p>
         </w:tc>

</xml_diff>

<commit_message>
Wave 5 deferred resolved: mark HXC-1086/1088/1093 Completed (integration-proven)
leader Campaign hang + SWIM suspicion starvation fixed (real bugs); node gRPC serves full generated NodeService. Registry: 108 Completed.

Co-Authored-By: Claude Opus 4.8 <noreply@anthropic.com>
</commit_message>
<xml_diff>
--- a/docs/export/continuation.docx
+++ b/docs/export/continuation.docx
@@ -34,7 +34,7 @@
         <w:t xml:space="preserve"> </w:t>
       </w:r>
       <w:r>
-        <w:t xml:space="preserve">45</w:t>
+        <w:t xml:space="preserve">46</w:t>
       </w:r>
       <w:r>
         <w:t xml:space="preserve"> </w:t>
@@ -50,7 +50,7 @@
         <w:t xml:space="preserve"> </w:t>
       </w:r>
       <w:r>
-        <w:t xml:space="preserve">2026-06-01T14:10:51Z</w:t>
+        <w:t xml:space="preserve">2026-06-01T14:11:33Z</w:t>
       </w:r>
       <w:r>
         <w:t xml:space="preserve"> </w:t>
@@ -184,6 +184,33 @@
               <w:rPr>
                 <w:rStyle w:val="VerbatimChar"/>
               </w:rPr>
+              <w:t xml:space="preserve">4d0ac66</w:t>
+            </w:r>
+          </w:p>
+        </w:tc>
+        <w:tc>
+          <w:tcPr/>
+          <w:p>
+            <w:pPr>
+              <w:pStyle w:val="Compact"/>
+            </w:pPr>
+            <w:r>
+              <w:t xml:space="preserve">fix(swim,leader,node): resolve Wave 5 deferred — real-dep integration now green</w:t>
+            </w:r>
+          </w:p>
+        </w:tc>
+      </w:tr>
+      <w:tr>
+        <w:tc>
+          <w:tcPr/>
+          <w:p>
+            <w:pPr>
+              <w:pStyle w:val="Compact"/>
+            </w:pPr>
+            <w:r>
+              <w:rPr>
+                <w:rStyle w:val="VerbatimChar"/>
+              </w:rPr>
               <w:t xml:space="preserve">8184725</w:t>
             </w:r>
           </w:p>
@@ -412,33 +439,6 @@
             </w:pPr>
             <w:r>
               <w:t xml:space="preserve">Disable all active CI per operator directive: park race.yml in disabled/</w:t>
-            </w:r>
-          </w:p>
-        </w:tc>
-      </w:tr>
-      <w:tr>
-        <w:tc>
-          <w:tcPr/>
-          <w:p>
-            <w:pPr>
-              <w:pStyle w:val="Compact"/>
-            </w:pPr>
-            <w:r>
-              <w:rPr>
-                <w:rStyle w:val="VerbatimChar"/>
-              </w:rPr>
-              <w:t xml:space="preserve">7cc8147</w:t>
-            </w:r>
-          </w:p>
-        </w:tc>
-        <w:tc>
-          <w:tcPr/>
-          <w:p>
-            <w:pPr>
-              <w:pStyle w:val="Compact"/>
-            </w:pPr>
-            <w:r>
-              <w:t xml:space="preserve">Foundation wave 3a: mark 6 items Completed (HXC-1019/1022/1023/1025/1029/1038)</w:t>
             </w:r>
           </w:p>
         </w:tc>
@@ -548,7 +548,7 @@
               <w:rPr>
                 <w:rStyle w:val="VerbatimChar"/>
               </w:rPr>
-              <w:t xml:space="preserve">8184725</w:t>
+              <w:t xml:space="preserve">4d0ac66</w:t>
             </w:r>
           </w:p>
         </w:tc>
@@ -576,7 +576,7 @@
               <w:pStyle w:val="Compact"/>
             </w:pPr>
             <w:r>
-              <w:t xml:space="preserve">2026-06-01T14:10:51Z</w:t>
+              <w:t xml:space="preserve">2026-06-01T14:11:33Z</w:t>
             </w:r>
           </w:p>
         </w:tc>

</xml_diff>

<commit_message>
Foundation wave 6: mark 5 items Completed (HXC-1084/1085/1090/1095/1099)
Integration-proven vs real tmux/UDP/postgres/podman. Registry: 113 Completed.

Co-Authored-By: Claude Opus 4.8 <noreply@anthropic.com>
</commit_message>
<xml_diff>
--- a/docs/export/continuation.docx
+++ b/docs/export/continuation.docx
@@ -34,7 +34,7 @@
         <w:t xml:space="preserve"> </w:t>
       </w:r>
       <w:r>
-        <w:t xml:space="preserve">47</w:t>
+        <w:t xml:space="preserve">48</w:t>
       </w:r>
       <w:r>
         <w:t xml:space="preserve"> </w:t>
@@ -50,7 +50,7 @@
         <w:t xml:space="preserve"> </w:t>
       </w:r>
       <w:r>
-        <w:t xml:space="preserve">2026-06-01T15:14:58Z</w:t>
+        <w:t xml:space="preserve">2026-06-01T15:15:45Z</w:t>
       </w:r>
       <w:r>
         <w:t xml:space="preserve"> </w:t>
@@ -184,6 +184,33 @@
               <w:rPr>
                 <w:rStyle w:val="VerbatimChar"/>
               </w:rPr>
+              <w:t xml:space="preserve">1367dca</w:t>
+            </w:r>
+          </w:p>
+        </w:tc>
+        <w:tc>
+          <w:tcPr/>
+          <w:p>
+            <w:pPr>
+              <w:pStyle w:val="Compact"/>
+            </w:pPr>
+            <w:r>
+              <w:t xml:space="preserve">Foundation wave 6: session(tmux -CC + CRDT) / wireguard STUN-NAT / postgres registry / build orchestrator — integration-proven</w:t>
+            </w:r>
+          </w:p>
+        </w:tc>
+      </w:tr>
+      <w:tr>
+        <w:tc>
+          <w:tcPr/>
+          <w:p>
+            <w:pPr>
+              <w:pStyle w:val="Compact"/>
+            </w:pPr>
+            <w:r>
+              <w:rPr>
+                <w:rStyle w:val="VerbatimChar"/>
+              </w:rPr>
               <w:t xml:space="preserve">e0d3938</w:t>
             </w:r>
           </w:p>
@@ -412,33 +439,6 @@
             </w:pPr>
             <w:r>
               <w:t xml:space="preserve">Foundation wave 3b: mark 7 items Completed (HXC-1010/1011/1012/1013/1015/1020/1028)</w:t>
-            </w:r>
-          </w:p>
-        </w:tc>
-      </w:tr>
-      <w:tr>
-        <w:tc>
-          <w:tcPr/>
-          <w:p>
-            <w:pPr>
-              <w:pStyle w:val="Compact"/>
-            </w:pPr>
-            <w:r>
-              <w:rPr>
-                <w:rStyle w:val="VerbatimChar"/>
-              </w:rPr>
-              <w:t xml:space="preserve">85ee85e</w:t>
-            </w:r>
-          </w:p>
-        </w:tc>
-        <w:tc>
-          <w:tcPr/>
-          <w:p>
-            <w:pPr>
-              <w:pStyle w:val="Compact"/>
-            </w:pPr>
-            <w:r>
-              <w:t xml:space="preserve">Foundation wave 3b: real-infra impl (infra orchestrator / podman builder / vault api) — integration-proven</w:t>
             </w:r>
           </w:p>
         </w:tc>
@@ -548,7 +548,7 @@
               <w:rPr>
                 <w:rStyle w:val="VerbatimChar"/>
               </w:rPr>
-              <w:t xml:space="preserve">e0d3938</w:t>
+              <w:t xml:space="preserve">1367dca</w:t>
             </w:r>
           </w:p>
         </w:tc>
@@ -576,7 +576,7 @@
               <w:pStyle w:val="Compact"/>
             </w:pPr>
             <w:r>
-              <w:t xml:space="preserve">2026-06-01T15:14:58Z</w:t>
+              <w:t xml:space="preserve">2026-06-01T15:15:45Z</w:t>
             </w:r>
           </w:p>
         </w:tc>

</xml_diff>

<commit_message>
Foundation wave 7: session WS-vertical (htmux attach+PTY-over-WS+msgpack envelope), e2ee ML-KEM record + sw-attestation, RBAC scopes, ratelimit token-bucket + etcd key namespace, postgres 15-table primary schema — integration-proven (real tmux/etcd/postgres); gate fixed tmux-CC subscribe race + pg applier host-path-in-container bug
Co-Authored-By: Claude Opus 4.8 <noreply@anthropic.com>
</commit_message>
<xml_diff>
--- a/docs/export/continuation.docx
+++ b/docs/export/continuation.docx
@@ -34,7 +34,7 @@
         <w:t xml:space="preserve"> </w:t>
       </w:r>
       <w:r>
-        <w:t xml:space="preserve">48</w:t>
+        <w:t xml:space="preserve">49</w:t>
       </w:r>
       <w:r>
         <w:t xml:space="preserve"> </w:t>
@@ -50,7 +50,7 @@
         <w:t xml:space="preserve"> </w:t>
       </w:r>
       <w:r>
-        <w:t xml:space="preserve">2026-06-01T15:15:45Z</w:t>
+        <w:t xml:space="preserve">2026-06-01T16:12:53Z</w:t>
       </w:r>
       <w:r>
         <w:t xml:space="preserve"> </w:t>
@@ -184,6 +184,33 @@
               <w:rPr>
                 <w:rStyle w:val="VerbatimChar"/>
               </w:rPr>
+              <w:t xml:space="preserve">6882b02</w:t>
+            </w:r>
+          </w:p>
+        </w:tc>
+        <w:tc>
+          <w:tcPr/>
+          <w:p>
+            <w:pPr>
+              <w:pStyle w:val="Compact"/>
+            </w:pPr>
+            <w:r>
+              <w:t xml:space="preserve">Foundation wave 6: mark 5 items Completed (HXC-1084/1085/1090/1095/1099)</w:t>
+            </w:r>
+          </w:p>
+        </w:tc>
+      </w:tr>
+      <w:tr>
+        <w:tc>
+          <w:tcPr/>
+          <w:p>
+            <w:pPr>
+              <w:pStyle w:val="Compact"/>
+            </w:pPr>
+            <w:r>
+              <w:rPr>
+                <w:rStyle w:val="VerbatimChar"/>
+              </w:rPr>
               <w:t xml:space="preserve">1367dca</w:t>
             </w:r>
           </w:p>
@@ -412,33 +439,6 @@
             </w:pPr>
             <w:r>
               <w:t xml:space="preserve">CLAUDE-2: Cross-Platform Parity Guarantee — no Linux-only feature may fall back to a mock/stub on macOS</w:t>
-            </w:r>
-          </w:p>
-        </w:tc>
-      </w:tr>
-      <w:tr>
-        <w:tc>
-          <w:tcPr/>
-          <w:p>
-            <w:pPr>
-              <w:pStyle w:val="Compact"/>
-            </w:pPr>
-            <w:r>
-              <w:rPr>
-                <w:rStyle w:val="VerbatimChar"/>
-              </w:rPr>
-              <w:t xml:space="preserve">f6209f6</w:t>
-            </w:r>
-          </w:p>
-        </w:tc>
-        <w:tc>
-          <w:tcPr/>
-          <w:p>
-            <w:pPr>
-              <w:pStyle w:val="Compact"/>
-            </w:pPr>
-            <w:r>
-              <w:t xml:space="preserve">Foundation wave 3b: mark 7 items Completed (HXC-1010/1011/1012/1013/1015/1020/1028)</w:t>
             </w:r>
           </w:p>
         </w:tc>
@@ -548,7 +548,7 @@
               <w:rPr>
                 <w:rStyle w:val="VerbatimChar"/>
               </w:rPr>
-              <w:t xml:space="preserve">1367dca</w:t>
+              <w:t xml:space="preserve">6882b02</w:t>
             </w:r>
           </w:p>
         </w:tc>
@@ -576,7 +576,7 @@
               <w:pStyle w:val="Compact"/>
             </w:pPr>
             <w:r>
-              <w:t xml:space="preserve">2026-06-01T15:15:45Z</w:t>
+              <w:t xml:space="preserve">2026-06-01T16:12:53Z</w:t>
             </w:r>
           </w:p>
         </w:tc>

</xml_diff>

<commit_message>
Foundation wave 7: mark 9 items Completed (HXC-1101/1102/1103/1105/1106/1107/1114/1115/1133) — integration-proven vs real tmux/etcd/postgres
Co-Authored-By: Claude Opus 4.8 <noreply@anthropic.com>
</commit_message>
<xml_diff>
--- a/docs/export/continuation.docx
+++ b/docs/export/continuation.docx
@@ -34,7 +34,7 @@
         <w:t xml:space="preserve"> </w:t>
       </w:r>
       <w:r>
-        <w:t xml:space="preserve">49</w:t>
+        <w:t xml:space="preserve">50</w:t>
       </w:r>
       <w:r>
         <w:t xml:space="preserve"> </w:t>
@@ -50,7 +50,7 @@
         <w:t xml:space="preserve"> </w:t>
       </w:r>
       <w:r>
-        <w:t xml:space="preserve">2026-06-01T16:12:53Z</w:t>
+        <w:t xml:space="preserve">2026-06-01T16:14:47Z</w:t>
       </w:r>
       <w:r>
         <w:t xml:space="preserve"> </w:t>
@@ -184,6 +184,33 @@
               <w:rPr>
                 <w:rStyle w:val="VerbatimChar"/>
               </w:rPr>
+              <w:t xml:space="preserve">e12003a</w:t>
+            </w:r>
+          </w:p>
+        </w:tc>
+        <w:tc>
+          <w:tcPr/>
+          <w:p>
+            <w:pPr>
+              <w:pStyle w:val="Compact"/>
+            </w:pPr>
+            <w:r>
+              <w:t xml:space="preserve">Foundation wave 7: session WS-vertical (htmux attach+PTY-over-WS+msgpack envelope), e2ee ML-KEM record + sw-attestation, RBAC scopes, ratelimit token-bucket + etcd key namespace, postgres 15-table primary schema — integration-proven (real tmux/etcd/postgres); gate fixed tmux-CC subscribe race + pg applier host-path-in-container bug</w:t>
+            </w:r>
+          </w:p>
+        </w:tc>
+      </w:tr>
+      <w:tr>
+        <w:tc>
+          <w:tcPr/>
+          <w:p>
+            <w:pPr>
+              <w:pStyle w:val="Compact"/>
+            </w:pPr>
+            <w:r>
+              <w:rPr>
+                <w:rStyle w:val="VerbatimChar"/>
+              </w:rPr>
               <w:t xml:space="preserve">6882b02</w:t>
             </w:r>
           </w:p>
@@ -412,33 +439,6 @@
             </w:pPr>
             <w:r>
               <w:t xml:space="preserve">Foundation wave 4 + cross-platform parity: 9 real-infra items + macOS GPU/resources + real VMSSH — integration-proven</w:t>
-            </w:r>
-          </w:p>
-        </w:tc>
-      </w:tr>
-      <w:tr>
-        <w:tc>
-          <w:tcPr/>
-          <w:p>
-            <w:pPr>
-              <w:pStyle w:val="Compact"/>
-            </w:pPr>
-            <w:r>
-              <w:rPr>
-                <w:rStyle w:val="VerbatimChar"/>
-              </w:rPr>
-              <w:t xml:space="preserve">366a436</w:t>
-            </w:r>
-          </w:p>
-        </w:tc>
-        <w:tc>
-          <w:tcPr/>
-          <w:p>
-            <w:pPr>
-              <w:pStyle w:val="Compact"/>
-            </w:pPr>
-            <w:r>
-              <w:t xml:space="preserve">CLAUDE-2: Cross-Platform Parity Guarantee — no Linux-only feature may fall back to a mock/stub on macOS</w:t>
             </w:r>
           </w:p>
         </w:tc>
@@ -548,7 +548,7 @@
               <w:rPr>
                 <w:rStyle w:val="VerbatimChar"/>
               </w:rPr>
-              <w:t xml:space="preserve">6882b02</w:t>
+              <w:t xml:space="preserve">e12003a</w:t>
             </w:r>
           </w:p>
         </w:tc>
@@ -576,7 +576,7 @@
               <w:pStyle w:val="Compact"/>
             </w:pPr>
             <w:r>
-              <w:t xml:space="preserve">2026-06-01T16:12:53Z</w:t>
+              <w:t xml:space="preserve">2026-06-01T16:14:47Z</w:t>
             </w:r>
           </w:p>
         </w:tc>

</xml_diff>

<commit_message>
Foundation wave 8: NATS JetStream stream-config (5 streams + EnsureStreams), Kafka topic-config (partitions/replication/retention + EnsureTopics), HelixQA challenge runner + DST chaos/session-recovery harness, gateway REST surface (/v1/sessions, /v1/pool/utilization) + OpenAPI 3.0 — integration-proven vs real NATS/Kafka/HTTP
Co-Authored-By: Claude Opus 4.8 <noreply@anthropic.com>
</commit_message>
<xml_diff>
--- a/docs/export/continuation.docx
+++ b/docs/export/continuation.docx
@@ -34,7 +34,7 @@
         <w:t xml:space="preserve"> </w:t>
       </w:r>
       <w:r>
-        <w:t xml:space="preserve">50</w:t>
+        <w:t xml:space="preserve">51</w:t>
       </w:r>
       <w:r>
         <w:t xml:space="preserve"> </w:t>
@@ -50,7 +50,7 @@
         <w:t xml:space="preserve"> </w:t>
       </w:r>
       <w:r>
-        <w:t xml:space="preserve">2026-06-01T16:14:47Z</w:t>
+        <w:t xml:space="preserve">2026-06-01T16:32:40Z</w:t>
       </w:r>
       <w:r>
         <w:t xml:space="preserve"> </w:t>
@@ -184,6 +184,33 @@
               <w:rPr>
                 <w:rStyle w:val="VerbatimChar"/>
               </w:rPr>
+              <w:t xml:space="preserve">479efb5</w:t>
+            </w:r>
+          </w:p>
+        </w:tc>
+        <w:tc>
+          <w:tcPr/>
+          <w:p>
+            <w:pPr>
+              <w:pStyle w:val="Compact"/>
+            </w:pPr>
+            <w:r>
+              <w:t xml:space="preserve">Foundation wave 7: mark 9 items Completed (HXC-1101/1102/1103/1105/1106/1107/1114/1115/1133) — integration-proven vs real tmux/etcd/postgres</w:t>
+            </w:r>
+          </w:p>
+        </w:tc>
+      </w:tr>
+      <w:tr>
+        <w:tc>
+          <w:tcPr/>
+          <w:p>
+            <w:pPr>
+              <w:pStyle w:val="Compact"/>
+            </w:pPr>
+            <w:r>
+              <w:rPr>
+                <w:rStyle w:val="VerbatimChar"/>
+              </w:rPr>
               <w:t xml:space="preserve">e12003a</w:t>
             </w:r>
           </w:p>
@@ -412,33 +439,6 @@
             </w:pPr>
             <w:r>
               <w:t xml:space="preserve">Foundation wave 4 + parity: mark 10 items Completed (HXC-1014/1075-1083)</w:t>
-            </w:r>
-          </w:p>
-        </w:tc>
-      </w:tr>
-      <w:tr>
-        <w:tc>
-          <w:tcPr/>
-          <w:p>
-            <w:pPr>
-              <w:pStyle w:val="Compact"/>
-            </w:pPr>
-            <w:r>
-              <w:rPr>
-                <w:rStyle w:val="VerbatimChar"/>
-              </w:rPr>
-              <w:t xml:space="preserve">44db918</w:t>
-            </w:r>
-          </w:p>
-        </w:tc>
-        <w:tc>
-          <w:tcPr/>
-          <w:p>
-            <w:pPr>
-              <w:pStyle w:val="Compact"/>
-            </w:pPr>
-            <w:r>
-              <w:t xml:space="preserve">Foundation wave 4 + cross-platform parity: 9 real-infra items + macOS GPU/resources + real VMSSH — integration-proven</w:t>
             </w:r>
           </w:p>
         </w:tc>
@@ -548,7 +548,7 @@
               <w:rPr>
                 <w:rStyle w:val="VerbatimChar"/>
               </w:rPr>
-              <w:t xml:space="preserve">e12003a</w:t>
+              <w:t xml:space="preserve">479efb5</w:t>
             </w:r>
           </w:p>
         </w:tc>
@@ -576,7 +576,7 @@
               <w:pStyle w:val="Compact"/>
             </w:pPr>
             <w:r>
-              <w:t xml:space="preserve">2026-06-01T16:14:47Z</w:t>
+              <w:t xml:space="preserve">2026-06-01T16:32:40Z</w:t>
             </w:r>
           </w:p>
         </w:tc>

</xml_diff>

<commit_message>
Foundation wave 8: mark 5 items Completed (HXC-1108/1109/1118/1120/1121) — integration-proven vs real NATS/Kafka/HTTP
Co-Authored-By: Claude Opus 4.8 <noreply@anthropic.com>
</commit_message>
<xml_diff>
--- a/docs/export/continuation.docx
+++ b/docs/export/continuation.docx
@@ -34,7 +34,7 @@
         <w:t xml:space="preserve"> </w:t>
       </w:r>
       <w:r>
-        <w:t xml:space="preserve">51</w:t>
+        <w:t xml:space="preserve">52</w:t>
       </w:r>
       <w:r>
         <w:t xml:space="preserve"> </w:t>
@@ -50,7 +50,7 @@
         <w:t xml:space="preserve"> </w:t>
       </w:r>
       <w:r>
-        <w:t xml:space="preserve">2026-06-01T16:32:40Z</w:t>
+        <w:t xml:space="preserve">2026-06-01T16:33:29Z</w:t>
       </w:r>
       <w:r>
         <w:t xml:space="preserve"> </w:t>
@@ -184,6 +184,33 @@
               <w:rPr>
                 <w:rStyle w:val="VerbatimChar"/>
               </w:rPr>
+              <w:t xml:space="preserve">6c825df</w:t>
+            </w:r>
+          </w:p>
+        </w:tc>
+        <w:tc>
+          <w:tcPr/>
+          <w:p>
+            <w:pPr>
+              <w:pStyle w:val="Compact"/>
+            </w:pPr>
+            <w:r>
+              <w:t xml:space="preserve">Foundation wave 8: NATS JetStream stream-config (5 streams + EnsureStreams), Kafka topic-config (partitions/replication/retention + EnsureTopics), HelixQA challenge runner + DST chaos/session-recovery harness, gateway REST surface (/v1/sessions, /v1/pool/utilization) + OpenAPI 3.0 — integration-proven vs real NATS/Kafka/HTTP</w:t>
+            </w:r>
+          </w:p>
+        </w:tc>
+      </w:tr>
+      <w:tr>
+        <w:tc>
+          <w:tcPr/>
+          <w:p>
+            <w:pPr>
+              <w:pStyle w:val="Compact"/>
+            </w:pPr>
+            <w:r>
+              <w:rPr>
+                <w:rStyle w:val="VerbatimChar"/>
+              </w:rPr>
               <w:t xml:space="preserve">479efb5</w:t>
             </w:r>
           </w:p>
@@ -412,33 +439,6 @@
             </w:pPr>
             <w:r>
               <w:t xml:space="preserve">fix(pkg/infra): isolate VMSpawn integration tests against deterministic vm-1 collision</w:t>
-            </w:r>
-          </w:p>
-        </w:tc>
-      </w:tr>
-      <w:tr>
-        <w:tc>
-          <w:tcPr/>
-          <w:p>
-            <w:pPr>
-              <w:pStyle w:val="Compact"/>
-            </w:pPr>
-            <w:r>
-              <w:rPr>
-                <w:rStyle w:val="VerbatimChar"/>
-              </w:rPr>
-              <w:t xml:space="preserve">23668fa</w:t>
-            </w:r>
-          </w:p>
-        </w:tc>
-        <w:tc>
-          <w:tcPr/>
-          <w:p>
-            <w:pPr>
-              <w:pStyle w:val="Compact"/>
-            </w:pPr>
-            <w:r>
-              <w:t xml:space="preserve">Foundation wave 4 + parity: mark 10 items Completed (HXC-1014/1075-1083)</w:t>
             </w:r>
           </w:p>
         </w:tc>
@@ -548,7 +548,7 @@
               <w:rPr>
                 <w:rStyle w:val="VerbatimChar"/>
               </w:rPr>
-              <w:t xml:space="preserve">479efb5</w:t>
+              <w:t xml:space="preserve">6c825df</w:t>
             </w:r>
           </w:p>
         </w:tc>
@@ -576,7 +576,7 @@
               <w:pStyle w:val="Compact"/>
             </w:pPr>
             <w:r>
-              <w:t xml:space="preserve">2026-06-01T16:32:40Z</w:t>
+              <w:t xml:space="preserve">2026-06-01T16:33:29Z</w:t>
             </w:r>
           </w:p>
         </w:tc>

</xml_diff>

<commit_message>
Foundation wave 9: Redis store (routing TTL + NodeEvent pub/sub, go-redis/v9), SPIFFE SVID issuance + mTLS identity (go-spiffe/v2), OPA policy engine + HelixConstitution scheduling (open-policy-agent/opa), metrics collector scrape endpoint — integration-proven vs real redis/mTLS/opa/HTTP. GATE FIXES: tmux ControlModeAttach EOF-before-drain race; pkg/resources DarwinReader now samples REAL macOS CPU utilization via top (CLAUDE-2: no more 0%% on macOS); redis test mutex-copy vet violation
Co-Authored-By: Claude Opus 4.8 <noreply@anthropic.com>
</commit_message>
<xml_diff>
--- a/docs/export/continuation.docx
+++ b/docs/export/continuation.docx
@@ -34,7 +34,7 @@
         <w:t xml:space="preserve"> </w:t>
       </w:r>
       <w:r>
-        <w:t xml:space="preserve">52</w:t>
+        <w:t xml:space="preserve">53</w:t>
       </w:r>
       <w:r>
         <w:t xml:space="preserve"> </w:t>
@@ -50,7 +50,7 @@
         <w:t xml:space="preserve"> </w:t>
       </w:r>
       <w:r>
-        <w:t xml:space="preserve">2026-06-01T16:33:29Z</w:t>
+        <w:t xml:space="preserve">2026-06-01T17:10:26Z</w:t>
       </w:r>
       <w:r>
         <w:t xml:space="preserve"> </w:t>
@@ -184,6 +184,33 @@
               <w:rPr>
                 <w:rStyle w:val="VerbatimChar"/>
               </w:rPr>
+              <w:t xml:space="preserve">51cea15</w:t>
+            </w:r>
+          </w:p>
+        </w:tc>
+        <w:tc>
+          <w:tcPr/>
+          <w:p>
+            <w:pPr>
+              <w:pStyle w:val="Compact"/>
+            </w:pPr>
+            <w:r>
+              <w:t xml:space="preserve">Foundation wave 8: mark 5 items Completed (HXC-1108/1109/1118/1120/1121) — integration-proven vs real NATS/Kafka/HTTP</w:t>
+            </w:r>
+          </w:p>
+        </w:tc>
+      </w:tr>
+      <w:tr>
+        <w:tc>
+          <w:tcPr/>
+          <w:p>
+            <w:pPr>
+              <w:pStyle w:val="Compact"/>
+            </w:pPr>
+            <w:r>
+              <w:rPr>
+                <w:rStyle w:val="VerbatimChar"/>
+              </w:rPr>
               <w:t xml:space="preserve">6c825df</w:t>
             </w:r>
           </w:p>
@@ -412,33 +439,6 @@
             </w:pPr>
             <w:r>
               <w:t xml:space="preserve">Foundation wave 5: 5 control-plane streams (gateway/lock/wireguard/node-registry proven; leader+swim+node-watch WIP)</w:t>
-            </w:r>
-          </w:p>
-        </w:tc>
-      </w:tr>
-      <w:tr>
-        <w:tc>
-          <w:tcPr/>
-          <w:p>
-            <w:pPr>
-              <w:pStyle w:val="Compact"/>
-            </w:pPr>
-            <w:r>
-              <w:rPr>
-                <w:rStyle w:val="VerbatimChar"/>
-              </w:rPr>
-              <w:t xml:space="preserve">8f570cb</w:t>
-            </w:r>
-          </w:p>
-        </w:tc>
-        <w:tc>
-          <w:tcPr/>
-          <w:p>
-            <w:pPr>
-              <w:pStyle w:val="Compact"/>
-            </w:pPr>
-            <w:r>
-              <w:t xml:space="preserve">fix(pkg/infra): isolate VMSpawn integration tests against deterministic vm-1 collision</w:t>
             </w:r>
           </w:p>
         </w:tc>
@@ -548,7 +548,7 @@
               <w:rPr>
                 <w:rStyle w:val="VerbatimChar"/>
               </w:rPr>
-              <w:t xml:space="preserve">6c825df</w:t>
+              <w:t xml:space="preserve">51cea15</w:t>
             </w:r>
           </w:p>
         </w:tc>
@@ -576,7 +576,7 @@
               <w:pStyle w:val="Compact"/>
             </w:pPr>
             <w:r>
-              <w:t xml:space="preserve">2026-06-01T16:33:29Z</w:t>
+              <w:t xml:space="preserve">2026-06-01T17:10:26Z</w:t>
             </w:r>
           </w:p>
         </w:tc>

</xml_diff>

<commit_message>
Foundation wave 9: mark 4 items Completed (HXC-1104/1116/1127/1132) — integration-proven vs real redis/mTLS/opa/HTTP; CLAUDE-2 macOS CPU utilization now real
Co-Authored-By: Claude Opus 4.8 <noreply@anthropic.com>
</commit_message>
<xml_diff>
--- a/docs/export/continuation.docx
+++ b/docs/export/continuation.docx
@@ -34,7 +34,7 @@
         <w:t xml:space="preserve"> </w:t>
       </w:r>
       <w:r>
-        <w:t xml:space="preserve">53</w:t>
+        <w:t xml:space="preserve">54</w:t>
       </w:r>
       <w:r>
         <w:t xml:space="preserve"> </w:t>
@@ -50,7 +50,7 @@
         <w:t xml:space="preserve"> </w:t>
       </w:r>
       <w:r>
-        <w:t xml:space="preserve">2026-06-01T17:10:26Z</w:t>
+        <w:t xml:space="preserve">2026-06-01T17:11:14Z</w:t>
       </w:r>
       <w:r>
         <w:t xml:space="preserve"> </w:t>
@@ -184,6 +184,33 @@
               <w:rPr>
                 <w:rStyle w:val="VerbatimChar"/>
               </w:rPr>
+              <w:t xml:space="preserve">7634fbb</w:t>
+            </w:r>
+          </w:p>
+        </w:tc>
+        <w:tc>
+          <w:tcPr/>
+          <w:p>
+            <w:pPr>
+              <w:pStyle w:val="Compact"/>
+            </w:pPr>
+            <w:r>
+              <w:t xml:space="preserve">Foundation wave 9: Redis store (routing TTL + NodeEvent pub/sub, go-redis/v9), SPIFFE SVID issuance + mTLS identity (go-spiffe/v2), OPA policy engine + HelixConstitution scheduling (open-policy-agent/opa), metrics collector scrape endpoint — integration-proven vs real redis/mTLS/opa/HTTP. GATE FIXES: tmux ControlModeAttach EOF-before-drain race; pkg/resources DarwinReader now samples REAL macOS CPU utilization via top (CLAUDE-2: no more 0%% on macOS); redis test mutex-copy vet violation</w:t>
+            </w:r>
+          </w:p>
+        </w:tc>
+      </w:tr>
+      <w:tr>
+        <w:tc>
+          <w:tcPr/>
+          <w:p>
+            <w:pPr>
+              <w:pStyle w:val="Compact"/>
+            </w:pPr>
+            <w:r>
+              <w:rPr>
+                <w:rStyle w:val="VerbatimChar"/>
+              </w:rPr>
               <w:t xml:space="preserve">51cea15</w:t>
             </w:r>
           </w:p>
@@ -412,33 +439,6 @@
             </w:pPr>
             <w:r>
               <w:t xml:space="preserve">Foundation wave 5: mark 5 items Completed (HXC-1087/1089/1091/1092/1094); 1086/1088/1093 stay Queued (integration WIP)</w:t>
-            </w:r>
-          </w:p>
-        </w:tc>
-      </w:tr>
-      <w:tr>
-        <w:tc>
-          <w:tcPr/>
-          <w:p>
-            <w:pPr>
-              <w:pStyle w:val="Compact"/>
-            </w:pPr>
-            <w:r>
-              <w:rPr>
-                <w:rStyle w:val="VerbatimChar"/>
-              </w:rPr>
-              <w:t xml:space="preserve">2f27ac9</w:t>
-            </w:r>
-          </w:p>
-        </w:tc>
-        <w:tc>
-          <w:tcPr/>
-          <w:p>
-            <w:pPr>
-              <w:pStyle w:val="Compact"/>
-            </w:pPr>
-            <w:r>
-              <w:t xml:space="preserve">Foundation wave 5: 5 control-plane streams (gateway/lock/wireguard/node-registry proven; leader+swim+node-watch WIP)</w:t>
             </w:r>
           </w:p>
         </w:tc>
@@ -548,7 +548,7 @@
               <w:rPr>
                 <w:rStyle w:val="VerbatimChar"/>
               </w:rPr>
-              <w:t xml:space="preserve">51cea15</w:t>
+              <w:t xml:space="preserve">7634fbb</w:t>
             </w:r>
           </w:p>
         </w:tc>
@@ -576,7 +576,7 @@
               <w:pStyle w:val="Compact"/>
             </w:pPr>
             <w:r>
-              <w:t xml:space="preserve">2026-06-01T17:10:26Z</w:t>
+              <w:t xml:space="preserve">2026-06-01T17:11:14Z</w:t>
             </w:r>
           </w:p>
         </w:tc>

</xml_diff>

<commit_message>
Foundation wave 10: Vault secret injection + rotation (KV v2, no-downtime refresh), WireGuard mesh segmentation policy engine (DENY-wins label selectors + enforcement ruleset), Backup service (etcd clientv3 snapshot + pg_dump/restore state-match) — integration-proven vs real vault/etcd/postgres. GATE: fixed 2 non-compiling integration files (unused ctx, unused require import)
Co-Authored-By: Claude Opus 4.8 <noreply@anthropic.com>
</commit_message>
<xml_diff>
--- a/docs/export/continuation.docx
+++ b/docs/export/continuation.docx
@@ -34,7 +34,7 @@
         <w:t xml:space="preserve"> </w:t>
       </w:r>
       <w:r>
-        <w:t xml:space="preserve">54</w:t>
+        <w:t xml:space="preserve">55</w:t>
       </w:r>
       <w:r>
         <w:t xml:space="preserve"> </w:t>
@@ -50,7 +50,7 @@
         <w:t xml:space="preserve"> </w:t>
       </w:r>
       <w:r>
-        <w:t xml:space="preserve">2026-06-01T17:11:14Z</w:t>
+        <w:t xml:space="preserve">2026-06-01T17:28:06Z</w:t>
       </w:r>
       <w:r>
         <w:t xml:space="preserve"> </w:t>
@@ -184,6 +184,33 @@
               <w:rPr>
                 <w:rStyle w:val="VerbatimChar"/>
               </w:rPr>
+              <w:t xml:space="preserve">f1e920b</w:t>
+            </w:r>
+          </w:p>
+        </w:tc>
+        <w:tc>
+          <w:tcPr/>
+          <w:p>
+            <w:pPr>
+              <w:pStyle w:val="Compact"/>
+            </w:pPr>
+            <w:r>
+              <w:t xml:space="preserve">Foundation wave 9: mark 4 items Completed (HXC-1104/1116/1127/1132) — integration-proven vs real redis/mTLS/opa/HTTP; CLAUDE-2 macOS CPU utilization now real</w:t>
+            </w:r>
+          </w:p>
+        </w:tc>
+      </w:tr>
+      <w:tr>
+        <w:tc>
+          <w:tcPr/>
+          <w:p>
+            <w:pPr>
+              <w:pStyle w:val="Compact"/>
+            </w:pPr>
+            <w:r>
+              <w:rPr>
+                <w:rStyle w:val="VerbatimChar"/>
+              </w:rPr>
               <w:t xml:space="preserve">7634fbb</w:t>
             </w:r>
           </w:p>
@@ -412,33 +439,6 @@
             </w:pPr>
             <w:r>
               <w:t xml:space="preserve">fix(swim,leader,node): resolve Wave 5 deferred — real-dep integration now green</w:t>
-            </w:r>
-          </w:p>
-        </w:tc>
-      </w:tr>
-      <w:tr>
-        <w:tc>
-          <w:tcPr/>
-          <w:p>
-            <w:pPr>
-              <w:pStyle w:val="Compact"/>
-            </w:pPr>
-            <w:r>
-              <w:rPr>
-                <w:rStyle w:val="VerbatimChar"/>
-              </w:rPr>
-              <w:t xml:space="preserve">8184725</w:t>
-            </w:r>
-          </w:p>
-        </w:tc>
-        <w:tc>
-          <w:tcPr/>
-          <w:p>
-            <w:pPr>
-              <w:pStyle w:val="Compact"/>
-            </w:pPr>
-            <w:r>
-              <w:t xml:space="preserve">Foundation wave 5: mark 5 items Completed (HXC-1087/1089/1091/1092/1094); 1086/1088/1093 stay Queued (integration WIP)</w:t>
             </w:r>
           </w:p>
         </w:tc>
@@ -548,7 +548,7 @@
               <w:rPr>
                 <w:rStyle w:val="VerbatimChar"/>
               </w:rPr>
-              <w:t xml:space="preserve">7634fbb</w:t>
+              <w:t xml:space="preserve">f1e920b</w:t>
             </w:r>
           </w:p>
         </w:tc>
@@ -576,7 +576,7 @@
               <w:pStyle w:val="Compact"/>
             </w:pPr>
             <w:r>
-              <w:t xml:space="preserve">2026-06-01T17:11:14Z</w:t>
+              <w:t xml:space="preserve">2026-06-01T17:28:06Z</w:t>
             </w:r>
           </w:p>
         </w:tc>

</xml_diff>

<commit_message>
Foundation wave 10: mark 3 items Completed (HXC-1131/1134/1144) — integration-proven vs real vault/etcd/postgres
Co-Authored-By: Claude Opus 4.8 <noreply@anthropic.com>
</commit_message>
<xml_diff>
--- a/docs/export/continuation.docx
+++ b/docs/export/continuation.docx
@@ -34,7 +34,7 @@
         <w:t xml:space="preserve"> </w:t>
       </w:r>
       <w:r>
-        <w:t xml:space="preserve">55</w:t>
+        <w:t xml:space="preserve">56</w:t>
       </w:r>
       <w:r>
         <w:t xml:space="preserve"> </w:t>
@@ -50,7 +50,7 @@
         <w:t xml:space="preserve"> </w:t>
       </w:r>
       <w:r>
-        <w:t xml:space="preserve">2026-06-01T17:28:06Z</w:t>
+        <w:t xml:space="preserve">2026-06-01T17:28:49Z</w:t>
       </w:r>
       <w:r>
         <w:t xml:space="preserve"> </w:t>
@@ -184,6 +184,33 @@
               <w:rPr>
                 <w:rStyle w:val="VerbatimChar"/>
               </w:rPr>
+              <w:t xml:space="preserve">467a6dc</w:t>
+            </w:r>
+          </w:p>
+        </w:tc>
+        <w:tc>
+          <w:tcPr/>
+          <w:p>
+            <w:pPr>
+              <w:pStyle w:val="Compact"/>
+            </w:pPr>
+            <w:r>
+              <w:t xml:space="preserve">Foundation wave 10: Vault secret injection + rotation (KV v2, no-downtime refresh), WireGuard mesh segmentation policy engine (DENY-wins label selectors + enforcement ruleset), Backup service (etcd clientv3 snapshot + pg_dump/restore state-match) — integration-proven vs real vault/etcd/postgres. GATE: fixed 2 non-compiling integration files (unused ctx, unused require import)</w:t>
+            </w:r>
+          </w:p>
+        </w:tc>
+      </w:tr>
+      <w:tr>
+        <w:tc>
+          <w:tcPr/>
+          <w:p>
+            <w:pPr>
+              <w:pStyle w:val="Compact"/>
+            </w:pPr>
+            <w:r>
+              <w:rPr>
+                <w:rStyle w:val="VerbatimChar"/>
+              </w:rPr>
               <w:t xml:space="preserve">f1e920b</w:t>
             </w:r>
           </w:p>
@@ -412,33 +439,6 @@
             </w:pPr>
             <w:r>
               <w:t xml:space="preserve">Wave 5 deferred resolved: mark HXC-1086/1088/1093 Completed (integration-proven)</w:t>
-            </w:r>
-          </w:p>
-        </w:tc>
-      </w:tr>
-      <w:tr>
-        <w:tc>
-          <w:tcPr/>
-          <w:p>
-            <w:pPr>
-              <w:pStyle w:val="Compact"/>
-            </w:pPr>
-            <w:r>
-              <w:rPr>
-                <w:rStyle w:val="VerbatimChar"/>
-              </w:rPr>
-              <w:t xml:space="preserve">4d0ac66</w:t>
-            </w:r>
-          </w:p>
-        </w:tc>
-        <w:tc>
-          <w:tcPr/>
-          <w:p>
-            <w:pPr>
-              <w:pStyle w:val="Compact"/>
-            </w:pPr>
-            <w:r>
-              <w:t xml:space="preserve">fix(swim,leader,node): resolve Wave 5 deferred — real-dep integration now green</w:t>
             </w:r>
           </w:p>
         </w:tc>
@@ -548,7 +548,7 @@
               <w:rPr>
                 <w:rStyle w:val="VerbatimChar"/>
               </w:rPr>
-              <w:t xml:space="preserve">f1e920b</w:t>
+              <w:t xml:space="preserve">467a6dc</w:t>
             </w:r>
           </w:p>
         </w:tc>
@@ -576,7 +576,7 @@
               <w:pStyle w:val="Compact"/>
             </w:pPr>
             <w:r>
-              <w:t xml:space="preserve">2026-06-01T17:28:06Z</w:t>
+              <w:t xml:space="preserve">2026-06-01T17:28:49Z</w:t>
             </w:r>
           </w:p>
         </w:tc>

</xml_diff>

<commit_message>
Foundation wave 11: Cap'n Proto zero-copy serde (node.capnp + capnpc-go, AllocsPerRun==0), FlatBuffers GPU compute payloads (compute.fbs + flatc Go + pooled builder + clang++ C++ consumer harness), ZeroMQ data-plane (ROUTER/DEALER correlated + PUSH/PULL at-least-once, pebbe/zmq4) — integration-proven (real capnp/clang++/libzmq). Toolchains capnp/flatc/libzmq + Go runtimes wired. GATE: fixed C++ harness flatc root-accessor (GetRootAsComputeTask->GetComputeTask)
Co-Authored-By: Claude Opus 4.8 <noreply@anthropic.com>
</commit_message>
<xml_diff>
--- a/docs/export/continuation.docx
+++ b/docs/export/continuation.docx
@@ -34,7 +34,7 @@
         <w:t xml:space="preserve"> </w:t>
       </w:r>
       <w:r>
-        <w:t xml:space="preserve">56</w:t>
+        <w:t xml:space="preserve">57</w:t>
       </w:r>
       <w:r>
         <w:t xml:space="preserve"> </w:t>
@@ -50,7 +50,7 @@
         <w:t xml:space="preserve"> </w:t>
       </w:r>
       <w:r>
-        <w:t xml:space="preserve">2026-06-01T17:28:49Z</w:t>
+        <w:t xml:space="preserve">2026-06-01T18:10:21Z</w:t>
       </w:r>
       <w:r>
         <w:t xml:space="preserve"> </w:t>
@@ -184,6 +184,33 @@
               <w:rPr>
                 <w:rStyle w:val="VerbatimChar"/>
               </w:rPr>
+              <w:t xml:space="preserve">546c68d</w:t>
+            </w:r>
+          </w:p>
+        </w:tc>
+        <w:tc>
+          <w:tcPr/>
+          <w:p>
+            <w:pPr>
+              <w:pStyle w:val="Compact"/>
+            </w:pPr>
+            <w:r>
+              <w:t xml:space="preserve">Foundation wave 10: mark 3 items Completed (HXC-1131/1134/1144) — integration-proven vs real vault/etcd/postgres</w:t>
+            </w:r>
+          </w:p>
+        </w:tc>
+      </w:tr>
+      <w:tr>
+        <w:tc>
+          <w:tcPr/>
+          <w:p>
+            <w:pPr>
+              <w:pStyle w:val="Compact"/>
+            </w:pPr>
+            <w:r>
+              <w:rPr>
+                <w:rStyle w:val="VerbatimChar"/>
+              </w:rPr>
               <w:t xml:space="preserve">467a6dc</w:t>
             </w:r>
           </w:p>
@@ -412,33 +439,6 @@
             </w:pPr>
             <w:r>
               <w:t xml:space="preserve">Foundation wave 6: session(tmux -CC + CRDT) / wireguard STUN-NAT / postgres registry / build orchestrator — integration-proven</w:t>
-            </w:r>
-          </w:p>
-        </w:tc>
-      </w:tr>
-      <w:tr>
-        <w:tc>
-          <w:tcPr/>
-          <w:p>
-            <w:pPr>
-              <w:pStyle w:val="Compact"/>
-            </w:pPr>
-            <w:r>
-              <w:rPr>
-                <w:rStyle w:val="VerbatimChar"/>
-              </w:rPr>
-              <w:t xml:space="preserve">e0d3938</w:t>
-            </w:r>
-          </w:p>
-        </w:tc>
-        <w:tc>
-          <w:tcPr/>
-          <w:p>
-            <w:pPr>
-              <w:pStyle w:val="Compact"/>
-            </w:pPr>
-            <w:r>
-              <w:t xml:space="preserve">Wave 5 deferred resolved: mark HXC-1086/1088/1093 Completed (integration-proven)</w:t>
             </w:r>
           </w:p>
         </w:tc>
@@ -548,7 +548,7 @@
               <w:rPr>
                 <w:rStyle w:val="VerbatimChar"/>
               </w:rPr>
-              <w:t xml:space="preserve">467a6dc</w:t>
+              <w:t xml:space="preserve">546c68d</w:t>
             </w:r>
           </w:p>
         </w:tc>
@@ -576,7 +576,7 @@
               <w:pStyle w:val="Compact"/>
             </w:pPr>
             <w:r>
-              <w:t xml:space="preserve">2026-06-01T17:28:49Z</w:t>
+              <w:t xml:space="preserve">2026-06-01T18:10:21Z</w:t>
             </w:r>
           </w:p>
         </w:tc>

</xml_diff>

<commit_message>
Foundation wave 11: mark 3 items Completed (HXC-1122/1123/1124) — integration-proven vs real capnp/clang++/libzmq
Co-Authored-By: Claude Opus 4.8 <noreply@anthropic.com>
</commit_message>
<xml_diff>
--- a/docs/export/continuation.docx
+++ b/docs/export/continuation.docx
@@ -34,7 +34,7 @@
         <w:t xml:space="preserve"> </w:t>
       </w:r>
       <w:r>
-        <w:t xml:space="preserve">57</w:t>
+        <w:t xml:space="preserve">58</w:t>
       </w:r>
       <w:r>
         <w:t xml:space="preserve"> </w:t>
@@ -50,7 +50,7 @@
         <w:t xml:space="preserve"> </w:t>
       </w:r>
       <w:r>
-        <w:t xml:space="preserve">2026-06-01T18:10:21Z</w:t>
+        <w:t xml:space="preserve">2026-06-01T18:11:06Z</w:t>
       </w:r>
       <w:r>
         <w:t xml:space="preserve"> </w:t>
@@ -184,6 +184,33 @@
               <w:rPr>
                 <w:rStyle w:val="VerbatimChar"/>
               </w:rPr>
+              <w:t xml:space="preserve">63822b3</w:t>
+            </w:r>
+          </w:p>
+        </w:tc>
+        <w:tc>
+          <w:tcPr/>
+          <w:p>
+            <w:pPr>
+              <w:pStyle w:val="Compact"/>
+            </w:pPr>
+            <w:r>
+              <w:t xml:space="preserve">Foundation wave 11: Cap’n Proto zero-copy serde (node.capnp + capnpc-go, AllocsPerRun==0), FlatBuffers GPU compute payloads (compute.fbs + flatc Go + pooled builder + clang++ C++ consumer harness), ZeroMQ data-plane (ROUTER/DEALER correlated + PUSH/PULL at-least-once, pebbe/zmq4) — integration-proven (real capnp/clang++/libzmq). Toolchains capnp/flatc/libzmq + Go runtimes wired. GATE: fixed C++ harness flatc root-accessor (GetRootAsComputeTask-&gt;GetComputeTask)</w:t>
+            </w:r>
+          </w:p>
+        </w:tc>
+      </w:tr>
+      <w:tr>
+        <w:tc>
+          <w:tcPr/>
+          <w:p>
+            <w:pPr>
+              <w:pStyle w:val="Compact"/>
+            </w:pPr>
+            <w:r>
+              <w:rPr>
+                <w:rStyle w:val="VerbatimChar"/>
+              </w:rPr>
               <w:t xml:space="preserve">546c68d</w:t>
             </w:r>
           </w:p>
@@ -412,33 +439,6 @@
             </w:pPr>
             <w:r>
               <w:t xml:space="preserve">Foundation wave 6: mark 5 items Completed (HXC-1084/1085/1090/1095/1099)</w:t>
-            </w:r>
-          </w:p>
-        </w:tc>
-      </w:tr>
-      <w:tr>
-        <w:tc>
-          <w:tcPr/>
-          <w:p>
-            <w:pPr>
-              <w:pStyle w:val="Compact"/>
-            </w:pPr>
-            <w:r>
-              <w:rPr>
-                <w:rStyle w:val="VerbatimChar"/>
-              </w:rPr>
-              <w:t xml:space="preserve">1367dca</w:t>
-            </w:r>
-          </w:p>
-        </w:tc>
-        <w:tc>
-          <w:tcPr/>
-          <w:p>
-            <w:pPr>
-              <w:pStyle w:val="Compact"/>
-            </w:pPr>
-            <w:r>
-              <w:t xml:space="preserve">Foundation wave 6: session(tmux -CC + CRDT) / wireguard STUN-NAT / postgres registry / build orchestrator — integration-proven</w:t>
             </w:r>
           </w:p>
         </w:tc>
@@ -548,7 +548,7 @@
               <w:rPr>
                 <w:rStyle w:val="VerbatimChar"/>
               </w:rPr>
-              <w:t xml:space="preserve">546c68d</w:t>
+              <w:t xml:space="preserve">63822b3</w:t>
             </w:r>
           </w:p>
         </w:tc>
@@ -576,7 +576,7 @@
               <w:pStyle w:val="Compact"/>
             </w:pPr>
             <w:r>
-              <w:t xml:space="preserve">2026-06-01T18:10:21Z</w:t>
+              <w:t xml:space="preserve">2026-06-01T18:11:06Z</w:t>
             </w:r>
           </w:p>
         </w:tc>

</xml_diff>

<commit_message>
Foundation wave 12: 5 disjoint-package streams, 12 items integration-proven vs real etcd/minio. pkg/wireguard typed ErrUnsupported (errors.Is) + key-rotation grace/overlap ActiveKeys() consumed by mesh; pkg/scheduler named ClassAdFilter/ScorePlugin (classads Requirements/Rank) + thermal-aware plugin (filter/score on temp_c threshold); internal/scheduler real PREEMPTED lifecycle event (terminal, ordered); NEW pkg/edge trust model (FULL/STANDARD/SEMI/EDGE_DONOR) + workload restriction matrix + work-unit resource-limit executor (kill-after duration) + declarative per-tier ScheduleRule engine; NEW internal/verifier SEMI output verification (sha256 redundant-recompute reject tamper) + pkg/discovery etcd TTL-lifecycle integration test + pkg/storage real-minio S3 round-trip integration test. ZERO new deps. GATE: build/vet/vet-integration clean, full -short -race green, integration tier vs real etcd(:38623 ephemeral)+minio(:9000) green, mutation spot-check on verifier confirmed real.
</commit_message>
<xml_diff>
--- a/docs/export/continuation.docx
+++ b/docs/export/continuation.docx
@@ -34,7 +34,7 @@
         <w:t xml:space="preserve"> </w:t>
       </w:r>
       <w:r>
-        <w:t xml:space="preserve">58</w:t>
+        <w:t xml:space="preserve">59</w:t>
       </w:r>
       <w:r>
         <w:t xml:space="preserve"> </w:t>
@@ -50,7 +50,7 @@
         <w:t xml:space="preserve"> </w:t>
       </w:r>
       <w:r>
-        <w:t xml:space="preserve">2026-06-01T18:11:06Z</w:t>
+        <w:t xml:space="preserve">2026-06-01T18:46:00Z</w:t>
       </w:r>
       <w:r>
         <w:t xml:space="preserve"> </w:t>
@@ -184,6 +184,33 @@
               <w:rPr>
                 <w:rStyle w:val="VerbatimChar"/>
               </w:rPr>
+              <w:t xml:space="preserve">6715b3a</w:t>
+            </w:r>
+          </w:p>
+        </w:tc>
+        <w:tc>
+          <w:tcPr/>
+          <w:p>
+            <w:pPr>
+              <w:pStyle w:val="Compact"/>
+            </w:pPr>
+            <w:r>
+              <w:t xml:space="preserve">Foundation wave 11: mark 3 items Completed (HXC-1122/1123/1124) — integration-proven vs real capnp/clang++/libzmq</w:t>
+            </w:r>
+          </w:p>
+        </w:tc>
+      </w:tr>
+      <w:tr>
+        <w:tc>
+          <w:tcPr/>
+          <w:p>
+            <w:pPr>
+              <w:pStyle w:val="Compact"/>
+            </w:pPr>
+            <w:r>
+              <w:rPr>
+                <w:rStyle w:val="VerbatimChar"/>
+              </w:rPr>
               <w:t xml:space="preserve">63822b3</w:t>
             </w:r>
           </w:p>
@@ -412,33 +439,6 @@
             </w:pPr>
             <w:r>
               <w:t xml:space="preserve">Foundation wave 7: session WS-vertical (htmux attach+PTY-over-WS+msgpack envelope), e2ee ML-KEM record + sw-attestation, RBAC scopes, ratelimit token-bucket + etcd key namespace, postgres 15-table primary schema — integration-proven (real tmux/etcd/postgres); gate fixed tmux-CC subscribe race + pg applier host-path-in-container bug</w:t>
-            </w:r>
-          </w:p>
-        </w:tc>
-      </w:tr>
-      <w:tr>
-        <w:tc>
-          <w:tcPr/>
-          <w:p>
-            <w:pPr>
-              <w:pStyle w:val="Compact"/>
-            </w:pPr>
-            <w:r>
-              <w:rPr>
-                <w:rStyle w:val="VerbatimChar"/>
-              </w:rPr>
-              <w:t xml:space="preserve">6882b02</w:t>
-            </w:r>
-          </w:p>
-        </w:tc>
-        <w:tc>
-          <w:tcPr/>
-          <w:p>
-            <w:pPr>
-              <w:pStyle w:val="Compact"/>
-            </w:pPr>
-            <w:r>
-              <w:t xml:space="preserve">Foundation wave 6: mark 5 items Completed (HXC-1084/1085/1090/1095/1099)</w:t>
             </w:r>
           </w:p>
         </w:tc>
@@ -548,7 +548,7 @@
               <w:rPr>
                 <w:rStyle w:val="VerbatimChar"/>
               </w:rPr>
-              <w:t xml:space="preserve">63822b3</w:t>
+              <w:t xml:space="preserve">6715b3a</w:t>
             </w:r>
           </w:p>
         </w:tc>
@@ -576,7 +576,7 @@
               <w:pStyle w:val="Compact"/>
             </w:pPr>
             <w:r>
-              <w:t xml:space="preserve">2026-06-01T18:11:06Z</w:t>
+              <w:t xml:space="preserve">2026-06-01T18:46:00Z</w:t>
             </w:r>
           </w:p>
         </w:tc>

</xml_diff>

<commit_message>
Foundation wave 12: mark 14 items Completed (HXC-1148/1149/1150/1151/1156/1157/1188/1191/1195/1196/1211/1212/1214/1215) — 12 integration-proven vs real etcd/minio + 2 gate-verified already-implemented (STUN/OTLP). Registry 137->151 Completed / 488 Queued.
</commit_message>
<xml_diff>
--- a/docs/export/continuation.docx
+++ b/docs/export/continuation.docx
@@ -34,7 +34,7 @@
         <w:t xml:space="preserve"> </w:t>
       </w:r>
       <w:r>
-        <w:t xml:space="preserve">59</w:t>
+        <w:t xml:space="preserve">60</w:t>
       </w:r>
       <w:r>
         <w:t xml:space="preserve"> </w:t>
@@ -50,7 +50,7 @@
         <w:t xml:space="preserve"> </w:t>
       </w:r>
       <w:r>
-        <w:t xml:space="preserve">2026-06-01T18:46:00Z</w:t>
+        <w:t xml:space="preserve">2026-06-01T18:47:26Z</w:t>
       </w:r>
       <w:r>
         <w:t xml:space="preserve"> </w:t>
@@ -184,6 +184,33 @@
               <w:rPr>
                 <w:rStyle w:val="VerbatimChar"/>
               </w:rPr>
+              <w:t xml:space="preserve">7718c20</w:t>
+            </w:r>
+          </w:p>
+        </w:tc>
+        <w:tc>
+          <w:tcPr/>
+          <w:p>
+            <w:pPr>
+              <w:pStyle w:val="Compact"/>
+            </w:pPr>
+            <w:r>
+              <w:t xml:space="preserve">Foundation wave 12: 5 disjoint-package streams, 12 items integration-proven vs real etcd/minio. pkg/wireguard typed ErrUnsupported (errors.Is) + key-rotation grace/overlap ActiveKeys() consumed by mesh; pkg/scheduler named ClassAdFilter/ScorePlugin (classads Requirements/Rank) + thermal-aware plugin (filter/score on temp_c threshold); internal/scheduler real PREEMPTED lifecycle event (terminal, ordered); NEW pkg/edge trust model (FULL/STANDARD/SEMI/EDGE_DONOR) + workload restriction matrix + work-unit resource-limit executor (kill-after duration) + declarative per-tier ScheduleRule engine; NEW internal/verifier SEMI output verification (sha256 redundant-recompute reject tamper) + pkg/discovery etcd TTL-lifecycle integration test + pkg/storage real-minio S3 round-trip integration test. ZERO new deps. GATE: build/vet/vet-integration clean, full -short -race green, integration tier vs real etcd(:38623 ephemeral)+minio(:9000) green, mutation spot-check on verifier confirmed real.</w:t>
+            </w:r>
+          </w:p>
+        </w:tc>
+      </w:tr>
+      <w:tr>
+        <w:tc>
+          <w:tcPr/>
+          <w:p>
+            <w:pPr>
+              <w:pStyle w:val="Compact"/>
+            </w:pPr>
+            <w:r>
+              <w:rPr>
+                <w:rStyle w:val="VerbatimChar"/>
+              </w:rPr>
               <w:t xml:space="preserve">6715b3a</w:t>
             </w:r>
           </w:p>
@@ -412,33 +439,6 @@
             </w:pPr>
             <w:r>
               <w:t xml:space="preserve">Foundation wave 7: mark 9 items Completed (HXC-1101/1102/1103/1105/1106/1107/1114/1115/1133) — integration-proven vs real tmux/etcd/postgres</w:t>
-            </w:r>
-          </w:p>
-        </w:tc>
-      </w:tr>
-      <w:tr>
-        <w:tc>
-          <w:tcPr/>
-          <w:p>
-            <w:pPr>
-              <w:pStyle w:val="Compact"/>
-            </w:pPr>
-            <w:r>
-              <w:rPr>
-                <w:rStyle w:val="VerbatimChar"/>
-              </w:rPr>
-              <w:t xml:space="preserve">e12003a</w:t>
-            </w:r>
-          </w:p>
-        </w:tc>
-        <w:tc>
-          <w:tcPr/>
-          <w:p>
-            <w:pPr>
-              <w:pStyle w:val="Compact"/>
-            </w:pPr>
-            <w:r>
-              <w:t xml:space="preserve">Foundation wave 7: session WS-vertical (htmux attach+PTY-over-WS+msgpack envelope), e2ee ML-KEM record + sw-attestation, RBAC scopes, ratelimit token-bucket + etcd key namespace, postgres 15-table primary schema — integration-proven (real tmux/etcd/postgres); gate fixed tmux-CC subscribe race + pg applier host-path-in-container bug</w:t>
             </w:r>
           </w:p>
         </w:tc>
@@ -548,7 +548,7 @@
               <w:rPr>
                 <w:rStyle w:val="VerbatimChar"/>
               </w:rPr>
-              <w:t xml:space="preserve">6715b3a</w:t>
+              <w:t xml:space="preserve">7718c20</w:t>
             </w:r>
           </w:p>
         </w:tc>
@@ -576,7 +576,7 @@
               <w:pStyle w:val="Compact"/>
             </w:pPr>
             <w:r>
-              <w:t xml:space="preserve">2026-06-01T18:46:00Z</w:t>
+              <w:t xml:space="preserve">2026-06-01T18:47:26Z</w:t>
             </w:r>
           </w:p>
         </w:tc>

</xml_diff>

<commit_message>
Foundation wave 13: mark 6 items Completed (HXC-1189/1190/1198/1210/1213/1220) — gateway-auth-deny-reason / node-etcd-wiring (real etcd cross-visibility) / OPA-decision-log / EdgeAware-Filter+Score / offline-sync-delta-compression. Registry 151->157 Completed / 482 Queued.
</commit_message>
<xml_diff>
--- a/docs/export/continuation.docx
+++ b/docs/export/continuation.docx
@@ -34,7 +34,7 @@
         <w:t xml:space="preserve"> </w:t>
       </w:r>
       <w:r>
-        <w:t xml:space="preserve">61</w:t>
+        <w:t xml:space="preserve">62</w:t>
       </w:r>
       <w:r>
         <w:t xml:space="preserve"> </w:t>
@@ -50,7 +50,7 @@
         <w:t xml:space="preserve"> </w:t>
       </w:r>
       <w:r>
-        <w:t xml:space="preserve">2026-06-01T19:07:20Z</w:t>
+        <w:t xml:space="preserve">2026-06-01T19:08:09Z</w:t>
       </w:r>
       <w:r>
         <w:t xml:space="preserve"> </w:t>
@@ -184,6 +184,33 @@
               <w:rPr>
                 <w:rStyle w:val="VerbatimChar"/>
               </w:rPr>
+              <w:t xml:space="preserve">203c42a</w:t>
+            </w:r>
+          </w:p>
+        </w:tc>
+        <w:tc>
+          <w:tcPr/>
+          <w:p>
+            <w:pPr>
+              <w:pStyle w:val="Compact"/>
+            </w:pPr>
+            <w:r>
+              <w:t xml:space="preserve">Foundation wave 13: 5 disjoint-package streams, 6 items. internal/gateway X-Helix-Deny-Reason header + scheduler:write scope enforcement (401/403 reject-before-proxy); internal/node REAL EtcdBackend wiring (Config.EtcdEndpoints -&gt; NewEtcdBackend w/ SWIM-tied TTL lease + resource metadata, BackendType() status, in-memory fallback) — node registrations now cluster-visible (unblocks 1135 two-node formation); internal/policy real persisted OPA decision-log sink (DecisionLogEntry RunUUID/Allow/Reason/PolicyName); NEW pkg/scheduler/edgeaware.go EdgeAware Filter (tier&gt;=6 reject session/sleeping/over-thermal/not-charging w/ reasons) + Score (per-tier+thermal-headroom bonuses); NEW pkg/offlinesync delta-compression (flate) offline job-ledger + idempotent reconcile (100% recovery). ZERO new deps. GATE: build/vet/vet-integration clean, full -short -race green, integration tier 1210 vs REAL etcd (A sees B+metadata, UUID) + gateway/policy green, live mutation spot-check on edgeaware T6 guard confirmed real.</w:t>
+            </w:r>
+          </w:p>
+        </w:tc>
+      </w:tr>
+      <w:tr>
+        <w:tc>
+          <w:tcPr/>
+          <w:p>
+            <w:pPr>
+              <w:pStyle w:val="Compact"/>
+            </w:pPr>
+            <w:r>
+              <w:rPr>
+                <w:rStyle w:val="VerbatimChar"/>
+              </w:rPr>
               <w:t xml:space="preserve">23df87b</w:t>
             </w:r>
           </w:p>
@@ -412,33 +439,6 @@
             </w:pPr>
             <w:r>
               <w:t xml:space="preserve">Foundation wave 8: mark 5 items Completed (HXC-1108/1109/1118/1120/1121) — integration-proven vs real NATS/Kafka/HTTP</w:t>
-            </w:r>
-          </w:p>
-        </w:tc>
-      </w:tr>
-      <w:tr>
-        <w:tc>
-          <w:tcPr/>
-          <w:p>
-            <w:pPr>
-              <w:pStyle w:val="Compact"/>
-            </w:pPr>
-            <w:r>
-              <w:rPr>
-                <w:rStyle w:val="VerbatimChar"/>
-              </w:rPr>
-              <w:t xml:space="preserve">6c825df</w:t>
-            </w:r>
-          </w:p>
-        </w:tc>
-        <w:tc>
-          <w:tcPr/>
-          <w:p>
-            <w:pPr>
-              <w:pStyle w:val="Compact"/>
-            </w:pPr>
-            <w:r>
-              <w:t xml:space="preserve">Foundation wave 8: NATS JetStream stream-config (5 streams + EnsureStreams), Kafka topic-config (partitions/replication/retention + EnsureTopics), HelixQA challenge runner + DST chaos/session-recovery harness, gateway REST surface (/v1/sessions, /v1/pool/utilization) + OpenAPI 3.0 — integration-proven vs real NATS/Kafka/HTTP</w:t>
             </w:r>
           </w:p>
         </w:tc>
@@ -548,7 +548,7 @@
               <w:rPr>
                 <w:rStyle w:val="VerbatimChar"/>
               </w:rPr>
-              <w:t xml:space="preserve">23df87b</w:t>
+              <w:t xml:space="preserve">203c42a</w:t>
             </w:r>
           </w:p>
         </w:tc>
@@ -576,7 +576,7 @@
               <w:pStyle w:val="Compact"/>
             </w:pPr>
             <w:r>
-              <w:t xml:space="preserve">2026-06-01T19:07:20Z</w:t>
+              <w:t xml:space="preserve">2026-06-01T19:08:09Z</w:t>
             </w:r>
           </w:p>
         </w:tc>

</xml_diff>

<commit_message>
Foundation wave 14: 4 disjoint streams, 4 items incl the MVP two-node-formation EXIT GATE. cmd/helix-agent --etcd-endpoints/HELIX_ETCD_ENDPOINTS wiring + HXC-1135 E2E (two REAL helix-agent processes form a cluster via real etcd, both visible <60s w/ per-run UUID + formation timestamp + evidence file); pkg/testing/chaos seeded deterministic fault sequencer (reproducible injection log) + Byzantine equivocation fault; NEW pkg/deviceprofile versioned-YAML device profile registry T1-T8 + schema validation/rejection; NEW pkg/stats Welch t-test regression detector (t-stat/Welch-Satterthwaite df/p-value). ZERO new deps. GATE: build/vet/vet-integration clean, full -short -race green, 1135 two-process formation PROVEN vs REAL etcd (2.76s), deviceprofile+stats integration green, live mutation spot-check on Welch significance confirmed real.
</commit_message>
<xml_diff>
--- a/docs/export/continuation.docx
+++ b/docs/export/continuation.docx
@@ -34,7 +34,7 @@
         <w:t xml:space="preserve"> </w:t>
       </w:r>
       <w:r>
-        <w:t xml:space="preserve">62</w:t>
+        <w:t xml:space="preserve">63</w:t>
       </w:r>
       <w:r>
         <w:t xml:space="preserve"> </w:t>
@@ -50,7 +50,7 @@
         <w:t xml:space="preserve"> </w:t>
       </w:r>
       <w:r>
-        <w:t xml:space="preserve">2026-06-01T19:08:09Z</w:t>
+        <w:t xml:space="preserve">2026-06-01T19:30:15Z</w:t>
       </w:r>
       <w:r>
         <w:t xml:space="preserve"> </w:t>
@@ -184,6 +184,33 @@
               <w:rPr>
                 <w:rStyle w:val="VerbatimChar"/>
               </w:rPr>
+              <w:t xml:space="preserve">e1dab02</w:t>
+            </w:r>
+          </w:p>
+        </w:tc>
+        <w:tc>
+          <w:tcPr/>
+          <w:p>
+            <w:pPr>
+              <w:pStyle w:val="Compact"/>
+            </w:pPr>
+            <w:r>
+              <w:t xml:space="preserve">Foundation wave 13: mark 6 items Completed (HXC-1189/1190/1198/1210/1213/1220) — gateway-auth-deny-reason / node-etcd-wiring (real etcd cross-visibility) / OPA-decision-log / EdgeAware-Filter+Score / offline-sync-delta-compression. Registry 151-&gt;157 Completed / 482 Queued.</w:t>
+            </w:r>
+          </w:p>
+        </w:tc>
+      </w:tr>
+      <w:tr>
+        <w:tc>
+          <w:tcPr/>
+          <w:p>
+            <w:pPr>
+              <w:pStyle w:val="Compact"/>
+            </w:pPr>
+            <w:r>
+              <w:rPr>
+                <w:rStyle w:val="VerbatimChar"/>
+              </w:rPr>
               <w:t xml:space="preserve">203c42a</w:t>
             </w:r>
           </w:p>
@@ -412,33 +439,6 @@
             </w:pPr>
             <w:r>
               <w:t xml:space="preserve">Foundation wave 9: Redis store (routing TTL + NodeEvent pub/sub, go-redis/v9), SPIFFE SVID issuance + mTLS identity (go-spiffe/v2), OPA policy engine + HelixConstitution scheduling (open-policy-agent/opa), metrics collector scrape endpoint — integration-proven vs real redis/mTLS/opa/HTTP. GATE FIXES: tmux ControlModeAttach EOF-before-drain race; pkg/resources DarwinReader now samples REAL macOS CPU utilization via top (CLAUDE-2: no more 0%% on macOS); redis test mutex-copy vet violation</w:t>
-            </w:r>
-          </w:p>
-        </w:tc>
-      </w:tr>
-      <w:tr>
-        <w:tc>
-          <w:tcPr/>
-          <w:p>
-            <w:pPr>
-              <w:pStyle w:val="Compact"/>
-            </w:pPr>
-            <w:r>
-              <w:rPr>
-                <w:rStyle w:val="VerbatimChar"/>
-              </w:rPr>
-              <w:t xml:space="preserve">51cea15</w:t>
-            </w:r>
-          </w:p>
-        </w:tc>
-        <w:tc>
-          <w:tcPr/>
-          <w:p>
-            <w:pPr>
-              <w:pStyle w:val="Compact"/>
-            </w:pPr>
-            <w:r>
-              <w:t xml:space="preserve">Foundation wave 8: mark 5 items Completed (HXC-1108/1109/1118/1120/1121) — integration-proven vs real NATS/Kafka/HTTP</w:t>
             </w:r>
           </w:p>
         </w:tc>
@@ -548,7 +548,7 @@
               <w:rPr>
                 <w:rStyle w:val="VerbatimChar"/>
               </w:rPr>
-              <w:t xml:space="preserve">203c42a</w:t>
+              <w:t xml:space="preserve">e1dab02</w:t>
             </w:r>
           </w:p>
         </w:tc>
@@ -576,7 +576,7 @@
               <w:pStyle w:val="Compact"/>
             </w:pPr>
             <w:r>
-              <w:t xml:space="preserve">2026-06-01T19:08:09Z</w:t>
+              <w:t xml:space="preserve">2026-06-01T19:30:15Z</w:t>
             </w:r>
           </w:p>
         </w:tc>

</xml_diff>

<commit_message>
Foundation wave 14: mark 4 items Completed (HXC-1135/1229/1247/1261) — MVP two-node-formation EXIT GATE proven vs real etcd / chaos-sequencer+Byzantine / device-profile-registry / Welch-t-test. Registry 157->161 Completed / 478 Queued.
</commit_message>
<xml_diff>
--- a/docs/export/continuation.docx
+++ b/docs/export/continuation.docx
@@ -34,7 +34,7 @@
         <w:t xml:space="preserve"> </w:t>
       </w:r>
       <w:r>
-        <w:t xml:space="preserve">63</w:t>
+        <w:t xml:space="preserve">64</w:t>
       </w:r>
       <w:r>
         <w:t xml:space="preserve"> </w:t>
@@ -50,7 +50,7 @@
         <w:t xml:space="preserve"> </w:t>
       </w:r>
       <w:r>
-        <w:t xml:space="preserve">2026-06-01T19:30:15Z</w:t>
+        <w:t xml:space="preserve">2026-06-01T19:31:01Z</w:t>
       </w:r>
       <w:r>
         <w:t xml:space="preserve"> </w:t>
@@ -184,6 +184,33 @@
               <w:rPr>
                 <w:rStyle w:val="VerbatimChar"/>
               </w:rPr>
+              <w:t xml:space="preserve">1c0d943</w:t>
+            </w:r>
+          </w:p>
+        </w:tc>
+        <w:tc>
+          <w:tcPr/>
+          <w:p>
+            <w:pPr>
+              <w:pStyle w:val="Compact"/>
+            </w:pPr>
+            <w:r>
+              <w:t xml:space="preserve">Foundation wave 14: 4 disjoint streams, 4 items incl the MVP two-node-formation EXIT GATE. cmd/helix-agent –etcd-endpoints/HELIX_ETCD_ENDPOINTS wiring + HXC-1135 E2E (two REAL helix-agent processes form a cluster via real etcd, both visible &lt;60s w/ per-run UUID + formation timestamp + evidence file); pkg/testing/chaos seeded deterministic fault sequencer (reproducible injection log) + Byzantine equivocation fault; NEW pkg/deviceprofile versioned-YAML device profile registry T1-T8 + schema validation/rejection; NEW pkg/stats Welch t-test regression detector (t-stat/Welch-Satterthwaite df/p-value). ZERO new deps. GATE: build/vet/vet-integration clean, full -short -race green, 1135 two-process formation PROVEN vs REAL etcd (2.76s), deviceprofile+stats integration green, live mutation spot-check on Welch significance confirmed real.</w:t>
+            </w:r>
+          </w:p>
+        </w:tc>
+      </w:tr>
+      <w:tr>
+        <w:tc>
+          <w:tcPr/>
+          <w:p>
+            <w:pPr>
+              <w:pStyle w:val="Compact"/>
+            </w:pPr>
+            <w:r>
+              <w:rPr>
+                <w:rStyle w:val="VerbatimChar"/>
+              </w:rPr>
               <w:t xml:space="preserve">e1dab02</w:t>
             </w:r>
           </w:p>
@@ -412,33 +439,6 @@
             </w:pPr>
             <w:r>
               <w:t xml:space="preserve">Foundation wave 9: mark 4 items Completed (HXC-1104/1116/1127/1132) — integration-proven vs real redis/mTLS/opa/HTTP; CLAUDE-2 macOS CPU utilization now real</w:t>
-            </w:r>
-          </w:p>
-        </w:tc>
-      </w:tr>
-      <w:tr>
-        <w:tc>
-          <w:tcPr/>
-          <w:p>
-            <w:pPr>
-              <w:pStyle w:val="Compact"/>
-            </w:pPr>
-            <w:r>
-              <w:rPr>
-                <w:rStyle w:val="VerbatimChar"/>
-              </w:rPr>
-              <w:t xml:space="preserve">7634fbb</w:t>
-            </w:r>
-          </w:p>
-        </w:tc>
-        <w:tc>
-          <w:tcPr/>
-          <w:p>
-            <w:pPr>
-              <w:pStyle w:val="Compact"/>
-            </w:pPr>
-            <w:r>
-              <w:t xml:space="preserve">Foundation wave 9: Redis store (routing TTL + NodeEvent pub/sub, go-redis/v9), SPIFFE SVID issuance + mTLS identity (go-spiffe/v2), OPA policy engine + HelixConstitution scheduling (open-policy-agent/opa), metrics collector scrape endpoint — integration-proven vs real redis/mTLS/opa/HTTP. GATE FIXES: tmux ControlModeAttach EOF-before-drain race; pkg/resources DarwinReader now samples REAL macOS CPU utilization via top (CLAUDE-2: no more 0%% on macOS); redis test mutex-copy vet violation</w:t>
             </w:r>
           </w:p>
         </w:tc>
@@ -548,7 +548,7 @@
               <w:rPr>
                 <w:rStyle w:val="VerbatimChar"/>
               </w:rPr>
-              <w:t xml:space="preserve">e1dab02</w:t>
+              <w:t xml:space="preserve">1c0d943</w:t>
             </w:r>
           </w:p>
         </w:tc>
@@ -576,7 +576,7 @@
               <w:pStyle w:val="Compact"/>
             </w:pPr>
             <w:r>
-              <w:t xml:space="preserve">2026-06-01T19:30:15Z</w:t>
+              <w:t xml:space="preserve">2026-06-01T19:31:01Z</w:t>
             </w:r>
           </w:p>
         </w:tc>

</xml_diff>

<commit_message>
Foundation wave 15: mark 4 items Completed (HXC-1136/1137/1231/1260) — session-create EXIT GATE proven vs real tmux / scheduler-latency EXIT GATE <100ms / provisioner-lifecycle-FSM / KPI-quality-gate. MVP exit-gate triad complete (1135+1136+1137). Registry 161->165 Completed / 474 Queued.
</commit_message>
<xml_diff>
--- a/docs/export/continuation.docx
+++ b/docs/export/continuation.docx
@@ -34,7 +34,7 @@
         <w:t xml:space="preserve"> </w:t>
       </w:r>
       <w:r>
-        <w:t xml:space="preserve">65</w:t>
+        <w:t xml:space="preserve">66</w:t>
       </w:r>
       <w:r>
         <w:t xml:space="preserve"> </w:t>
@@ -50,7 +50,7 @@
         <w:t xml:space="preserve"> </w:t>
       </w:r>
       <w:r>
-        <w:t xml:space="preserve">2026-06-01T19:59:07Z</w:t>
+        <w:t xml:space="preserve">2026-06-01T19:59:54Z</w:t>
       </w:r>
       <w:r>
         <w:t xml:space="preserve"> </w:t>
@@ -184,6 +184,33 @@
               <w:rPr>
                 <w:rStyle w:val="VerbatimChar"/>
               </w:rPr>
+              <w:t xml:space="preserve">553a043</w:t>
+            </w:r>
+          </w:p>
+        </w:tc>
+        <w:tc>
+          <w:tcPr/>
+          <w:p>
+            <w:pPr>
+              <w:pStyle w:val="Compact"/>
+            </w:pPr>
+            <w:r>
+              <w:t xml:space="preserve">Foundation wave 15: 4 streams, 4 items incl 2 MVP exit gates. HXC-1136 session-create EXIT GATE — wired pkg/session.Manager to a REAL tmux/PTY backend via BackendAdapter (fixed the nil-backend StatusRunning PASS-bluff in internal/session.NewServer; added NewServerWithTmuxBackend seam + SessionExists sink-probe); E2E proves htmux create -&gt; helix-session -&gt; real tmux session visible running in 388ms (&lt;3s). HXC-1137 scheduler decision-latency EXIT GATE (&lt;100ms across 10 jobs, histogram + placement-correctness + 120ms-slow-plugin mutation). NEW pkg/testing/instance Provisioner/Instance lifecycle FSM (provisioned-&gt;booting-&gt;ready-&gt;stopped on virtual clock, illegal-transition reject). NEW pkg/qualitygate KPI baseline validation + critical-severity CI gate (8 rules). ZERO new deps. GATE caught+fixed a real regression: 1136’s real backend exposed test/chaos+test/e2e relying on the no-op bluff (1000 free sessions -&gt; 509 leaked tmux -&gt; PTY exhaustion) -&gt; switched those harnesses to the in-memory NewServerWithTmuxBackend(nil) seam + added SessionExists to the test double. Full -short -race green, 1136 real-tmux E2E + 1231/1260 integration green, live mutation spot-check on qualitygate critical gate confirmed real.</w:t>
+            </w:r>
+          </w:p>
+        </w:tc>
+      </w:tr>
+      <w:tr>
+        <w:tc>
+          <w:tcPr/>
+          <w:p>
+            <w:pPr>
+              <w:pStyle w:val="Compact"/>
+            </w:pPr>
+            <w:r>
+              <w:rPr>
+                <w:rStyle w:val="VerbatimChar"/>
+              </w:rPr>
               <w:t xml:space="preserve">34efa5d</w:t>
             </w:r>
           </w:p>
@@ -412,33 +439,6 @@
             </w:pPr>
             <w:r>
               <w:t xml:space="preserve">Foundation wave 10: mark 3 items Completed (HXC-1131/1134/1144) — integration-proven vs real vault/etcd/postgres</w:t>
-            </w:r>
-          </w:p>
-        </w:tc>
-      </w:tr>
-      <w:tr>
-        <w:tc>
-          <w:tcPr/>
-          <w:p>
-            <w:pPr>
-              <w:pStyle w:val="Compact"/>
-            </w:pPr>
-            <w:r>
-              <w:rPr>
-                <w:rStyle w:val="VerbatimChar"/>
-              </w:rPr>
-              <w:t xml:space="preserve">467a6dc</w:t>
-            </w:r>
-          </w:p>
-        </w:tc>
-        <w:tc>
-          <w:tcPr/>
-          <w:p>
-            <w:pPr>
-              <w:pStyle w:val="Compact"/>
-            </w:pPr>
-            <w:r>
-              <w:t xml:space="preserve">Foundation wave 10: Vault secret injection + rotation (KV v2, no-downtime refresh), WireGuard mesh segmentation policy engine (DENY-wins label selectors + enforcement ruleset), Backup service (etcd clientv3 snapshot + pg_dump/restore state-match) — integration-proven vs real vault/etcd/postgres. GATE: fixed 2 non-compiling integration files (unused ctx, unused require import)</w:t>
             </w:r>
           </w:p>
         </w:tc>
@@ -548,7 +548,7 @@
               <w:rPr>
                 <w:rStyle w:val="VerbatimChar"/>
               </w:rPr>
-              <w:t xml:space="preserve">34efa5d</w:t>
+              <w:t xml:space="preserve">553a043</w:t>
             </w:r>
           </w:p>
         </w:tc>
@@ -576,7 +576,7 @@
               <w:pStyle w:val="Compact"/>
             </w:pPr>
             <w:r>
-              <w:t xml:space="preserve">2026-06-01T19:59:07Z</w:t>
+              <w:t xml:space="preserve">2026-06-01T19:59:54Z</w:t>
             </w:r>
           </w:p>
         </w:tc>

</xml_diff>

<commit_message>
Foundation wave 16: mark 6 items Completed (HXC-1238/1239/1240/1241/1138/1199) — BUGGIFY framework / DST virtual-time compression / 1000+ node scale (253k ev/s) / FoundationDB 4-phase workload / coverage+mutation gate tool / edge sensor-fusion. Adversarial review caught+fixed 3 real CLAUDE-1 bluffs; mutation spot-check confirms invariants bite. Registry 165->171 Completed / 468 Queued.
</commit_message>
<xml_diff>
--- a/docs/export/continuation.docx
+++ b/docs/export/continuation.docx
@@ -34,7 +34,7 @@
         <w:t xml:space="preserve"> </w:t>
       </w:r>
       <w:r>
-        <w:t xml:space="preserve">67</w:t>
+        <w:t xml:space="preserve">68</w:t>
       </w:r>
       <w:r>
         <w:t xml:space="preserve"> </w:t>
@@ -50,7 +50,7 @@
         <w:t xml:space="preserve"> </w:t>
       </w:r>
       <w:r>
-        <w:t xml:space="preserve">2026-06-01T20:57:15Z</w:t>
+        <w:t xml:space="preserve">2026-06-01T20:58:30Z</w:t>
       </w:r>
       <w:r>
         <w:t xml:space="preserve"> </w:t>
@@ -184,6 +184,33 @@
               <w:rPr>
                 <w:rStyle w:val="VerbatimChar"/>
               </w:rPr>
+              <w:t xml:space="preserve">75f076f</w:t>
+            </w:r>
+          </w:p>
+        </w:tc>
+        <w:tc>
+          <w:tcPr/>
+          <w:p>
+            <w:pPr>
+              <w:pStyle w:val="Compact"/>
+            </w:pPr>
+            <w:r>
+              <w:t xml:space="preserve">Foundation wave 16: 6 disjoint pure-Go DST/testing-infra streams. HXC-1238 BUGGIFY framework (pkg/testing/dst/buggify.go: Buggify type + Engine.Buggify(p) driven by seeded PRNG, ~25% FireQuarter, enabled gate, BuggifyDuration 60s-&gt;0.1s timeout compression; determinism + 100k-trial fire-rate proofs). HXC-1239 virtual-time compression (NEW pkg/testing/dstcompress: Measure() real-wall-vs-virtual ratio + BatchSchedule; proves ~2e9:1 over 24h virtual horizon, &gt;=8:1 at 1000 nodes). HXC-1240 1000+ node scale (NEW pkg/testing/dstscale: RunScale measured throughput/mem/virtual-span; -short 1000-node correctness + integration 1000x100k @ 253k ev/s, 12.8KB/node). HXC-1241 FoundationDB 4-phase workload (NEW pkg/testing/dstworkload: SETUP/EXECUTION/CHECK/METRICS over dst+chaos; real task-assignment protocol, chaos mutates Node.Online, NoLostTasks/NoDoubleAssignment/Quorum&gt;=3 invariants that BITE, throughput+p99). HXC-1138 coverage+mutation gate tool (NEW pkg/covgate: ParseCoverProfile + threshold verdict + mutation-pairing scanner vs run_mutations.sh convention; fixture-driven FAIL cases). HXC-1199 edge sensor-fusion (NEW pkg/edgefusion: deterministic windowed multi-stream fusion, distinct workload class, exact-output assertion). Adversarial review caught+fixed 3 real CLAUDE-1 bluffs (B always-true WallElapsed&lt;0 + self-referential same-timestamp; C always-true ClockMonotonic removed-&gt;measured ProcessedRatio; D structurally-dead NoDoubleAssignment map-loop -&gt; duplicates seam). ZERO new deps, zero edits to existing files (6 disjoint dirs). Gate: build/vet/vet-integration clean, full -short -race green, dstscale integration 253k ev/s, mutation spot-check confirms D+F invariants bite.</w:t>
+            </w:r>
+          </w:p>
+        </w:tc>
+      </w:tr>
+      <w:tr>
+        <w:tc>
+          <w:tcPr/>
+          <w:p>
+            <w:pPr>
+              <w:pStyle w:val="Compact"/>
+            </w:pPr>
+            <w:r>
+              <w:rPr>
+                <w:rStyle w:val="VerbatimChar"/>
+              </w:rPr>
               <w:t xml:space="preserve">888a5a3</w:t>
             </w:r>
           </w:p>
@@ -412,33 +439,6 @@
             </w:pPr>
             <w:r>
               <w:t xml:space="preserve">Foundation wave 11: mark 3 items Completed (HXC-1122/1123/1124) — integration-proven vs real capnp/clang++/libzmq</w:t>
-            </w:r>
-          </w:p>
-        </w:tc>
-      </w:tr>
-      <w:tr>
-        <w:tc>
-          <w:tcPr/>
-          <w:p>
-            <w:pPr>
-              <w:pStyle w:val="Compact"/>
-            </w:pPr>
-            <w:r>
-              <w:rPr>
-                <w:rStyle w:val="VerbatimChar"/>
-              </w:rPr>
-              <w:t xml:space="preserve">63822b3</w:t>
-            </w:r>
-          </w:p>
-        </w:tc>
-        <w:tc>
-          <w:tcPr/>
-          <w:p>
-            <w:pPr>
-              <w:pStyle w:val="Compact"/>
-            </w:pPr>
-            <w:r>
-              <w:t xml:space="preserve">Foundation wave 11: Cap’n Proto zero-copy serde (node.capnp + capnpc-go, AllocsPerRun==0), FlatBuffers GPU compute payloads (compute.fbs + flatc Go + pooled builder + clang++ C++ consumer harness), ZeroMQ data-plane (ROUTER/DEALER correlated + PUSH/PULL at-least-once, pebbe/zmq4) — integration-proven (real capnp/clang++/libzmq). Toolchains capnp/flatc/libzmq + Go runtimes wired. GATE: fixed C++ harness flatc root-accessor (GetRootAsComputeTask-&gt;GetComputeTask)</w:t>
             </w:r>
           </w:p>
         </w:tc>
@@ -548,7 +548,7 @@
               <w:rPr>
                 <w:rStyle w:val="VerbatimChar"/>
               </w:rPr>
-              <w:t xml:space="preserve">888a5a3</w:t>
+              <w:t xml:space="preserve">75f076f</w:t>
             </w:r>
           </w:p>
         </w:tc>
@@ -576,7 +576,7 @@
               <w:pStyle w:val="Compact"/>
             </w:pPr>
             <w:r>
-              <w:t xml:space="preserve">2026-06-01T20:57:15Z</w:t>
+              <w:t xml:space="preserve">2026-06-01T20:58:30Z</w:t>
             </w:r>
           </w:p>
         </w:tc>

</xml_diff>

<commit_message>
Foundation wave 17: mark 3 items Completed (HXC-1097/1111/1112) — GPUBackend interface+registry+AutoDetect (honest ErrUnsupported for compute) / gRPC W3C trace-ID propagation (3-hop proven) / standard grpc.health.v1 wired into 6 services. All 3 mutation spot-checks confirm assertions bite. Registry 171->174 Completed / 465 Queued.
</commit_message>
<xml_diff>
--- a/docs/export/continuation.docx
+++ b/docs/export/continuation.docx
@@ -34,7 +34,7 @@
         <w:t xml:space="preserve"> </w:t>
       </w:r>
       <w:r>
-        <w:t xml:space="preserve">69</w:t>
+        <w:t xml:space="preserve">70</w:t>
       </w:r>
       <w:r>
         <w:t xml:space="preserve"> </w:t>
@@ -50,7 +50,7 @@
         <w:t xml:space="preserve"> </w:t>
       </w:r>
       <w:r>
-        <w:t xml:space="preserve">2026-06-01T21:17:16Z</w:t>
+        <w:t xml:space="preserve">2026-06-01T21:18:00Z</w:t>
       </w:r>
       <w:r>
         <w:t xml:space="preserve"> </w:t>
@@ -184,6 +184,33 @@
               <w:rPr>
                 <w:rStyle w:val="VerbatimChar"/>
               </w:rPr>
+              <w:t xml:space="preserve">05f408d</w:t>
+            </w:r>
+          </w:p>
+        </w:tc>
+        <w:tc>
+          <w:tcPr/>
+          <w:p>
+            <w:pPr>
+              <w:pStyle w:val="Compact"/>
+            </w:pPr>
+            <w:r>
+              <w:t xml:space="preserve">Foundation wave 17: 3 disjoint streams (all approved no-fix; mutation spot-check confirms all 3 bite). HXC-1097 unified GPUBackend interface + BackendRegistry.AutoDetect (REAL probes nvidia-smi/rocm-smi/sycl-ls + Apple/Darwin backend with real system_profiler/sysctl device detection + metrics) — compute ops (Execute/ExecuteDistributed/AllocateMemory/MPS) return typed ErrUnsupported, NEVER fake success (CLAUDE-2 honest seam; mutation: fake-success-&gt;ErrUnsupported test FAILS). HXC-1111 gRPC W3C trace-ID propagation (pkg/tracing/grpc.go Unary client+server interceptors reusing existing Inject/Extract/ParseTraceParent; proven across a REAL 3-hop in-process gateway-&gt;scheduler-&gt;session chain — one trace ID survives, distinct per-hop parent; mutation: drop-inject-&gt;3-hop equality FAILS). HXC-1112 standard grpc.health.v1 (pkg/health/grpc.go RegisterGRPC+SetServing bridging health.Checker-&gt;SERVING/NOT_SERVING; in-process grpc_health_v1 client Check proves SERVING+NOT_SERVING; wired into 6 gRPC service mains advisory/build/node/scheduler/security/session; htmux/gateway/policy correctly skipped — no grpc.Server). ZERO new deps (used grpc’s health/grpc_health_v1/metadata/bufconn already vendored). Gate: build/vet/vet-integration clean, full -short -race green, dataplane+security ok, 3 mutation spot-checks confirm assertions bite.</w:t>
+            </w:r>
+          </w:p>
+        </w:tc>
+      </w:tr>
+      <w:tr>
+        <w:tc>
+          <w:tcPr/>
+          <w:p>
+            <w:pPr>
+              <w:pStyle w:val="Compact"/>
+            </w:pPr>
+            <w:r>
+              <w:rPr>
+                <w:rStyle w:val="VerbatimChar"/>
+              </w:rPr>
               <w:t xml:space="preserve">6f55986</w:t>
             </w:r>
           </w:p>
@@ -412,33 +439,6 @@
             </w:pPr>
             <w:r>
               <w:t xml:space="preserve">Foundation wave 12: mark 14 items Completed (HXC-1148/1149/1150/1151/1156/1157/1188/1191/1195/1196/1211/1212/1214/1215) — 12 integration-proven vs real etcd/minio + 2 gate-verified already-implemented (STUN/OTLP). Registry 137-&gt;151 Completed / 488 Queued.</w:t>
-            </w:r>
-          </w:p>
-        </w:tc>
-      </w:tr>
-      <w:tr>
-        <w:tc>
-          <w:tcPr/>
-          <w:p>
-            <w:pPr>
-              <w:pStyle w:val="Compact"/>
-            </w:pPr>
-            <w:r>
-              <w:rPr>
-                <w:rStyle w:val="VerbatimChar"/>
-              </w:rPr>
-              <w:t xml:space="preserve">7718c20</w:t>
-            </w:r>
-          </w:p>
-        </w:tc>
-        <w:tc>
-          <w:tcPr/>
-          <w:p>
-            <w:pPr>
-              <w:pStyle w:val="Compact"/>
-            </w:pPr>
-            <w:r>
-              <w:t xml:space="preserve">Foundation wave 12: 5 disjoint-package streams, 12 items integration-proven vs real etcd/minio. pkg/wireguard typed ErrUnsupported (errors.Is) + key-rotation grace/overlap ActiveKeys() consumed by mesh; pkg/scheduler named ClassAdFilter/ScorePlugin (classads Requirements/Rank) + thermal-aware plugin (filter/score on temp_c threshold); internal/scheduler real PREEMPTED lifecycle event (terminal, ordered); NEW pkg/edge trust model (FULL/STANDARD/SEMI/EDGE_DONOR) + workload restriction matrix + work-unit resource-limit executor (kill-after duration) + declarative per-tier ScheduleRule engine; NEW internal/verifier SEMI output verification (sha256 redundant-recompute reject tamper) + pkg/discovery etcd TTL-lifecycle integration test + pkg/storage real-minio S3 round-trip integration test. ZERO new deps. GATE: build/vet/vet-integration clean, full -short -race green, integration tier vs real etcd(:38623 ephemeral)+minio(:9000) green, mutation spot-check on verifier confirmed real.</w:t>
             </w:r>
           </w:p>
         </w:tc>
@@ -548,7 +548,7 @@
               <w:rPr>
                 <w:rStyle w:val="VerbatimChar"/>
               </w:rPr>
-              <w:t xml:space="preserve">6f55986</w:t>
+              <w:t xml:space="preserve">05f408d</w:t>
             </w:r>
           </w:p>
         </w:tc>
@@ -576,7 +576,7 @@
               <w:pStyle w:val="Compact"/>
             </w:pPr>
             <w:r>
-              <w:t xml:space="preserve">2026-06-01T21:17:16Z</w:t>
+              <w:t xml:space="preserve">2026-06-01T21:18:00Z</w:t>
             </w:r>
           </w:p>
         </w:tc>

</xml_diff>

<commit_message>
Foundation wave 18: mark 3 items Completed (HXC-1098/1110/1141) — GPU sharing modes (honest ErrUnsupported hardware seam) / Prometheus /metrics wired into 5 HTTP services / interactive-agent admission+context registry. Mutation spot-checks confirm bites. Registry 174->177 Completed / 462 Queued.
</commit_message>
<xml_diff>
--- a/docs/export/continuation.docx
+++ b/docs/export/continuation.docx
@@ -34,7 +34,7 @@
         <w:t xml:space="preserve"> </w:t>
       </w:r>
       <w:r>
-        <w:t xml:space="preserve">71</w:t>
+        <w:t xml:space="preserve">72</w:t>
       </w:r>
       <w:r>
         <w:t xml:space="preserve"> </w:t>
@@ -50,7 +50,7 @@
         <w:t xml:space="preserve"> </w:t>
       </w:r>
       <w:r>
-        <w:t xml:space="preserve">2026-06-01T21:34:21Z</w:t>
+        <w:t xml:space="preserve">2026-06-01T21:35:04Z</w:t>
       </w:r>
       <w:r>
         <w:t xml:space="preserve"> </w:t>
@@ -184,6 +184,45 @@
               <w:rPr>
                 <w:rStyle w:val="VerbatimChar"/>
               </w:rPr>
+              <w:t xml:space="preserve">1a67f0a</w:t>
+            </w:r>
+          </w:p>
+        </w:tc>
+        <w:tc>
+          <w:tcPr/>
+          <w:p>
+            <w:pPr>
+              <w:pStyle w:val="Compact"/>
+            </w:pPr>
+            <w:r>
+              <w:t xml:space="preserve">Foundation wave 18: 3 disjoint streams (all approved no-fix; mutation spot-checks confirm bites). HXC-1098 GPU sharing modes (internal/gpu/backend_sharing.go: SharingMode Exclusive/MPS/TimeSlice/MIG + REAL DeviceSharingState.Admit decisions — exclusive rejects 2nd job, time-slice rejects over-quantum, MIG rejects over-partition-limit, Release frees; ConfigureSharing hardware control returns typed ErrUnsupported on M3 via real AppleBackend.EnableMPS — NEVER fake hardware success; 25 tests). HXC-1110 Prometheus /metrics wiring (pkg/metrics/mount.go Mount+NewServiceRegistry reusing existing Registry/PrometheusHandler; in-process httptest scrape asserts exact</w:t>
+            </w:r>
+            <w:r>
+              <w:t xml:space="preserve"> </w:t>
+            </w:r>
+            <w:r>
+              <w:t xml:space="preserve">‘helix_test_jobs_total 2’</w:t>
+            </w:r>
+            <w:r>
+              <w:t xml:space="preserve"> </w:t>
+            </w:r>
+            <w:r>
+              <w:t xml:space="preserve">rejecting 0/1; WIRED into 5 HTTP-serving mains gateway/policy/helixd/health/llm; gRPC-only bins correctly skipped). HXC-1141 interactive-agent provisioning (NEW pkg/agentprovision: AgentAdmission per-node cap+queue + per-user rate-limit reusing pkg/ratelimit.PerKeyLimiter; ContextRegistry copy-isolated shared-context map; workload type defined locally — ZERO scheduler edits; 9 deterministic bite tests). ZERO new deps. Gate: build/vet/vet-integration clean, full -short -race green under load, dataplane+security ok; mutation spot-checks: A ConfigureSharing fake-success-&gt;ErrUnsupported test FAILS, A cap-unlimited-&gt;queue test FAILS (C), confirming decisions bite.</w:t>
+            </w:r>
+          </w:p>
+        </w:tc>
+      </w:tr>
+      <w:tr>
+        <w:tc>
+          <w:tcPr/>
+          <w:p>
+            <w:pPr>
+              <w:pStyle w:val="Compact"/>
+            </w:pPr>
+            <w:r>
+              <w:rPr>
+                <w:rStyle w:val="VerbatimChar"/>
+              </w:rPr>
               <w:t xml:space="preserve">a0d623e</w:t>
             </w:r>
           </w:p>
@@ -412,33 +451,6 @@
             </w:pPr>
             <w:r>
               <w:t xml:space="preserve">Foundation wave 13: mark 6 items Completed (HXC-1189/1190/1198/1210/1213/1220) — gateway-auth-deny-reason / node-etcd-wiring (real etcd cross-visibility) / OPA-decision-log / EdgeAware-Filter+Score / offline-sync-delta-compression. Registry 151-&gt;157 Completed / 482 Queued.</w:t>
-            </w:r>
-          </w:p>
-        </w:tc>
-      </w:tr>
-      <w:tr>
-        <w:tc>
-          <w:tcPr/>
-          <w:p>
-            <w:pPr>
-              <w:pStyle w:val="Compact"/>
-            </w:pPr>
-            <w:r>
-              <w:rPr>
-                <w:rStyle w:val="VerbatimChar"/>
-              </w:rPr>
-              <w:t xml:space="preserve">203c42a</w:t>
-            </w:r>
-          </w:p>
-        </w:tc>
-        <w:tc>
-          <w:tcPr/>
-          <w:p>
-            <w:pPr>
-              <w:pStyle w:val="Compact"/>
-            </w:pPr>
-            <w:r>
-              <w:t xml:space="preserve">Foundation wave 13: 5 disjoint-package streams, 6 items. internal/gateway X-Helix-Deny-Reason header + scheduler:write scope enforcement (401/403 reject-before-proxy); internal/node REAL EtcdBackend wiring (Config.EtcdEndpoints -&gt; NewEtcdBackend w/ SWIM-tied TTL lease + resource metadata, BackendType() status, in-memory fallback) — node registrations now cluster-visible (unblocks 1135 two-node formation); internal/policy real persisted OPA decision-log sink (DecisionLogEntry RunUUID/Allow/Reason/PolicyName); NEW pkg/scheduler/edgeaware.go EdgeAware Filter (tier&gt;=6 reject session/sleeping/over-thermal/not-charging w/ reasons) + Score (per-tier+thermal-headroom bonuses); NEW pkg/offlinesync delta-compression (flate) offline job-ledger + idempotent reconcile (100% recovery). ZERO new deps. GATE: build/vet/vet-integration clean, full -short -race green, integration tier 1210 vs REAL etcd (A sees B+metadata, UUID) + gateway/policy green, live mutation spot-check on edgeaware T6 guard confirmed real.</w:t>
             </w:r>
           </w:p>
         </w:tc>
@@ -548,7 +560,7 @@
               <w:rPr>
                 <w:rStyle w:val="VerbatimChar"/>
               </w:rPr>
-              <w:t xml:space="preserve">a0d623e</w:t>
+              <w:t xml:space="preserve">1a67f0a</w:t>
             </w:r>
           </w:p>
         </w:tc>
@@ -576,7 +588,7 @@
               <w:pStyle w:val="Compact"/>
             </w:pPr>
             <w:r>
-              <w:t xml:space="preserve">2026-06-01T21:34:21Z</w:t>
+              <w:t xml:space="preserve">2026-06-01T21:35:04Z</w:t>
             </w:r>
           </w:p>
         </w:tc>

</xml_diff>

<commit_message>
Foundation wave 19: mark 3 items Completed (HXC-1142/1096/1125) — batch/interactive mode switching+preemption / GPU /proc parser (fixture-tested) / Setup Wizard orchestrator (review caught+fixed a critical not-wired-into-main CLAUDE-1 bluff; node-config now real, verified sink-side). Registry 177->180 Completed / 459 Queued.
</commit_message>
<xml_diff>
--- a/docs/export/continuation.docx
+++ b/docs/export/continuation.docx
@@ -34,7 +34,7 @@
         <w:t xml:space="preserve"> </w:t>
       </w:r>
       <w:r>
-        <w:t xml:space="preserve">73</w:t>
+        <w:t xml:space="preserve">74</w:t>
       </w:r>
       <w:r>
         <w:t xml:space="preserve"> </w:t>
@@ -50,7 +50,7 @@
         <w:t xml:space="preserve"> </w:t>
       </w:r>
       <w:r>
-        <w:t xml:space="preserve">2026-06-01T21:55:59Z</w:t>
+        <w:t xml:space="preserve">2026-06-01T21:56:43Z</w:t>
       </w:r>
       <w:r>
         <w:t xml:space="preserve"> </w:t>
@@ -184,6 +184,33 @@
               <w:rPr>
                 <w:rStyle w:val="VerbatimChar"/>
               </w:rPr>
+              <w:t xml:space="preserve">9c58146</w:t>
+            </w:r>
+          </w:p>
+        </w:tc>
+        <w:tc>
+          <w:tcPr/>
+          <w:p>
+            <w:pPr>
+              <w:pStyle w:val="Compact"/>
+            </w:pPr>
+            <w:r>
+              <w:t xml:space="preserve">Foundation wave 19: 3 disjoint streams (A/B approved no-fix; C had a CRITICAL CLAUDE-1 bluff CAUGHT+FIXED by review). HXC-1142 batch/interactive mode switching + preemption (pkg/agentprovision/modeswitch.go: ModeManager with REAL fixed-capacity resource pool — Interactive Submit preempts the most-recent Batch occupant when full, marks Preempted=true in an eviction ledger, frees+reuses the slot; SwitchMode mutates live record changing the preempt outcome; mutation: Preempted=true-&gt;false fails the bite). HXC-1096 GPU /proc parser (internal/gpu/nvidia_parser.go: PURE ParseNvidiaInformation/ParseNvidiaProcTree fixture-tested on M3 — exact Model/UUID/MemoryMB, MiB+MB units, no-Model-&gt;error, malformed-mem-&gt;0, contiguous Index + Model-less skip; nvidia_reader_linux.go //go:build linux real /proc reader; mutation: corrupt Model prefix fails parse). HXC-1125 Setup Wizard orchestrator (cmd/helix-setup: Orchestrator detect-&gt;GenerateConfig-&gt;mesh-join(MeshJoiner seam)-&gt;Lifecycle SM, real per-OS memory via mem_darwin/linux/other.go, scripts/helix-setup.sh entrypoint with driver-install as printed host-step). REVIEW CAUGHT: orchestrator was implemented+tested but NEVER wired into main() (main wrote a hardcoded static config -&gt; 21 passing tests on UNREACHABLE code = CLAUDE-1 PASS-bluff). FIXED: wired NewOrchestrator(…).Run() into run(); binary now writes node-config.yaml with REAL hardware-detected tier (T2 on M3, cpu_cores 11), flag node_id/cluster_name, wg_endpoint — VERIFIED sink-side by me. ZERO new deps. Gate: build/vet/vet-integration clean, full -short -race green, dataplane ok, mutation spot-checks A+B bite, C verified end-to-end via real binary run.</w:t>
+            </w:r>
+          </w:p>
+        </w:tc>
+      </w:tr>
+      <w:tr>
+        <w:tc>
+          <w:tcPr/>
+          <w:p>
+            <w:pPr>
+              <w:pStyle w:val="Compact"/>
+            </w:pPr>
+            <w:r>
+              <w:rPr>
+                <w:rStyle w:val="VerbatimChar"/>
+              </w:rPr>
               <w:t xml:space="preserve">9a42d7c</w:t>
             </w:r>
           </w:p>
@@ -424,33 +451,6 @@
             </w:pPr>
             <w:r>
               <w:t xml:space="preserve">Foundation wave 14: mark 4 items Completed (HXC-1135/1229/1247/1261) — MVP two-node-formation EXIT GATE proven vs real etcd / chaos-sequencer+Byzantine / device-profile-registry / Welch-t-test. Registry 157-&gt;161 Completed / 478 Queued.</w:t>
-            </w:r>
-          </w:p>
-        </w:tc>
-      </w:tr>
-      <w:tr>
-        <w:tc>
-          <w:tcPr/>
-          <w:p>
-            <w:pPr>
-              <w:pStyle w:val="Compact"/>
-            </w:pPr>
-            <w:r>
-              <w:rPr>
-                <w:rStyle w:val="VerbatimChar"/>
-              </w:rPr>
-              <w:t xml:space="preserve">1c0d943</w:t>
-            </w:r>
-          </w:p>
-        </w:tc>
-        <w:tc>
-          <w:tcPr/>
-          <w:p>
-            <w:pPr>
-              <w:pStyle w:val="Compact"/>
-            </w:pPr>
-            <w:r>
-              <w:t xml:space="preserve">Foundation wave 14: 4 disjoint streams, 4 items incl the MVP two-node-formation EXIT GATE. cmd/helix-agent –etcd-endpoints/HELIX_ETCD_ENDPOINTS wiring + HXC-1135 E2E (two REAL helix-agent processes form a cluster via real etcd, both visible &lt;60s w/ per-run UUID + formation timestamp + evidence file); pkg/testing/chaos seeded deterministic fault sequencer (reproducible injection log) + Byzantine equivocation fault; NEW pkg/deviceprofile versioned-YAML device profile registry T1-T8 + schema validation/rejection; NEW pkg/stats Welch t-test regression detector (t-stat/Welch-Satterthwaite df/p-value). ZERO new deps. GATE: build/vet/vet-integration clean, full -short -race green, 1135 two-process formation PROVEN vs REAL etcd (2.76s), deviceprofile+stats integration green, live mutation spot-check on Welch significance confirmed real.</w:t>
             </w:r>
           </w:p>
         </w:tc>
@@ -560,7 +560,7 @@
               <w:rPr>
                 <w:rStyle w:val="VerbatimChar"/>
               </w:rPr>
-              <w:t xml:space="preserve">9a42d7c</w:t>
+              <w:t xml:space="preserve">9c58146</w:t>
             </w:r>
           </w:p>
         </w:tc>
@@ -588,7 +588,7 @@
               <w:pStyle w:val="Compact"/>
             </w:pPr>
             <w:r>
-              <w:t xml:space="preserve">2026-06-01T21:55:59Z</w:t>
+              <w:t xml:space="preserve">2026-06-01T21:56:43Z</w:t>
             </w:r>
           </w:p>
         </w:tc>

</xml_diff>

<commit_message>
Foundation wave 20: mark 2 items Completed (HXC-1248/1244) — YAML chaos scenario engine (blast-radius+abort) / simulated node fault injectors. Plus HXC-1110 /metrics coverage completed for the 6 gRPC-only services. Mutation spot-checks confirm bites. Registry 180->182 Completed / 457 Queued.
</commit_message>
<xml_diff>
--- a/docs/export/continuation.docx
+++ b/docs/export/continuation.docx
@@ -34,7 +34,7 @@
         <w:t xml:space="preserve"> </w:t>
       </w:r>
       <w:r>
-        <w:t xml:space="preserve">75</w:t>
+        <w:t xml:space="preserve">76</w:t>
       </w:r>
       <w:r>
         <w:t xml:space="preserve"> </w:t>
@@ -50,7 +50,7 @@
         <w:t xml:space="preserve"> </w:t>
       </w:r>
       <w:r>
-        <w:t xml:space="preserve">2026-06-01T22:12:14Z</w:t>
+        <w:t xml:space="preserve">2026-06-01T22:12:56Z</w:t>
       </w:r>
       <w:r>
         <w:t xml:space="preserve"> </w:t>
@@ -184,6 +184,54 @@
               <w:rPr>
                 <w:rStyle w:val="VerbatimChar"/>
               </w:rPr>
+              <w:t xml:space="preserve">e93fad6</w:t>
+            </w:r>
+          </w:p>
+        </w:tc>
+        <w:tc>
+          <w:tcPr/>
+          <w:p>
+            <w:pPr>
+              <w:pStyle w:val="Compact"/>
+            </w:pPr>
+            <w:r>
+              <w:t xml:space="preserve">Foundation wave 20: 3 disjoint streams (all approved; A minor silent-error-discard fixed by orchestrator). /metrics sidecar completing HXC-1110</w:t>
+            </w:r>
+            <w:r>
+              <w:t xml:space="preserve"> </w:t>
+            </w:r>
+            <w:r>
+              <w:t xml:space="preserve">‘every binary’</w:t>
+            </w:r>
+            <w:r>
+              <w:t xml:space="preserve"> </w:t>
+            </w:r>
+            <w:r>
+              <w:t xml:space="preserve">intent (pkg/metrics/sidecar.go StartSidecar/StartSidecarFromEnv opt-in HTTP listener HELIX_METRICS_ADDR-gated; in-process scrape asserts exact</w:t>
+            </w:r>
+            <w:r>
+              <w:t xml:space="preserve"> </w:t>
+            </w:r>
+            <w:r>
+              <w:t xml:space="preserve">‘helix_sidecar_hits_total 3’</w:t>
+            </w:r>
+            <w:r>
+              <w:t xml:space="preserve">; wired into the 6 gRPC-only mains advisory/build/node/scheduler/security/session; orchestrator added log-on-bind-error to all 6 to avoid silent failure). HXC-1248 YAML chaos Scenario Engine (NEW pkg/testing/scenario: Scenario{phases,faults,MaxFaults,MaxAffected,AbortOn} parsed via yaml.v3; Engine.Run-&gt;ExecutionLog with per-phase + global blast-radius clamp + abort-on-condition early-stop; deterministic, no wall-clock; reuses chaos catalog read-only). HXC-1244 simulated node fault injectors (NEW pkg/testing/chaos/node_faults.go: NodeRestart w/ recovery window, DiskSpaceExhaustion write-block, ProcessTerminate — each a real chaos.Fault with state-flipping Apply/Restore; distinct from existing NodeCrash/SlowDisk/OOMKill). ZERO new deps. Gate: build/vet/vet-integration clean, full -short -race green, dataplane ok; mutation spot-checks B blast-radius + C node-restart bite; A sidecar exact-value scrape verified.</w:t>
+            </w:r>
+          </w:p>
+        </w:tc>
+      </w:tr>
+      <w:tr>
+        <w:tc>
+          <w:tcPr/>
+          <w:p>
+            <w:pPr>
+              <w:pStyle w:val="Compact"/>
+            </w:pPr>
+            <w:r>
+              <w:rPr>
+                <w:rStyle w:val="VerbatimChar"/>
+              </w:rPr>
               <w:t xml:space="preserve">b7f988f</w:t>
             </w:r>
           </w:p>
@@ -424,33 +472,6 @@
             </w:pPr>
             <w:r>
               <w:t xml:space="preserve">Foundation wave 15: mark 4 items Completed (HXC-1136/1137/1231/1260) — session-create EXIT GATE proven vs real tmux / scheduler-latency EXIT GATE &lt;100ms / provisioner-lifecycle-FSM / KPI-quality-gate. MVP exit-gate triad complete (1135+1136+1137). Registry 161-&gt;165 Completed / 474 Queued.</w:t>
-            </w:r>
-          </w:p>
-        </w:tc>
-      </w:tr>
-      <w:tr>
-        <w:tc>
-          <w:tcPr/>
-          <w:p>
-            <w:pPr>
-              <w:pStyle w:val="Compact"/>
-            </w:pPr>
-            <w:r>
-              <w:rPr>
-                <w:rStyle w:val="VerbatimChar"/>
-              </w:rPr>
-              <w:t xml:space="preserve">553a043</w:t>
-            </w:r>
-          </w:p>
-        </w:tc>
-        <w:tc>
-          <w:tcPr/>
-          <w:p>
-            <w:pPr>
-              <w:pStyle w:val="Compact"/>
-            </w:pPr>
-            <w:r>
-              <w:t xml:space="preserve">Foundation wave 15: 4 streams, 4 items incl 2 MVP exit gates. HXC-1136 session-create EXIT GATE — wired pkg/session.Manager to a REAL tmux/PTY backend via BackendAdapter (fixed the nil-backend StatusRunning PASS-bluff in internal/session.NewServer; added NewServerWithTmuxBackend seam + SessionExists sink-probe); E2E proves htmux create -&gt; helix-session -&gt; real tmux session visible running in 388ms (&lt;3s). HXC-1137 scheduler decision-latency EXIT GATE (&lt;100ms across 10 jobs, histogram + placement-correctness + 120ms-slow-plugin mutation). NEW pkg/testing/instance Provisioner/Instance lifecycle FSM (provisioned-&gt;booting-&gt;ready-&gt;stopped on virtual clock, illegal-transition reject). NEW pkg/qualitygate KPI baseline validation + critical-severity CI gate (8 rules). ZERO new deps. GATE caught+fixed a real regression: 1136’s real backend exposed test/chaos+test/e2e relying on the no-op bluff (1000 free sessions -&gt; 509 leaked tmux -&gt; PTY exhaustion) -&gt; switched those harnesses to the in-memory NewServerWithTmuxBackend(nil) seam + added SessionExists to the test double. Full -short -race green, 1136 real-tmux E2E + 1231/1260 integration green, live mutation spot-check on qualitygate critical gate confirmed real.</w:t>
             </w:r>
           </w:p>
         </w:tc>
@@ -560,7 +581,7 @@
               <w:rPr>
                 <w:rStyle w:val="VerbatimChar"/>
               </w:rPr>
-              <w:t xml:space="preserve">b7f988f</w:t>
+              <w:t xml:space="preserve">e93fad6</w:t>
             </w:r>
           </w:p>
         </w:tc>
@@ -588,7 +609,7 @@
               <w:pStyle w:val="Compact"/>
             </w:pPr>
             <w:r>
-              <w:t xml:space="preserve">2026-06-01T22:12:14Z</w:t>
+              <w:t xml:space="preserve">2026-06-01T22:12:56Z</w:t>
             </w:r>
           </w:p>
         </w:tc>

</xml_diff>

<commit_message>
Foundation wave 21: mark 3 items Completed (HXC-1130/1249/1243) — screen+zellij session backends (real screen, zellij ErrUnsupported) / emergency-stop+auto-recovery / 8 network fault injectors (verified already complete). Mutation spot-check confirms emergency-stop bite. Registry 182->185 Completed / 454 Queued.
</commit_message>
<xml_diff>
--- a/docs/export/continuation.docx
+++ b/docs/export/continuation.docx
@@ -34,7 +34,7 @@
         <w:t xml:space="preserve"> </w:t>
       </w:r>
       <w:r>
-        <w:t xml:space="preserve">77</w:t>
+        <w:t xml:space="preserve">78</w:t>
       </w:r>
       <w:r>
         <w:t xml:space="preserve"> </w:t>
@@ -50,7 +50,7 @@
         <w:t xml:space="preserve"> </w:t>
       </w:r>
       <w:r>
-        <w:t xml:space="preserve">2026-06-01T22:30:41Z</w:t>
+        <w:t xml:space="preserve">2026-06-01T22:31:28Z</w:t>
       </w:r>
       <w:r>
         <w:t xml:space="preserve"> </w:t>
@@ -184,6 +184,33 @@
               <w:rPr>
                 <w:rStyle w:val="VerbatimChar"/>
               </w:rPr>
+              <w:t xml:space="preserve">15977c0</w:t>
+            </w:r>
+          </w:p>
+        </w:tc>
+        <w:tc>
+          <w:tcPr/>
+          <w:p>
+            <w:pPr>
+              <w:pStyle w:val="Compact"/>
+            </w:pPr>
+            <w:r>
+              <w:t xml:space="preserve">Foundation wave 21: 2 impl streams + 1 verified-already-done. HXC-1130 screen+zellij session backends (pkg/session/backends/screen.go real exec of /usr/bin/screen: Create -dmS / List -ls parse / Kill -X quit / SendInput -X stuff / CaptureOutput -X hardcopy; REAL integration test creates+lists(sink-side proof)+kills a uniquely-named session w/ defer-Kill, ZERO leaked sessions verified; zellij.go returns typed ErrBackendUnavailable since zellij absent — no fake; orchestrator fixed the Attach stream to deliver Write as REAL keystrokes via SendInput instead of an orphaned io.Pipe). HXC-1249 emergency-stop + auto-recovery (pkg/testing/scenario/stop.go: StopController.EmergencyStop snapshots ActiveFaults + RestoreAll -&gt; StopResult{FaultsRecovered,HaltLatencyMS,WithinBudget,RecoveredNames}; halt latency modelled as data (faults*perFaultCost), NO real sleep; AutoRecover asserts no faults remain; post-stop ActiveFaults()==0 + WithinBudget false-case are the bites). HXC-1243 8 network fault injectors VERIFIED already complete (NetworkPartition/PacketLoss/LatencyInjection + PacketReorder/PacketDuplication/BandwidthThrottle/AsymmetricPartition/DNSBlackhole, all with passing tests) — verified+marked, not rebuilt. ZERO new deps. Gate: build/vet/vet-integration clean, full -short -race green, dataplane ok; mutation spot-check: B skip-RestoreAll -&gt; post-stop ActiveFaults!=0 FAILS (bite real); A real screen create/list/kill verified sink-side, zero leaks.</w:t>
+            </w:r>
+          </w:p>
+        </w:tc>
+      </w:tr>
+      <w:tr>
+        <w:tc>
+          <w:tcPr/>
+          <w:p>
+            <w:pPr>
+              <w:pStyle w:val="Compact"/>
+            </w:pPr>
+            <w:r>
+              <w:rPr>
+                <w:rStyle w:val="VerbatimChar"/>
+              </w:rPr>
               <w:t xml:space="preserve">bc99718</w:t>
             </w:r>
           </w:p>
@@ -445,33 +472,6 @@
             </w:pPr>
             <w:r>
               <w:t xml:space="preserve">Foundation wave 16: mark 6 items Completed (HXC-1238/1239/1240/1241/1138/1199) — BUGGIFY framework / DST virtual-time compression / 1000+ node scale (253k ev/s) / FoundationDB 4-phase workload / coverage+mutation gate tool / edge sensor-fusion. Adversarial review caught+fixed 3 real CLAUDE-1 bluffs; mutation spot-check confirms invariants bite. Registry 165-&gt;171 Completed / 468 Queued.</w:t>
-            </w:r>
-          </w:p>
-        </w:tc>
-      </w:tr>
-      <w:tr>
-        <w:tc>
-          <w:tcPr/>
-          <w:p>
-            <w:pPr>
-              <w:pStyle w:val="Compact"/>
-            </w:pPr>
-            <w:r>
-              <w:rPr>
-                <w:rStyle w:val="VerbatimChar"/>
-              </w:rPr>
-              <w:t xml:space="preserve">75f076f</w:t>
-            </w:r>
-          </w:p>
-        </w:tc>
-        <w:tc>
-          <w:tcPr/>
-          <w:p>
-            <w:pPr>
-              <w:pStyle w:val="Compact"/>
-            </w:pPr>
-            <w:r>
-              <w:t xml:space="preserve">Foundation wave 16: 6 disjoint pure-Go DST/testing-infra streams. HXC-1238 BUGGIFY framework (pkg/testing/dst/buggify.go: Buggify type + Engine.Buggify(p) driven by seeded PRNG, ~25% FireQuarter, enabled gate, BuggifyDuration 60s-&gt;0.1s timeout compression; determinism + 100k-trial fire-rate proofs). HXC-1239 virtual-time compression (NEW pkg/testing/dstcompress: Measure() real-wall-vs-virtual ratio + BatchSchedule; proves ~2e9:1 over 24h virtual horizon, &gt;=8:1 at 1000 nodes). HXC-1240 1000+ node scale (NEW pkg/testing/dstscale: RunScale measured throughput/mem/virtual-span; -short 1000-node correctness + integration 1000x100k @ 253k ev/s, 12.8KB/node). HXC-1241 FoundationDB 4-phase workload (NEW pkg/testing/dstworkload: SETUP/EXECUTION/CHECK/METRICS over dst+chaos; real task-assignment protocol, chaos mutates Node.Online, NoLostTasks/NoDoubleAssignment/Quorum&gt;=3 invariants that BITE, throughput+p99). HXC-1138 coverage+mutation gate tool (NEW pkg/covgate: ParseCoverProfile + threshold verdict + mutation-pairing scanner vs run_mutations.sh convention; fixture-driven FAIL cases). HXC-1199 edge sensor-fusion (NEW pkg/edgefusion: deterministic windowed multi-stream fusion, distinct workload class, exact-output assertion). Adversarial review caught+fixed 3 real CLAUDE-1 bluffs (B always-true WallElapsed&lt;0 + self-referential same-timestamp; C always-true ClockMonotonic removed-&gt;measured ProcessedRatio; D structurally-dead NoDoubleAssignment map-loop -&gt; duplicates seam). ZERO new deps, zero edits to existing files (6 disjoint dirs). Gate: build/vet/vet-integration clean, full -short -race green, dstscale integration 253k ev/s, mutation spot-check confirms D+F invariants bite.</w:t>
             </w:r>
           </w:p>
         </w:tc>
@@ -581,7 +581,7 @@
               <w:rPr>
                 <w:rStyle w:val="VerbatimChar"/>
               </w:rPr>
-              <w:t xml:space="preserve">bc99718</w:t>
+              <w:t xml:space="preserve">15977c0</w:t>
             </w:r>
           </w:p>
         </w:tc>
@@ -609,7 +609,7 @@
               <w:pStyle w:val="Compact"/>
             </w:pPr>
             <w:r>
-              <w:t xml:space="preserve">2026-06-01T22:30:41Z</w:t>
+              <w:t xml:space="preserve">2026-06-01T22:31:28Z</w:t>
             </w:r>
           </w:p>
         </w:tc>

</xml_diff>

<commit_message>
Foundation wave 22: mark 2 items Completed (HXC-1152/1160) — container-checkpoint migration CRDT merge / tmux full functional Attach (send-keys+capture-pane, real marker round-trip). Mutation spot-checks confirm bites. Registry 185->187 Completed / 452 Queued.
</commit_message>
<xml_diff>
--- a/docs/export/continuation.docx
+++ b/docs/export/continuation.docx
@@ -34,7 +34,7 @@
         <w:t xml:space="preserve"> </w:t>
       </w:r>
       <w:r>
-        <w:t xml:space="preserve">79</w:t>
+        <w:t xml:space="preserve">80</w:t>
       </w:r>
       <w:r>
         <w:t xml:space="preserve"> </w:t>
@@ -50,7 +50,7 @@
         <w:t xml:space="preserve"> </w:t>
       </w:r>
       <w:r>
-        <w:t xml:space="preserve">2026-06-01T22:47:19Z</w:t>
+        <w:t xml:space="preserve">2026-06-01T22:48:00Z</w:t>
       </w:r>
       <w:r>
         <w:t xml:space="preserve"> </w:t>
@@ -184,6 +184,39 @@
               <w:rPr>
                 <w:rStyle w:val="VerbatimChar"/>
               </w:rPr>
+              <w:t xml:space="preserve">1d79b5c</w:t>
+            </w:r>
+          </w:p>
+        </w:tc>
+        <w:tc>
+          <w:tcPr/>
+          <w:p>
+            <w:pPr>
+              <w:pStyle w:val="Compact"/>
+            </w:pPr>
+            <w:r>
+              <w:t xml:space="preserve">Foundation wave 22: 2 disjoint streams (both approved no-fix; mutation spot-checks bite). HXC-1152 container-checkpoint migration CRDT merge (NEW pkg/checkpoint_merge: Apply(local,checkpoint) restores+merges incoming CRDT checkpoint into a clone of local via existing CRDTSessionState.Merge LWW, Migrate(source,local) models export-A-&gt;merge-B; NEW pkg/session/crdt_checkpoint.go v2 checkpoint helper avoids import cycle; convergence tests assert EXACT LWW winner values + commutativity-by-Fingerprint + idempotence + corrupt-checkpoint sentinel; mutation skip-merge -&gt; LWW winner reverts to wrong value FAILS). HXC-1160 tmux full functional Attach (pkg/session/backends/tmux_attach.go + tmux.go Attach: replaced the dead orphaned-io.Pipe stream with a REAL stream — Write delivers keystrokes via tmux send-keys -l/Enter, Read returns REAL pane content via tmux capture-pane -p; marker round-trip test against real tmux with bounded 20x100ms poll, unique names + defer Kill, ZERO leaks; mutation neuter send-keys -&gt; marker absent FAILS). ZERO new deps. Gate: build/vet/vet-integration clean, full -short -race green, dataplane ok; both mutation spot-checks bite; W22 tmux test verified zero-leak in isolation. NOTE pre-existing leak: pkg/session.Manager-based tests (manager.go:106 session-</w:t>
+            </w:r>
+            <w:r>
+              <w:t xml:space="preserve"> </w:t>
+            </w:r>
+            <w:r>
+              <w:t xml:space="preserve">naming, e.g. hxc1136) can leave tmux sessions — hygiene item, not introduced here.</w:t>
+            </w:r>
+          </w:p>
+        </w:tc>
+      </w:tr>
+      <w:tr>
+        <w:tc>
+          <w:tcPr/>
+          <w:p>
+            <w:pPr>
+              <w:pStyle w:val="Compact"/>
+            </w:pPr>
+            <w:r>
+              <w:rPr>
+                <w:rStyle w:val="VerbatimChar"/>
+              </w:rPr>
               <w:t xml:space="preserve">09d0044</w:t>
             </w:r>
           </w:p>
@@ -445,33 +478,6 @@
             </w:pPr>
             <w:r>
               <w:t xml:space="preserve">Foundation wave 17: mark 3 items Completed (HXC-1097/1111/1112) — GPUBackend interface+registry+AutoDetect (honest ErrUnsupported for compute) / gRPC W3C trace-ID propagation (3-hop proven) / standard grpc.health.v1 wired into 6 services. All 3 mutation spot-checks confirm assertions bite. Registry 171-&gt;174 Completed / 465 Queued.</w:t>
-            </w:r>
-          </w:p>
-        </w:tc>
-      </w:tr>
-      <w:tr>
-        <w:tc>
-          <w:tcPr/>
-          <w:p>
-            <w:pPr>
-              <w:pStyle w:val="Compact"/>
-            </w:pPr>
-            <w:r>
-              <w:rPr>
-                <w:rStyle w:val="VerbatimChar"/>
-              </w:rPr>
-              <w:t xml:space="preserve">05f408d</w:t>
-            </w:r>
-          </w:p>
-        </w:tc>
-        <w:tc>
-          <w:tcPr/>
-          <w:p>
-            <w:pPr>
-              <w:pStyle w:val="Compact"/>
-            </w:pPr>
-            <w:r>
-              <w:t xml:space="preserve">Foundation wave 17: 3 disjoint streams (all approved no-fix; mutation spot-check confirms all 3 bite). HXC-1097 unified GPUBackend interface + BackendRegistry.AutoDetect (REAL probes nvidia-smi/rocm-smi/sycl-ls + Apple/Darwin backend with real system_profiler/sysctl device detection + metrics) — compute ops (Execute/ExecuteDistributed/AllocateMemory/MPS) return typed ErrUnsupported, NEVER fake success (CLAUDE-2 honest seam; mutation: fake-success-&gt;ErrUnsupported test FAILS). HXC-1111 gRPC W3C trace-ID propagation (pkg/tracing/grpc.go Unary client+server interceptors reusing existing Inject/Extract/ParseTraceParent; proven across a REAL 3-hop in-process gateway-&gt;scheduler-&gt;session chain — one trace ID survives, distinct per-hop parent; mutation: drop-inject-&gt;3-hop equality FAILS). HXC-1112 standard grpc.health.v1 (pkg/health/grpc.go RegisterGRPC+SetServing bridging health.Checker-&gt;SERVING/NOT_SERVING; in-process grpc_health_v1 client Check proves SERVING+NOT_SERVING; wired into 6 gRPC service mains advisory/build/node/scheduler/security/session; htmux/gateway/policy correctly skipped — no grpc.Server). ZERO new deps (used grpc’s health/grpc_health_v1/metadata/bufconn already vendored). Gate: build/vet/vet-integration clean, full -short -race green, dataplane+security ok, 3 mutation spot-checks confirm assertions bite.</w:t>
             </w:r>
           </w:p>
         </w:tc>
@@ -581,7 +587,7 @@
               <w:rPr>
                 <w:rStyle w:val="VerbatimChar"/>
               </w:rPr>
-              <w:t xml:space="preserve">09d0044</w:t>
+              <w:t xml:space="preserve">1d79b5c</w:t>
             </w:r>
           </w:p>
         </w:tc>
@@ -609,7 +615,7 @@
               <w:pStyle w:val="Compact"/>
             </w:pPr>
             <w:r>
-              <w:t xml:space="preserve">2026-06-01T22:47:19Z</w:t>
+              <w:t xml:space="preserve">2026-06-01T22:48:00Z</w:t>
             </w:r>
           </w:p>
         </w:tc>

</xml_diff>

<commit_message>
Foundation wave 24: mark HXC-1162 Completed — E2E multi-node session CRDT convergence (5 replicas, arbitrary-order gossip, converge to identical Fingerprint + canonical truth; mutation-verified bite). Registry 187->188 Completed / 451 Queued.
</commit_message>
<xml_diff>
--- a/docs/export/continuation.docx
+++ b/docs/export/continuation.docx
@@ -34,7 +34,7 @@
         <w:t xml:space="preserve"> </w:t>
       </w:r>
       <w:r>
-        <w:t xml:space="preserve">82</w:t>
+        <w:t xml:space="preserve">83</w:t>
       </w:r>
       <w:r>
         <w:t xml:space="preserve"> </w:t>
@@ -50,7 +50,7 @@
         <w:t xml:space="preserve"> </w:t>
       </w:r>
       <w:r>
-        <w:t xml:space="preserve">2026-06-01T23:14:05Z</w:t>
+        <w:t xml:space="preserve">2026-06-01T23:14:44Z</w:t>
       </w:r>
       <w:r>
         <w:t xml:space="preserve"> </w:t>
@@ -184,6 +184,54 @@
               <w:rPr>
                 <w:rStyle w:val="VerbatimChar"/>
               </w:rPr>
+              <w:t xml:space="preserve">8e8cebb</w:t>
+            </w:r>
+          </w:p>
+        </w:tc>
+        <w:tc>
+          <w:tcPr/>
+          <w:p>
+            <w:pPr>
+              <w:pStyle w:val="Compact"/>
+            </w:pPr>
+            <w:r>
+              <w:t xml:space="preserve">Foundation wave 24: HXC-1162 E2E multi-node session CRDT convergence (pkg/session/convergence_hxc1162_test.go, test-only, ZERO edits). Proves STRONG EVENTUAL CONSISTENCY beyond the existing 2-replica tests: 5 independent replicas each seeded with a DISJOINT partition of 100 ops, gossiped via seeded-random ARBITRARY-ORDER pairwise merges (dst = dst.Clone().Merge(src)) until 3-sweep quiescence; asserts (a) ALL 5 replicas reach an identical Fingerprint AND (b) that fingerprint equals a canonical truth replica that applied all 100 ops sequentially — over 20 seeds. Reuses existing genUpdates/replicaFrom/buildUpdate + CRDTSessionState Merge/Clone/Fingerprint. Builds on W22 pkg/checkpoint_merge: this is the convergence guarantee that makes coordinator-free session migration safe. Gate: build/vet/vet-integration clean, full -short -race green (zero failures this run), dataplane ok, tmux ls clean (W23 leak fix holds); INDEPENDENT MUTATION SPOT-CHECK: order-dependent equal-version pane tiebreak (paneWins</w:t>
+            </w:r>
+            <w:r>
+              <w:t xml:space="preserve"> </w:t>
+            </w:r>
+            <w:r>
+              <w:t xml:space="preserve">‘return false’</w:t>
+            </w:r>
+            <w:r>
+              <w:t xml:space="preserve">) -&gt; replicas DIVERGE -&gt;</w:t>
+            </w:r>
+            <w:r>
+              <w:t xml:space="preserve"> </w:t>
+            </w:r>
+            <w:r>
+              <w:t xml:space="preserve">‘CONVERGENCE FAILED replica 0 and 1 diverged’</w:t>
+            </w:r>
+            <w:r>
+              <w:t xml:space="preserve"> </w:t>
+            </w:r>
+            <w:r>
+              <w:t xml:space="preserve">(the N-node convergence bite is genuinely real). ZERO new deps.</w:t>
+            </w:r>
+          </w:p>
+        </w:tc>
+      </w:tr>
+      <w:tr>
+        <w:tc>
+          <w:tcPr/>
+          <w:p>
+            <w:pPr>
+              <w:pStyle w:val="Compact"/>
+            </w:pPr>
+            <w:r>
+              <w:rPr>
+                <w:rStyle w:val="VerbatimChar"/>
+              </w:rPr>
               <w:t xml:space="preserve">06ca1a2</w:t>
             </w:r>
           </w:p>
@@ -475,33 +523,6 @@
             </w:pPr>
             <w:r>
               <w:t xml:space="preserve">Foundation wave 19: 3 disjoint streams (A/B approved no-fix; C had a CRITICAL CLAUDE-1 bluff CAUGHT+FIXED by review). HXC-1142 batch/interactive mode switching + preemption (pkg/agentprovision/modeswitch.go: ModeManager with REAL fixed-capacity resource pool — Interactive Submit preempts the most-recent Batch occupant when full, marks Preempted=true in an eviction ledger, frees+reuses the slot; SwitchMode mutates live record changing the preempt outcome; mutation: Preempted=true-&gt;false fails the bite). HXC-1096 GPU /proc parser (internal/gpu/nvidia_parser.go: PURE ParseNvidiaInformation/ParseNvidiaProcTree fixture-tested on M3 — exact Model/UUID/MemoryMB, MiB+MB units, no-Model-&gt;error, malformed-mem-&gt;0, contiguous Index + Model-less skip; nvidia_reader_linux.go //go:build linux real /proc reader; mutation: corrupt Model prefix fails parse). HXC-1125 Setup Wizard orchestrator (cmd/helix-setup: Orchestrator detect-&gt;GenerateConfig-&gt;mesh-join(MeshJoiner seam)-&gt;Lifecycle SM, real per-OS memory via mem_darwin/linux/other.go, scripts/helix-setup.sh entrypoint with driver-install as printed host-step). REVIEW CAUGHT: orchestrator was implemented+tested but NEVER wired into main() (main wrote a hardcoded static config -&gt; 21 passing tests on UNREACHABLE code = CLAUDE-1 PASS-bluff). FIXED: wired NewOrchestrator(…).Run() into run(); binary now writes node-config.yaml with REAL hardware-detected tier (T2 on M3, cpu_cores 11), flag node_id/cluster_name, wg_endpoint — VERIFIED sink-side by me. ZERO new deps. Gate: build/vet/vet-integration clean, full -short -race green, dataplane ok, mutation spot-checks A+B bite, C verified end-to-end via real binary run.</w:t>
-            </w:r>
-          </w:p>
-        </w:tc>
-      </w:tr>
-      <w:tr>
-        <w:tc>
-          <w:tcPr/>
-          <w:p>
-            <w:pPr>
-              <w:pStyle w:val="Compact"/>
-            </w:pPr>
-            <w:r>
-              <w:rPr>
-                <w:rStyle w:val="VerbatimChar"/>
-              </w:rPr>
-              <w:t xml:space="preserve">9a42d7c</w:t>
-            </w:r>
-          </w:p>
-        </w:tc>
-        <w:tc>
-          <w:tcPr/>
-          <w:p>
-            <w:pPr>
-              <w:pStyle w:val="Compact"/>
-            </w:pPr>
-            <w:r>
-              <w:t xml:space="preserve">Foundation wave 18: mark 3 items Completed (HXC-1098/1110/1141) — GPU sharing modes (honest ErrUnsupported hardware seam) / Prometheus /metrics wired into 5 HTTP services / interactive-agent admission+context registry. Mutation spot-checks confirm bites. Registry 174-&gt;177 Completed / 462 Queued.</w:t>
             </w:r>
           </w:p>
         </w:tc>
@@ -611,7 +632,7 @@
               <w:rPr>
                 <w:rStyle w:val="VerbatimChar"/>
               </w:rPr>
-              <w:t xml:space="preserve">06ca1a2</w:t>
+              <w:t xml:space="preserve">8e8cebb</w:t>
             </w:r>
           </w:p>
         </w:tc>
@@ -639,7 +660,7 @@
               <w:pStyle w:val="Compact"/>
             </w:pPr>
             <w:r>
-              <w:t xml:space="preserve">2026-06-01T23:14:05Z</w:t>
+              <w:t xml:space="preserve">2026-06-01T23:14:44Z</w:t>
             </w:r>
           </w:p>
         </w:tc>

</xml_diff>

<commit_message>
Foundation wave 25: mark 3 items Completed (HXC-1254/1255/1267) — parallel TestRunner / session test FSM / helix-test CLI (verified already complete). Mutation spot-checks confirm bites. Registry 188->191 Completed / 448 Queued.
</commit_message>
<xml_diff>
--- a/docs/export/continuation.docx
+++ b/docs/export/continuation.docx
@@ -34,7 +34,7 @@
         <w:t xml:space="preserve"> </w:t>
       </w:r>
       <w:r>
-        <w:t xml:space="preserve">84</w:t>
+        <w:t xml:space="preserve">85</w:t>
       </w:r>
       <w:r>
         <w:t xml:space="preserve"> </w:t>
@@ -50,7 +50,7 @@
         <w:t xml:space="preserve"> </w:t>
       </w:r>
       <w:r>
-        <w:t xml:space="preserve">2026-06-01T23:30:01Z</w:t>
+        <w:t xml:space="preserve">2026-06-01T23:30:49Z</w:t>
       </w:r>
       <w:r>
         <w:t xml:space="preserve"> </w:t>
@@ -184,6 +184,33 @@
               <w:rPr>
                 <w:rStyle w:val="VerbatimChar"/>
               </w:rPr>
+              <w:t xml:space="preserve">aba565b</w:t>
+            </w:r>
+          </w:p>
+        </w:tc>
+        <w:tc>
+          <w:tcPr/>
+          <w:p>
+            <w:pPr>
+              <w:pStyle w:val="Compact"/>
+            </w:pPr>
+            <w:r>
+              <w:t xml:space="preserve">Foundation wave 25: 2 new test-orchestration pkgs + 1 verified-already-done. HXC-1254 parallel TestRunner (NEW pkg/testing/runner: Suite registration + bounded-worker-pool parallel execution + result collection/aggregate Report sorted deterministically; barrier-proof concurrency test (serial runner deadlocks under a ctx-deadline guard), atomic peak counter proves MaxConcurrency cap, result counts incl Err-&gt;Failed (defense-in-depth: both guards must be removed to break the want-3-got-4 bite — mutation-verified), Register dup/empty-name errors). HXC-1255 session test FSM (NEW pkg/testing/sessionfsm: Idle-&gt;Setup-&gt;Running-&gt;ChaosInject-&gt;Verify-&gt;Done + any-nonterminal-&gt;Failed; legal-transition table, IllegalTransitionError leaves state unchanged, per-state callbacks fire in order, History(); mutation guard-always-allow -&gt; illegal transition test FAILS). HXC-1267 helix-test CLI VERIFIED already complete (cmd/helix-test dst/chaos/device/snapshot subcommands wired to real pkg/testing packages w/ 13 mutation-sensitive tests; device subcmd lists real T1-T8) — verified+marked, not rebuilt. ZERO new deps, ZERO edits to existing files. Gate: build/vet/vet-integration clean, full -short -race green, dataplane ok, tmux clean (W23 fix holds); mutation spot-checks: FSM guard bites, TestRunner Err-&gt;Failed bites (both guards), cap-peak&lt;=2 + barrier verified by review.</w:t>
+            </w:r>
+          </w:p>
+        </w:tc>
+      </w:tr>
+      <w:tr>
+        <w:tc>
+          <w:tcPr/>
+          <w:p>
+            <w:pPr>
+              <w:pStyle w:val="Compact"/>
+            </w:pPr>
+            <w:r>
+              <w:rPr>
+                <w:rStyle w:val="VerbatimChar"/>
+              </w:rPr>
               <w:t xml:space="preserve">ace79d4</w:t>
             </w:r>
           </w:p>
@@ -496,33 +523,6 @@
             </w:r>
             <w:r>
               <w:t xml:space="preserve">; wired into the 6 gRPC-only mains advisory/build/node/scheduler/security/session; orchestrator added log-on-bind-error to all 6 to avoid silent failure). HXC-1248 YAML chaos Scenario Engine (NEW pkg/testing/scenario: Scenario{phases,faults,MaxFaults,MaxAffected,AbortOn} parsed via yaml.v3; Engine.Run-&gt;ExecutionLog with per-phase + global blast-radius clamp + abort-on-condition early-stop; deterministic, no wall-clock; reuses chaos catalog read-only). HXC-1244 simulated node fault injectors (NEW pkg/testing/chaos/node_faults.go: NodeRestart w/ recovery window, DiskSpaceExhaustion write-block, ProcessTerminate — each a real chaos.Fault with state-flipping Apply/Restore; distinct from existing NodeCrash/SlowDisk/OOMKill). ZERO new deps. Gate: build/vet/vet-integration clean, full -short -race green, dataplane ok; mutation spot-checks B blast-radius + C node-restart bite; A sidecar exact-value scrape verified.</w:t>
-            </w:r>
-          </w:p>
-        </w:tc>
-      </w:tr>
-      <w:tr>
-        <w:tc>
-          <w:tcPr/>
-          <w:p>
-            <w:pPr>
-              <w:pStyle w:val="Compact"/>
-            </w:pPr>
-            <w:r>
-              <w:rPr>
-                <w:rStyle w:val="VerbatimChar"/>
-              </w:rPr>
-              <w:t xml:space="preserve">b7f988f</w:t>
-            </w:r>
-          </w:p>
-        </w:tc>
-        <w:tc>
-          <w:tcPr/>
-          <w:p>
-            <w:pPr>
-              <w:pStyle w:val="Compact"/>
-            </w:pPr>
-            <w:r>
-              <w:t xml:space="preserve">Foundation wave 19: mark 3 items Completed (HXC-1142/1096/1125) — batch/interactive mode switching+preemption / GPU /proc parser (fixture-tested) / Setup Wizard orchestrator (review caught+fixed a critical not-wired-into-main CLAUDE-1 bluff; node-config now real, verified sink-side). Registry 177-&gt;180 Completed / 459 Queued.</w:t>
             </w:r>
           </w:p>
         </w:tc>
@@ -632,7 +632,7 @@
               <w:rPr>
                 <w:rStyle w:val="VerbatimChar"/>
               </w:rPr>
-              <w:t xml:space="preserve">ace79d4</w:t>
+              <w:t xml:space="preserve">aba565b</w:t>
             </w:r>
           </w:p>
         </w:tc>
@@ -660,7 +660,7 @@
               <w:pStyle w:val="Compact"/>
             </w:pPr>
             <w:r>
-              <w:t xml:space="preserve">2026-06-01T23:30:01Z</w:t>
+              <w:t xml:space="preserve">2026-06-01T23:30:49Z</w:t>
             </w:r>
           </w:p>
         </w:tc>

</xml_diff>

<commit_message>
Foundation wave 26: mark 3 items Completed (HXC-1268/1265/1236) — helix-snapshot CLI / capability sandbox+resource-limits+audit / HelixNetwork trait (prod+sim). Mutation spot-checks + real-binary verified. Registry 191->194 Completed / 445 Queued.
</commit_message>
<xml_diff>
--- a/docs/export/continuation.docx
+++ b/docs/export/continuation.docx
@@ -34,7 +34,7 @@
         <w:t xml:space="preserve"> </w:t>
       </w:r>
       <w:r>
-        <w:t xml:space="preserve">86</w:t>
+        <w:t xml:space="preserve">87</w:t>
       </w:r>
       <w:r>
         <w:t xml:space="preserve"> </w:t>
@@ -50,7 +50,7 @@
         <w:t xml:space="preserve"> </w:t>
       </w:r>
       <w:r>
-        <w:t xml:space="preserve">2026-06-01T23:43:49Z</w:t>
+        <w:t xml:space="preserve">2026-06-01T23:44:33Z</w:t>
       </w:r>
       <w:r>
         <w:t xml:space="preserve"> </w:t>
@@ -184,6 +184,33 @@
               <w:rPr>
                 <w:rStyle w:val="VerbatimChar"/>
               </w:rPr>
+              <w:t xml:space="preserve">7c41c2f</w:t>
+            </w:r>
+          </w:p>
+        </w:tc>
+        <w:tc>
+          <w:tcPr/>
+          <w:p>
+            <w:pPr>
+              <w:pStyle w:val="Compact"/>
+            </w:pPr>
+            <w:r>
+              <w:t xml:space="preserve">Foundation wave 26: 3 disjoint streams (all approved; A minor comment-lie fixed by me). HXC-1268 standalone cmd/helix-snapshot CLI (run() dispatch + create/restore/compare/list/delete wiring real snapshot.Manager via -dir; 11 tests w/ real temp-dir fs assertions + exit codes; verified by me running the REAL binary: create writes .golden, list shows it, compare rc=0, delete removes it). HXC-1265 capability sandbox + REAL resource-limit enforcement + audit (NEW pkg/sandbox: Capability deny-by-default grant model + Guard.Check (deny ungranted) + atomic.Int64 cumulative MaxOps/MaxBytes/MaxDuration enforcement – the genuine gap vs pkg/wasm caps – + MemAudit allow/deny log; in-process model, OS syscall isolation honestly out-of-scope not faked; mutation neuter-Has -&gt; ungranted allowed FAILS). HXC-1236 HelixNetwork trait prod+sim (NEW pkg/helixnet: HelixNetwork interface + ProdNetwork real in-process channel fabric (bytes genuinely move A-&gt;B, deliver errors on unknown/closed dst) + SimNetwork deterministic via dst.Engine; zero pkg/swim edits – that’s 1237; mutation drop-delivery -&gt; send/unknown-addr tests FAIL). ZERO new deps, ZERO edits to existing files. Gate: build/vet/vet-integration clean, full -short -race green (only the known internal/advisory load-flake, passes isolated), dataplane ok, tmux/screen clean; 3 mutation spot-checks bite + helix-snapshot real-binary verified.</w:t>
+            </w:r>
+          </w:p>
+        </w:tc>
+      </w:tr>
+      <w:tr>
+        <w:tc>
+          <w:tcPr/>
+          <w:p>
+            <w:pPr>
+              <w:pStyle w:val="Compact"/>
+            </w:pPr>
+            <w:r>
+              <w:rPr>
+                <w:rStyle w:val="VerbatimChar"/>
+              </w:rPr>
               <w:t xml:space="preserve">02cd05a</w:t>
             </w:r>
           </w:p>
@@ -475,33 +502,6 @@
             </w:pPr>
             <w:r>
               <w:t xml:space="preserve">Foundation wave 21: 2 impl streams + 1 verified-already-done. HXC-1130 screen+zellij session backends (pkg/session/backends/screen.go real exec of /usr/bin/screen: Create -dmS / List -ls parse / Kill -X quit / SendInput -X stuff / CaptureOutput -X hardcopy; REAL integration test creates+lists(sink-side proof)+kills a uniquely-named session w/ defer-Kill, ZERO leaked sessions verified; zellij.go returns typed ErrBackendUnavailable since zellij absent — no fake; orchestrator fixed the Attach stream to deliver Write as REAL keystrokes via SendInput instead of an orphaned io.Pipe). HXC-1249 emergency-stop + auto-recovery (pkg/testing/scenario/stop.go: StopController.EmergencyStop snapshots ActiveFaults + RestoreAll -&gt; StopResult{FaultsRecovered,HaltLatencyMS,WithinBudget,RecoveredNames}; halt latency modelled as data (faults*perFaultCost), NO real sleep; AutoRecover asserts no faults remain; post-stop ActiveFaults()==0 + WithinBudget false-case are the bites). HXC-1243 8 network fault injectors VERIFIED already complete (NetworkPartition/PacketLoss/LatencyInjection + PacketReorder/PacketDuplication/BandwidthThrottle/AsymmetricPartition/DNSBlackhole, all with passing tests) — verified+marked, not rebuilt. ZERO new deps. Gate: build/vet/vet-integration clean, full -short -race green, dataplane ok; mutation spot-check: B skip-RestoreAll -&gt; post-stop ActiveFaults!=0 FAILS (bite real); A real screen create/list/kill verified sink-side, zero leaks.</w:t>
-            </w:r>
-          </w:p>
-        </w:tc>
-      </w:tr>
-      <w:tr>
-        <w:tc>
-          <w:tcPr/>
-          <w:p>
-            <w:pPr>
-              <w:pStyle w:val="Compact"/>
-            </w:pPr>
-            <w:r>
-              <w:rPr>
-                <w:rStyle w:val="VerbatimChar"/>
-              </w:rPr>
-              <w:t xml:space="preserve">bc99718</w:t>
-            </w:r>
-          </w:p>
-        </w:tc>
-        <w:tc>
-          <w:tcPr/>
-          <w:p>
-            <w:pPr>
-              <w:pStyle w:val="Compact"/>
-            </w:pPr>
-            <w:r>
-              <w:t xml:space="preserve">Foundation wave 20: mark 2 items Completed (HXC-1248/1244) — YAML chaos scenario engine (blast-radius+abort) / simulated node fault injectors. Plus HXC-1110 /metrics coverage completed for the 6 gRPC-only services. Mutation spot-checks confirm bites. Registry 180-&gt;182 Completed / 457 Queued.</w:t>
             </w:r>
           </w:p>
         </w:tc>
@@ -611,7 +611,7 @@
               <w:rPr>
                 <w:rStyle w:val="VerbatimChar"/>
               </w:rPr>
-              <w:t xml:space="preserve">02cd05a</w:t>
+              <w:t xml:space="preserve">7c41c2f</w:t>
             </w:r>
           </w:p>
         </w:tc>
@@ -639,7 +639,7 @@
               <w:pStyle w:val="Compact"/>
             </w:pPr>
             <w:r>
-              <w:t xml:space="preserve">2026-06-01T23:43:49Z</w:t>
+              <w:t xml:space="preserve">2026-06-01T23:44:33Z</w:t>
             </w:r>
           </w:p>
         </w:tc>

</xml_diff>

<commit_message>
Foundation wave 27: mark 2 items Completed (HXC-1237/1278) — swim prod+sim transport parity (real protocol over deterministic SimNetwork) / property-based fuzzing (4 Go fuzz targets). Mutation spot-checks confirm bites. Registry 194->196 Completed / 443 Queued.
</commit_message>
<xml_diff>
--- a/docs/export/continuation.docx
+++ b/docs/export/continuation.docx
@@ -34,7 +34,7 @@
         <w:t xml:space="preserve"> </w:t>
       </w:r>
       <w:r>
-        <w:t xml:space="preserve">88</w:t>
+        <w:t xml:space="preserve">89</w:t>
       </w:r>
       <w:r>
         <w:t xml:space="preserve"> </w:t>
@@ -50,7 +50,7 @@
         <w:t xml:space="preserve"> </w:t>
       </w:r>
       <w:r>
-        <w:t xml:space="preserve">2026-06-01T23:58:54Z</w:t>
+        <w:t xml:space="preserve">2026-06-01T23:59:37Z</w:t>
       </w:r>
       <w:r>
         <w:t xml:space="preserve"> </w:t>
@@ -184,6 +184,33 @@
               <w:rPr>
                 <w:rStyle w:val="VerbatimChar"/>
               </w:rPr>
+              <w:t xml:space="preserve">656bec1</w:t>
+            </w:r>
+          </w:p>
+        </w:tc>
+        <w:tc>
+          <w:tcPr/>
+          <w:p>
+            <w:pPr>
+              <w:pStyle w:val="Compact"/>
+            </w:pPr>
+            <w:r>
+              <w:t xml:space="preserve">Foundation wave 27: 2 disjoint streams (both approved no-fix; mutation spot-checks bite). HXC-1237 swim prod+sim transport parity (pkg/swim: minimal additive Config.Transport injection seam in NewProtocol – nil =&gt; real UDP NewTransport as before, non-nil =&gt; injected MessageTransport; prod behavior unchanged. NEW simparity_test.go runs the REAL swim membership protocol over the deterministic SimNetwork: 3-node full-mesh converges (all see StateAlive, 12 msgs), 4-node determinism (same seed identical), seam-load-bearing test asserts sim addr 127.0.0.1:18200. mutation: ignore cfg.Transport -&gt; node sees only itself, convergence FAILS). HXC-1278 property-based + coverage-guided fuzzing (4 native Go FuzzXxx targets, NEW files only): FuzzParseCoverProfile (no-panic + Covered&lt;=Total + Aggregate in [0,100]), FuzzParseTraceParent (no-panic + String() round-trip stable + valid hex ids), FuzzApply (checkpoint_merge no-panic on arbitrary checkpoint bytes via real checksum/gob path), FuzzCRDTCheckpointRoundTrip (NewCRDTCheckpoint-&gt;RestoreCRDT Fingerprint-stable + corrupt-bytes no-panic). All assert falsifiable invariants on non-empty seed corpora, run under plain go test (no -fuzz needed); mutation: break TraceParent.String() round-trip FAILS. ZERO new deps. Gate: build/vet/vet-integration clean, full -short -race green, dataplane ok, tmux clean; 2 mutation spot-checks bite.</w:t>
+            </w:r>
+          </w:p>
+        </w:tc>
+      </w:tr>
+      <w:tr>
+        <w:tc>
+          <w:tcPr/>
+          <w:p>
+            <w:pPr>
+              <w:pStyle w:val="Compact"/>
+            </w:pPr>
+            <w:r>
+              <w:rPr>
+                <w:rStyle w:val="VerbatimChar"/>
+              </w:rPr>
               <w:t xml:space="preserve">5707d6b</w:t>
             </w:r>
           </w:p>
@@ -475,33 +502,6 @@
             </w:r>
             <w:r>
               <w:t xml:space="preserve">naming, e.g. hxc1136) can leave tmux sessions — hygiene item, not introduced here.</w:t>
-            </w:r>
-          </w:p>
-        </w:tc>
-      </w:tr>
-      <w:tr>
-        <w:tc>
-          <w:tcPr/>
-          <w:p>
-            <w:pPr>
-              <w:pStyle w:val="Compact"/>
-            </w:pPr>
-            <w:r>
-              <w:rPr>
-                <w:rStyle w:val="VerbatimChar"/>
-              </w:rPr>
-              <w:t xml:space="preserve">09d0044</w:t>
-            </w:r>
-          </w:p>
-        </w:tc>
-        <w:tc>
-          <w:tcPr/>
-          <w:p>
-            <w:pPr>
-              <w:pStyle w:val="Compact"/>
-            </w:pPr>
-            <w:r>
-              <w:t xml:space="preserve">Foundation wave 21: mark 3 items Completed (HXC-1130/1249/1243) — screen+zellij session backends (real screen, zellij ErrUnsupported) / emergency-stop+auto-recovery / 8 network fault injectors (verified already complete). Mutation spot-check confirms emergency-stop bite. Registry 182-&gt;185 Completed / 454 Queued.</w:t>
             </w:r>
           </w:p>
         </w:tc>
@@ -611,7 +611,7 @@
               <w:rPr>
                 <w:rStyle w:val="VerbatimChar"/>
               </w:rPr>
-              <w:t xml:space="preserve">5707d6b</w:t>
+              <w:t xml:space="preserve">656bec1</w:t>
             </w:r>
           </w:p>
         </w:tc>
@@ -639,7 +639,7 @@
               <w:pStyle w:val="Compact"/>
             </w:pPr>
             <w:r>
-              <w:t xml:space="preserve">2026-06-01T23:58:54Z</w:t>
+              <w:t xml:space="preserve">2026-06-01T23:59:37Z</w:t>
             </w:r>
           </w:p>
         </w:tc>

</xml_diff>

<commit_message>
Foundation wave 28: mark 3 items Completed (HXC-1311/1301/1303) — T1-T15 tier definitions / cloudspot PreemptionWatcher (verified) / inference Backend+Router (verified, dual-layer mutation). Registry 196->199 Completed / 440 Queued.
</commit_message>
<xml_diff>
--- a/docs/export/continuation.docx
+++ b/docs/export/continuation.docx
@@ -34,7 +34,7 @@
         <w:t xml:space="preserve"> </w:t>
       </w:r>
       <w:r>
-        <w:t xml:space="preserve">90</w:t>
+        <w:t xml:space="preserve">91</w:t>
       </w:r>
       <w:r>
         <w:t xml:space="preserve"> </w:t>
@@ -50,7 +50,7 @@
         <w:t xml:space="preserve"> </w:t>
       </w:r>
       <w:r>
-        <w:t xml:space="preserve">2026-06-02T00:15:38Z</w:t>
+        <w:t xml:space="preserve">2026-06-02T00:16:20Z</w:t>
       </w:r>
       <w:r>
         <w:t xml:space="preserve"> </w:t>
@@ -184,6 +184,33 @@
               <w:rPr>
                 <w:rStyle w:val="VerbatimChar"/>
               </w:rPr>
+              <w:t xml:space="preserve">d4829d1</w:t>
+            </w:r>
+          </w:p>
+        </w:tc>
+        <w:tc>
+          <w:tcPr/>
+          <w:p>
+            <w:pPr>
+              <w:pStyle w:val="Compact"/>
+            </w:pPr>
+            <w:r>
+              <w:t xml:space="preserve">Foundation wave 28: HXC-1311 implemented + HXC-1301/1303 verified-already-done. HXC-1311 T1-T15 tier definitions (NEW pkg/tierdef: //go:embed tierdef.yaml with all 15 ascending tiers + min_requirements; LoadTiers parse+validate (rejects bad schema_version, missing/dup/out-of-order/wrong-count), Default(); TierDef.Meets(DeviceCaps) inclusive &gt;= per-dimension (cpu/mem/gpu/vram/net); 73 test cases assert exact parsed T1/T15 values + per-dimension below-boundary false + exact-boundary true; mutation &lt; -&gt; &lt;= fails TestMeets_ExactBoundary_True). HXC-1301 pkg/cloudspot PreemptionWatcher VERIFIED already complete (injectable PreemptionSource + 3-step graceful drain StopAdmission/Checkpoint/Deregister + deadline ForceStop + FakeSource + 9 mutation-killing tests). HXC-1303 pkg/inference provider-agnostic Backend interface + Router registry VERIFIED already complete (capability-aware Candidates/Route fallback + ReferenceBackend labeled output + ErrUnsupported; DUAL-LAYER capability correctness confirmed by me via mutation: neutering BOTH the Candidates filter AND the backend model gate fails TestRouterPicksCapabilityMatch/UnsupportedErrors – defense-in-depth, not a bluff). ZERO new deps. Gate: build/vet/vet-integration clean, full -short -race green, dataplane ok, tmux clean; 1311 boundary mutation + 1303 dual-layer mutation bite.</w:t>
+            </w:r>
+          </w:p>
+        </w:tc>
+      </w:tr>
+      <w:tr>
+        <w:tc>
+          <w:tcPr/>
+          <w:p>
+            <w:pPr>
+              <w:pStyle w:val="Compact"/>
+            </w:pPr>
+            <w:r>
+              <w:rPr>
+                <w:rStyle w:val="VerbatimChar"/>
+              </w:rPr>
               <w:t xml:space="preserve">5745f9f</w:t>
             </w:r>
           </w:p>
@@ -469,33 +496,6 @@
             </w:r>
             <w:r>
               <w:t xml:space="preserve">=&gt; no server running (zero leaks); real-tmux proofs intact (hxc1136 exit gate untouched). Test-only changes, ZERO production code modified. NOTE flakes: internal/advisory TestLockBlocksUntilAvailable + test/e2e TestClusterLifecycleSuite FAIL only under heavy concurrent full-suite -race load, PASS isolated (load-induced timing flakes, not regressions).</w:t>
-            </w:r>
-          </w:p>
-        </w:tc>
-      </w:tr>
-      <w:tr>
-        <w:tc>
-          <w:tcPr/>
-          <w:p>
-            <w:pPr>
-              <w:pStyle w:val="Compact"/>
-            </w:pPr>
-            <w:r>
-              <w:rPr>
-                <w:rStyle w:val="VerbatimChar"/>
-              </w:rPr>
-              <w:t xml:space="preserve">639e479</w:t>
-            </w:r>
-          </w:p>
-        </w:tc>
-        <w:tc>
-          <w:tcPr/>
-          <w:p>
-            <w:pPr>
-              <w:pStyle w:val="Compact"/>
-            </w:pPr>
-            <w:r>
-              <w:t xml:space="preserve">Foundation wave 22: mark 2 items Completed (HXC-1152/1160) — container-checkpoint migration CRDT merge / tmux full functional Attach (send-keys+capture-pane, real marker round-trip). Mutation spot-checks confirm bites. Registry 185-&gt;187 Completed / 452 Queued.</w:t>
             </w:r>
           </w:p>
         </w:tc>
@@ -605,7 +605,7 @@
               <w:rPr>
                 <w:rStyle w:val="VerbatimChar"/>
               </w:rPr>
-              <w:t xml:space="preserve">5745f9f</w:t>
+              <w:t xml:space="preserve">d4829d1</w:t>
             </w:r>
           </w:p>
         </w:tc>
@@ -633,7 +633,7 @@
               <w:pStyle w:val="Compact"/>
             </w:pPr>
             <w:r>
-              <w:t xml:space="preserve">2026-06-02T00:15:38Z</w:t>
+              <w:t xml:space="preserve">2026-06-02T00:16:20Z</w:t>
             </w:r>
           </w:p>
         </w:tc>

</xml_diff>

<commit_message>
Foundation wave 29: mark 3 items Completed (HXC-1298/1296/1310) — handheld scheduling policy / device<->pb mapping (honest lossy) / per-tier security model. Mutation spot-checks confirm bites. Registry 199->202 Completed (crossed 200) / 437 Queued.
</commit_message>
<xml_diff>
--- a/docs/export/continuation.docx
+++ b/docs/export/continuation.docx
@@ -34,7 +34,7 @@
         <w:t xml:space="preserve"> </w:t>
       </w:r>
       <w:r>
-        <w:t xml:space="preserve">92</w:t>
+        <w:t xml:space="preserve">93</w:t>
       </w:r>
       <w:r>
         <w:t xml:space="preserve"> </w:t>
@@ -50,7 +50,7 @@
         <w:t xml:space="preserve"> </w:t>
       </w:r>
       <w:r>
-        <w:t xml:space="preserve">2026-06-02T00:31:12Z</w:t>
+        <w:t xml:space="preserve">2026-06-02T00:31:55Z</w:t>
       </w:r>
       <w:r>
         <w:t xml:space="preserve"> </w:t>
@@ -184,6 +184,33 @@
               <w:rPr>
                 <w:rStyle w:val="VerbatimChar"/>
               </w:rPr>
+              <w:t xml:space="preserve">441c7fe</w:t>
+            </w:r>
+          </w:p>
+        </w:tc>
+        <w:tc>
+          <w:tcPr/>
+          <w:p>
+            <w:pPr>
+              <w:pStyle w:val="Compact"/>
+            </w:pPr>
+            <w:r>
+              <w:t xml:space="preserve">Foundation wave 29: 3 disjoint streams (all approved; A minor dead-helper + comment-lie fixed by me). HXC-1298 power/battery/thermal-aware handheld scheduling policy (pkg/scheduler/handheld.go HandheldPolicy Plugin reusing edgeaware battery/thermal/charging helpers: filter low-battery/over-thermal/unavailable/discharging-below-floor, score by battery/thermal/charging; absent-label assume-safe; 22 tests; mutation pct&lt; -&gt; pct&gt; fails LowBatteryRejected). HXC-1296 device.Descriptor&lt;-&gt;pb.Node round-trip mapping (NEW pkg/devicemap: DescriptorToNode/NodeToDescriptor over MAPPABLE fields; HONEST lossy – round-trip identity over mapped subset + explicit test that device-only fields NPU/power/battery/trust are LOST (no false-recovery bluff); no import cycle; 7 tests). HXC-1310 per-tier security model enforcement (NEW pkg/tiersec reusing sandbox.Capability+edge+tierdef: ProfileForTier + Enforce(tier,op)-&gt;Decision over capability/data-class(inclusive)/network-egress CIDR allowlist via stdlib net; low-tier denied / high-tier allowed both directions; 24 tests; mutation data-class &gt; -&gt; &gt;= fails inclusive-boundary). ZERO new deps, ZERO edits to existing files. Gate: build/vet/vet-integration clean, full -short -race green, dataplane ok, tmux clean; A+C mutations bite, B honest-loss reviewer-verified.</w:t>
+            </w:r>
+          </w:p>
+        </w:tc>
+      </w:tr>
+      <w:tr>
+        <w:tc>
+          <w:tcPr/>
+          <w:p>
+            <w:pPr>
+              <w:pStyle w:val="Compact"/>
+            </w:pPr>
+            <w:r>
+              <w:rPr>
+                <w:rStyle w:val="VerbatimChar"/>
+              </w:rPr>
               <w:t xml:space="preserve">634aa09</w:t>
             </w:r>
           </w:p>
@@ -412,54 +439,6 @@
             </w:pPr>
             <w:r>
               <w:t xml:space="preserve">Foundation wave 24: mark HXC-1162 Completed — E2E multi-node session CRDT convergence (5 replicas, arbitrary-order gossip, converge to identical Fingerprint + canonical truth; mutation-verified bite). Registry 187-&gt;188 Completed / 451 Queued.</w:t>
-            </w:r>
-          </w:p>
-        </w:tc>
-      </w:tr>
-      <w:tr>
-        <w:tc>
-          <w:tcPr/>
-          <w:p>
-            <w:pPr>
-              <w:pStyle w:val="Compact"/>
-            </w:pPr>
-            <w:r>
-              <w:rPr>
-                <w:rStyle w:val="VerbatimChar"/>
-              </w:rPr>
-              <w:t xml:space="preserve">8e8cebb</w:t>
-            </w:r>
-          </w:p>
-        </w:tc>
-        <w:tc>
-          <w:tcPr/>
-          <w:p>
-            <w:pPr>
-              <w:pStyle w:val="Compact"/>
-            </w:pPr>
-            <w:r>
-              <w:t xml:space="preserve">Foundation wave 24: HXC-1162 E2E multi-node session CRDT convergence (pkg/session/convergence_hxc1162_test.go, test-only, ZERO edits). Proves STRONG EVENTUAL CONSISTENCY beyond the existing 2-replica tests: 5 independent replicas each seeded with a DISJOINT partition of 100 ops, gossiped via seeded-random ARBITRARY-ORDER pairwise merges (dst = dst.Clone().Merge(src)) until 3-sweep quiescence; asserts (a) ALL 5 replicas reach an identical Fingerprint AND (b) that fingerprint equals a canonical truth replica that applied all 100 ops sequentially — over 20 seeds. Reuses existing genUpdates/replicaFrom/buildUpdate + CRDTSessionState Merge/Clone/Fingerprint. Builds on W22 pkg/checkpoint_merge: this is the convergence guarantee that makes coordinator-free session migration safe. Gate: build/vet/vet-integration clean, full -short -race green (zero failures this run), dataplane ok, tmux ls clean (W23 leak fix holds); INDEPENDENT MUTATION SPOT-CHECK: order-dependent equal-version pane tiebreak (paneWins</w:t>
-            </w:r>
-            <w:r>
-              <w:t xml:space="preserve"> </w:t>
-            </w:r>
-            <w:r>
-              <w:t xml:space="preserve">‘return false’</w:t>
-            </w:r>
-            <w:r>
-              <w:t xml:space="preserve">) -&gt; replicas DIVERGE -&gt;</w:t>
-            </w:r>
-            <w:r>
-              <w:t xml:space="preserve"> </w:t>
-            </w:r>
-            <w:r>
-              <w:t xml:space="preserve">‘CONVERGENCE FAILED replica 0 and 1 diverged’</w:t>
-            </w:r>
-            <w:r>
-              <w:t xml:space="preserve"> </w:t>
-            </w:r>
-            <w:r>
-              <w:t xml:space="preserve">(the N-node convergence bite is genuinely real). ZERO new deps.</w:t>
             </w:r>
           </w:p>
         </w:tc>
@@ -569,7 +548,7 @@
               <w:rPr>
                 <w:rStyle w:val="VerbatimChar"/>
               </w:rPr>
-              <w:t xml:space="preserve">634aa09</w:t>
+              <w:t xml:space="preserve">441c7fe</w:t>
             </w:r>
           </w:p>
         </w:tc>
@@ -597,7 +576,7 @@
               <w:pStyle w:val="Compact"/>
             </w:pPr>
             <w:r>
-              <w:t xml:space="preserve">2026-06-02T00:31:12Z</w:t>
+              <w:t xml:space="preserve">2026-06-02T00:31:55Z</w:t>
             </w:r>
           </w:p>
         </w:tc>

</xml_diff>

<commit_message>
Foundation wave 30: mark 3 items Completed (HXC-1302/1299/1291) — wireguard spot-drain teardown / discovery 15-tier registry / device.Probe real host detection. Mutation spot-checks confirm bites. Registry 202->205 Completed / 434 Queued.
</commit_message>
<xml_diff>
--- a/docs/export/continuation.docx
+++ b/docs/export/continuation.docx
@@ -34,7 +34,7 @@
         <w:t xml:space="preserve"> </w:t>
       </w:r>
       <w:r>
-        <w:t xml:space="preserve">94</w:t>
+        <w:t xml:space="preserve">95</w:t>
       </w:r>
       <w:r>
         <w:t xml:space="preserve"> </w:t>
@@ -50,7 +50,7 @@
         <w:t xml:space="preserve"> </w:t>
       </w:r>
       <w:r>
-        <w:t xml:space="preserve">2026-06-02T00:44:33Z</w:t>
+        <w:t xml:space="preserve">2026-06-02T00:45:17Z</w:t>
       </w:r>
       <w:r>
         <w:t xml:space="preserve"> </w:t>
@@ -184,6 +184,33 @@
               <w:rPr>
                 <w:rStyle w:val="VerbatimChar"/>
               </w:rPr>
+              <w:t xml:space="preserve">e4f0b03</w:t>
+            </w:r>
+          </w:p>
+        </w:tc>
+        <w:tc>
+          <w:tcPr/>
+          <w:p>
+            <w:pPr>
+              <w:pStyle w:val="Compact"/>
+            </w:pPr>
+            <w:r>
+              <w:t xml:space="preserve">Foundation wave 30: 3 disjoint streams (all approved no-fix; mutation spot-checks bite). HXC-1302 wireguard preemption-safe teardown (pkg/wireguard/teardown.go: MeshCoordinator.TeardownPeers Stop+RemovePeer-all idempotent + SpotDrainHook(mc) cloudspot.Hooks.StopAdmission; tests w/ real curve25519 keys: add N -&gt; teardown -&gt; ListPeers==0, idempotent, FakeSource+Handler.Run drain removes peers; mutation skip-RemovePeer fails). HXC-1299 discovery 15-tier registry (pkg/discovery/tier_registry.go: TierRegistry.Register+SelectByTier(minTier) rank&gt;=min via tierdef.Default() T1-T15 ordering, ordered exact-set; mutation &gt;=-&gt;&lt; fails TestSelectByTier_T8 got T1/T5 want T8/T12/T15). HXC-1291 device.Probe (pkg/device/probe.go + probe_{darwin,linux,other}.go: real Arch(GOARCH)/CPUCores(NumCPU)/MemoryBytes(sysctl hw.memsize / syscall.Sysinfo / MemStats fallback) + REAL os.Hostname-based ID, honest 0 for GPU/NPU/power; tests assert vs runtime oracle + real sysctl). ZERO new deps, ZERO edits to existing files. Gate: build/vet/vet-integration clean, full -short -race green, dataplane ok, tmux clean; B mutation bite + A/C reviewer-verified.</w:t>
+            </w:r>
+          </w:p>
+        </w:tc>
+      </w:tr>
+      <w:tr>
+        <w:tc>
+          <w:tcPr/>
+          <w:p>
+            <w:pPr>
+              <w:pStyle w:val="Compact"/>
+            </w:pPr>
+            <w:r>
+              <w:rPr>
+                <w:rStyle w:val="VerbatimChar"/>
+              </w:rPr>
               <w:t xml:space="preserve">1e88aec</w:t>
             </w:r>
           </w:p>
@@ -412,33 +439,6 @@
             </w:pPr>
             <w:r>
               <w:t xml:space="preserve">Foundation wave 25: mark 3 items Completed (HXC-1254/1255/1267) — parallel TestRunner / session test FSM / helix-test CLI (verified already complete). Mutation spot-checks confirm bites. Registry 188-&gt;191 Completed / 448 Queued.</w:t>
-            </w:r>
-          </w:p>
-        </w:tc>
-      </w:tr>
-      <w:tr>
-        <w:tc>
-          <w:tcPr/>
-          <w:p>
-            <w:pPr>
-              <w:pStyle w:val="Compact"/>
-            </w:pPr>
-            <w:r>
-              <w:rPr>
-                <w:rStyle w:val="VerbatimChar"/>
-              </w:rPr>
-              <w:t xml:space="preserve">aba565b</w:t>
-            </w:r>
-          </w:p>
-        </w:tc>
-        <w:tc>
-          <w:tcPr/>
-          <w:p>
-            <w:pPr>
-              <w:pStyle w:val="Compact"/>
-            </w:pPr>
-            <w:r>
-              <w:t xml:space="preserve">Foundation wave 25: 2 new test-orchestration pkgs + 1 verified-already-done. HXC-1254 parallel TestRunner (NEW pkg/testing/runner: Suite registration + bounded-worker-pool parallel execution + result collection/aggregate Report sorted deterministically; barrier-proof concurrency test (serial runner deadlocks under a ctx-deadline guard), atomic peak counter proves MaxConcurrency cap, result counts incl Err-&gt;Failed (defense-in-depth: both guards must be removed to break the want-3-got-4 bite — mutation-verified), Register dup/empty-name errors). HXC-1255 session test FSM (NEW pkg/testing/sessionfsm: Idle-&gt;Setup-&gt;Running-&gt;ChaosInject-&gt;Verify-&gt;Done + any-nonterminal-&gt;Failed; legal-transition table, IllegalTransitionError leaves state unchanged, per-state callbacks fire in order, History(); mutation guard-always-allow -&gt; illegal transition test FAILS). HXC-1267 helix-test CLI VERIFIED already complete (cmd/helix-test dst/chaos/device/snapshot subcommands wired to real pkg/testing packages w/ 13 mutation-sensitive tests; device subcmd lists real T1-T8) — verified+marked, not rebuilt. ZERO new deps, ZERO edits to existing files. Gate: build/vet/vet-integration clean, full -short -race green, dataplane ok, tmux clean (W23 fix holds); mutation spot-checks: FSM guard bites, TestRunner Err-&gt;Failed bites (both guards), cap-peak&lt;=2 + barrier verified by review.</w:t>
             </w:r>
           </w:p>
         </w:tc>
@@ -548,7 +548,7 @@
               <w:rPr>
                 <w:rStyle w:val="VerbatimChar"/>
               </w:rPr>
-              <w:t xml:space="preserve">1e88aec</w:t>
+              <w:t xml:space="preserve">e4f0b03</w:t>
             </w:r>
           </w:p>
         </w:tc>
@@ -576,7 +576,7 @@
               <w:pStyle w:val="Compact"/>
             </w:pPr>
             <w:r>
-              <w:t xml:space="preserve">2026-06-02T00:44:33Z</w:t>
+              <w:t xml:space="preserve">2026-06-02T00:45:17Z</w:t>
             </w:r>
           </w:p>
         </w:tc>

</xml_diff>

<commit_message>
Foundation wave 31: mark 3 items Completed (HXC-1290/1292/1297) — device Tier T1-T15 + AssignTier registry classifier / tier-aware+power-aware scheduler Plugin (verified). Mutation spot-checks confirm bites. Registry 205->208 Completed / 431 Queued.
</commit_message>
<xml_diff>
--- a/docs/export/continuation.docx
+++ b/docs/export/continuation.docx
@@ -34,7 +34,7 @@
         <w:t xml:space="preserve"> </w:t>
       </w:r>
       <w:r>
-        <w:t xml:space="preserve">96</w:t>
+        <w:t xml:space="preserve">97</w:t>
       </w:r>
       <w:r>
         <w:t xml:space="preserve"> </w:t>
@@ -50,7 +50,7 @@
         <w:t xml:space="preserve"> </w:t>
       </w:r>
       <w:r>
-        <w:t xml:space="preserve">2026-06-02T00:59:25Z</w:t>
+        <w:t xml:space="preserve">2026-06-02T01:00:08Z</w:t>
       </w:r>
       <w:r>
         <w:t xml:space="preserve"> </w:t>
@@ -184,6 +184,33 @@
               <w:rPr>
                 <w:rStyle w:val="VerbatimChar"/>
               </w:rPr>
+              <w:t xml:space="preserve">9baae11</w:t>
+            </w:r>
+          </w:p>
+        </w:tc>
+        <w:tc>
+          <w:tcPr/>
+          <w:p>
+            <w:pPr>
+              <w:pStyle w:val="Compact"/>
+            </w:pPr>
+            <w:r>
+              <w:t xml:space="preserve">Foundation wave 31: HXC-1290+1292 combined + HXC-1297 verified-done. HXC-1290 (device universal Descriptor w/ 15 tiers) + HXC-1292 (device.AssignTier decision tree) — ONE deliverable: extended pkg/device.Tier enum additively to T1-T15 (+String cases; existing TierUnknown/T1-T8/ClassifyTier/EffectiveCompute byte-for-byte UNCHANGED, verified) + NEW pkg/device/assign_tier.go AssignTier(d,reg *tierdef.Registry) Tier mapping Descriptor-&gt;tierdef.DeviceCaps and iterating HIGH-&gt;LOW returning the highest tier whose tierdef.Meets passes (networkUnknown=MaxInt sentinel so missing net field never disqualifies); 46 tests incl exact-per-tier T1/T8/T12/T15, exhaustive boundary sweep, monotonic property; mutation low-&gt;high iteration -&gt; T15-spec wrongly returns T1 FAILS. Import device-&gt;tierdef (no cycle). HXC-1297 pkg/scheduler tier-aware+power-aware Plugin VERIFIED already complete (tier_power.go min-tier filter + watts/perf-per-watt/overshoot score + edgeaware.go + handheld.go, 67+ mutation-guarded tests; mutation tier-min &lt; -&gt; &gt; fails TestTierPowerFilterRejectsBelowMinTier). ZERO new deps. Gate: build/vet/vet-integration ./… clean (tier.go edit no regression), full -short -race green, dataplane ok, tmux clean; iteration-order + tier-min mutations bite.</w:t>
+            </w:r>
+          </w:p>
+        </w:tc>
+      </w:tr>
+      <w:tr>
+        <w:tc>
+          <w:tcPr/>
+          <w:p>
+            <w:pPr>
+              <w:pStyle w:val="Compact"/>
+            </w:pPr>
+            <w:r>
+              <w:rPr>
+                <w:rStyle w:val="VerbatimChar"/>
+              </w:rPr>
               <w:t xml:space="preserve">9327930</w:t>
             </w:r>
           </w:p>
@@ -412,33 +439,6 @@
             </w:pPr>
             <w:r>
               <w:t xml:space="preserve">Foundation wave 26: mark 3 items Completed (HXC-1268/1265/1236) — helix-snapshot CLI / capability sandbox+resource-limits+audit / HelixNetwork trait (prod+sim). Mutation spot-checks + real-binary verified. Registry 191-&gt;194 Completed / 445 Queued.</w:t>
-            </w:r>
-          </w:p>
-        </w:tc>
-      </w:tr>
-      <w:tr>
-        <w:tc>
-          <w:tcPr/>
-          <w:p>
-            <w:pPr>
-              <w:pStyle w:val="Compact"/>
-            </w:pPr>
-            <w:r>
-              <w:rPr>
-                <w:rStyle w:val="VerbatimChar"/>
-              </w:rPr>
-              <w:t xml:space="preserve">7c41c2f</w:t>
-            </w:r>
-          </w:p>
-        </w:tc>
-        <w:tc>
-          <w:tcPr/>
-          <w:p>
-            <w:pPr>
-              <w:pStyle w:val="Compact"/>
-            </w:pPr>
-            <w:r>
-              <w:t xml:space="preserve">Foundation wave 26: 3 disjoint streams (all approved; A minor comment-lie fixed by me). HXC-1268 standalone cmd/helix-snapshot CLI (run() dispatch + create/restore/compare/list/delete wiring real snapshot.Manager via -dir; 11 tests w/ real temp-dir fs assertions + exit codes; verified by me running the REAL binary: create writes .golden, list shows it, compare rc=0, delete removes it). HXC-1265 capability sandbox + REAL resource-limit enforcement + audit (NEW pkg/sandbox: Capability deny-by-default grant model + Guard.Check (deny ungranted) + atomic.Int64 cumulative MaxOps/MaxBytes/MaxDuration enforcement – the genuine gap vs pkg/wasm caps – + MemAudit allow/deny log; in-process model, OS syscall isolation honestly out-of-scope not faked; mutation neuter-Has -&gt; ungranted allowed FAILS). HXC-1236 HelixNetwork trait prod+sim (NEW pkg/helixnet: HelixNetwork interface + ProdNetwork real in-process channel fabric (bytes genuinely move A-&gt;B, deliver errors on unknown/closed dst) + SimNetwork deterministic via dst.Engine; zero pkg/swim edits – that’s 1237; mutation drop-delivery -&gt; send/unknown-addr tests FAIL). ZERO new deps, ZERO edits to existing files. Gate: build/vet/vet-integration clean, full -short -race green (only the known internal/advisory load-flake, passes isolated), dataplane ok, tmux/screen clean; 3 mutation spot-checks bite + helix-snapshot real-binary verified.</w:t>
             </w:r>
           </w:p>
         </w:tc>
@@ -548,7 +548,7 @@
               <w:rPr>
                 <w:rStyle w:val="VerbatimChar"/>
               </w:rPr>
-              <w:t xml:space="preserve">9327930</w:t>
+              <w:t xml:space="preserve">9baae11</w:t>
             </w:r>
           </w:p>
         </w:tc>
@@ -576,7 +576,7 @@
               <w:pStyle w:val="Compact"/>
             </w:pPr>
             <w:r>
-              <w:t xml:space="preserve">2026-06-02T00:59:25Z</w:t>
+              <w:t xml:space="preserve">2026-06-02T01:00:08Z</w:t>
             </w:r>
           </w:p>
         </w:tc>

</xml_diff>

<commit_message>
Foundation wave 32: mark 8 items Completed (HXC-1334 HLC drift-clamp + verified HXC-1335/1336/1337/1338/1340/1341/1304 — CRDT/HLC/Merkle/Cell-federation/inference distributed primitives). Mutation spot-checks confirm bites. Registry 208->216 Completed / 423 Queued.
</commit_message>
<xml_diff>
--- a/docs/export/continuation.docx
+++ b/docs/export/continuation.docx
@@ -34,7 +34,7 @@
         <w:t xml:space="preserve"> </w:t>
       </w:r>
       <w:r>
-        <w:t xml:space="preserve">98</w:t>
+        <w:t xml:space="preserve">99</w:t>
       </w:r>
       <w:r>
         <w:t xml:space="preserve"> </w:t>
@@ -50,7 +50,7 @@
         <w:t xml:space="preserve"> </w:t>
       </w:r>
       <w:r>
-        <w:t xml:space="preserve">2026-06-02T01:12:23Z</w:t>
+        <w:t xml:space="preserve">2026-06-02T01:13:11Z</w:t>
       </w:r>
       <w:r>
         <w:t xml:space="preserve"> </w:t>
@@ -184,6 +184,33 @@
               <w:rPr>
                 <w:rStyle w:val="VerbatimChar"/>
               </w:rPr>
+              <w:t xml:space="preserve">0346e1c</w:t>
+            </w:r>
+          </w:p>
+        </w:tc>
+        <w:tc>
+          <w:tcPr/>
+          <w:p>
+            <w:pPr>
+              <w:pStyle w:val="Compact"/>
+            </w:pPr>
+            <w:r>
+              <w:t xml:space="preserve">Foundation wave 32: HXC-1334 HLC drift clamp implemented + 7 phase-6/5 items verified-already-done. HXC-1334 (pkg/hlc): added DefaultMaxDrift const + NewWithMaxDrift + a drift-clamp block in Clock.Update — a remote physical timestamp exceeding local wall-clock by &gt;maxDrift is clamped to local+maxDrift (prevents far-future-remote clock poisoning, HLC’s classic failure mode); Now() untouched, existing Update in-drift behaviour + 14 existing tests intact, 6 new tests; mutation neuter-clamp -&gt; far-future remote (1.5e9) &gt; ceiling (1.05e9) FAILS. VERIFIED already-complete (build+test+mutation-confirmed suites, NOT rebuilt): HXC-1335 pkg/crdt GCounter, HXC-1336 LWWRegister (timestamp+replica LWW tiebreak), HXC-1337 ORSet (mutation ignore-tombstones fails AddRemove tests), HXC-1338 pkg/crdt/merkle anti-entropy Diff (mutation Diff-nil fails), HXC-1340 pkg/federation Cell model+FSM (mutation always-legal-transition fails RejectsIllegalJumps), HXC-1341 CellRegistry Register/Deregister/Lookup/List/Advance thread-safe, HXC-1304 pkg/inference LocalBackend wrapping internal/llm. ZERO new deps. Gate: build/vet/vet-integration clean, full -short -race green, dataplane ok, tmux clean; drift-clamp + 3 batch mutations bite.</w:t>
+            </w:r>
+          </w:p>
+        </w:tc>
+      </w:tr>
+      <w:tr>
+        <w:tc>
+          <w:tcPr/>
+          <w:p>
+            <w:pPr>
+              <w:pStyle w:val="Compact"/>
+            </w:pPr>
+            <w:r>
+              <w:rPr>
+                <w:rStyle w:val="VerbatimChar"/>
+              </w:rPr>
               <w:t xml:space="preserve">caabf37</w:t>
             </w:r>
           </w:p>
@@ -412,33 +439,6 @@
             </w:pPr>
             <w:r>
               <w:t xml:space="preserve">Foundation wave 27: mark 2 items Completed (HXC-1237/1278) — swim prod+sim transport parity (real protocol over deterministic SimNetwork) / property-based fuzzing (4 Go fuzz targets). Mutation spot-checks confirm bites. Registry 194-&gt;196 Completed / 443 Queued.</w:t>
-            </w:r>
-          </w:p>
-        </w:tc>
-      </w:tr>
-      <w:tr>
-        <w:tc>
-          <w:tcPr/>
-          <w:p>
-            <w:pPr>
-              <w:pStyle w:val="Compact"/>
-            </w:pPr>
-            <w:r>
-              <w:rPr>
-                <w:rStyle w:val="VerbatimChar"/>
-              </w:rPr>
-              <w:t xml:space="preserve">656bec1</w:t>
-            </w:r>
-          </w:p>
-        </w:tc>
-        <w:tc>
-          <w:tcPr/>
-          <w:p>
-            <w:pPr>
-              <w:pStyle w:val="Compact"/>
-            </w:pPr>
-            <w:r>
-              <w:t xml:space="preserve">Foundation wave 27: 2 disjoint streams (both approved no-fix; mutation spot-checks bite). HXC-1237 swim prod+sim transport parity (pkg/swim: minimal additive Config.Transport injection seam in NewProtocol – nil =&gt; real UDP NewTransport as before, non-nil =&gt; injected MessageTransport; prod behavior unchanged. NEW simparity_test.go runs the REAL swim membership protocol over the deterministic SimNetwork: 3-node full-mesh converges (all see StateAlive, 12 msgs), 4-node determinism (same seed identical), seam-load-bearing test asserts sim addr 127.0.0.1:18200. mutation: ignore cfg.Transport -&gt; node sees only itself, convergence FAILS). HXC-1278 property-based + coverage-guided fuzzing (4 native Go FuzzXxx targets, NEW files only): FuzzParseCoverProfile (no-panic + Covered&lt;=Total + Aggregate in [0,100]), FuzzParseTraceParent (no-panic + String() round-trip stable + valid hex ids), FuzzApply (checkpoint_merge no-panic on arbitrary checkpoint bytes via real checksum/gob path), FuzzCRDTCheckpointRoundTrip (NewCRDTCheckpoint-&gt;RestoreCRDT Fingerprint-stable + corrupt-bytes no-panic). All assert falsifiable invariants on non-empty seed corpora, run under plain go test (no -fuzz needed); mutation: break TraceParent.String() round-trip FAILS. ZERO new deps. Gate: build/vet/vet-integration clean, full -short -race green, dataplane ok, tmux clean; 2 mutation spot-checks bite.</w:t>
             </w:r>
           </w:p>
         </w:tc>
@@ -548,7 +548,7 @@
               <w:rPr>
                 <w:rStyle w:val="VerbatimChar"/>
               </w:rPr>
-              <w:t xml:space="preserve">caabf37</w:t>
+              <w:t xml:space="preserve">0346e1c</w:t>
             </w:r>
           </w:p>
         </w:tc>
@@ -576,7 +576,7 @@
               <w:pStyle w:val="Compact"/>
             </w:pPr>
             <w:r>
-              <w:t xml:space="preserve">2026-06-02T01:12:23Z</w:t>
+              <w:t xml:space="preserve">2026-06-02T01:13:11Z</w:t>
             </w:r>
           </w:p>
         </w:tc>

</xml_diff>

<commit_message>
Foundation wave 33: mark 3 items Completed (HXC-1339/1373/1343) — Vector Clock causality / split-brain partition classifier / phi-accrual failure detector (verified). Mutation spot-checks confirm bites. Registry 216->219 Completed / 420 Queued.
</commit_message>
<xml_diff>
--- a/docs/export/continuation.docx
+++ b/docs/export/continuation.docx
@@ -34,7 +34,7 @@
         <w:t xml:space="preserve"> </w:t>
       </w:r>
       <w:r>
-        <w:t xml:space="preserve">100</w:t>
+        <w:t xml:space="preserve">101</w:t>
       </w:r>
       <w:r>
         <w:t xml:space="preserve"> </w:t>
@@ -50,7 +50,7 @@
         <w:t xml:space="preserve"> </w:t>
       </w:r>
       <w:r>
-        <w:t xml:space="preserve">2026-06-02T01:25:23Z</w:t>
+        <w:t xml:space="preserve">2026-06-02T01:26:06Z</w:t>
       </w:r>
       <w:r>
         <w:t xml:space="preserve"> </w:t>
@@ -184,6 +184,33 @@
               <w:rPr>
                 <w:rStyle w:val="VerbatimChar"/>
               </w:rPr>
+              <w:t xml:space="preserve">37c2a9a</w:t>
+            </w:r>
+          </w:p>
+        </w:tc>
+        <w:tc>
+          <w:tcPr/>
+          <w:p>
+            <w:pPr>
+              <w:pStyle w:val="Compact"/>
+            </w:pPr>
+            <w:r>
+              <w:t xml:space="preserve">Foundation wave 33: 2 builds + 1 verified. HXC-1339 Vector Clock causality (pkg/crdt/vectorclock.go: VectorClock map[ReplicaID]uint64 + Increment/Merge(per-replica max)/Compare(Before/After/Equal/CONCURRENT)/HappensBefore; 23 tests; Concurrent case (disjoint advances both flags) is the bite — a single-flag Compare returns Before and fails). HXC-1373 split-brain prevention + partition classification (NEW pkg/splitbrain: Classify(reachable,total,witness)-&gt;(Partition,Action) via 2*reachable vs total — HasQuorum/Tie/Minority/TotalIsolation + Decide leader-step-down; 22 subtests; 2-of-5=Minority NOT Tie (integer-division trap caught), 2-of-4=Tie, witness flips tie action; mutation &gt; -&gt; &gt;= fails 2-of-4 tie). HXC-1343 phi-accrual failure detector VERIFIED already complete (pkg/swim/phi_accrual.go sliding-window mean/variance + -log10 tail prob + Suspect; mutation Phi-return-0 fails monotonic-rise test). ZERO new deps, ZERO edits to existing files. Gate: build/vet/vet-integration clean, full -short -race green, dataplane ok, tmux clean; B quorum-tie + A Concurrent + 1343 phi mutations bite.</w:t>
+            </w:r>
+          </w:p>
+        </w:tc>
+      </w:tr>
+      <w:tr>
+        <w:tc>
+          <w:tcPr/>
+          <w:p>
+            <w:pPr>
+              <w:pStyle w:val="Compact"/>
+            </w:pPr>
+            <w:r>
+              <w:rPr>
+                <w:rStyle w:val="VerbatimChar"/>
+              </w:rPr>
               <w:t xml:space="preserve">752a2da</w:t>
             </w:r>
           </w:p>
@@ -412,33 +439,6 @@
             </w:pPr>
             <w:r>
               <w:t xml:space="preserve">Foundation wave 28: mark 3 items Completed (HXC-1311/1301/1303) — T1-T15 tier definitions / cloudspot PreemptionWatcher (verified) / inference Backend+Router (verified, dual-layer mutation). Registry 196-&gt;199 Completed / 440 Queued.</w:t>
-            </w:r>
-          </w:p>
-        </w:tc>
-      </w:tr>
-      <w:tr>
-        <w:tc>
-          <w:tcPr/>
-          <w:p>
-            <w:pPr>
-              <w:pStyle w:val="Compact"/>
-            </w:pPr>
-            <w:r>
-              <w:rPr>
-                <w:rStyle w:val="VerbatimChar"/>
-              </w:rPr>
-              <w:t xml:space="preserve">d4829d1</w:t>
-            </w:r>
-          </w:p>
-        </w:tc>
-        <w:tc>
-          <w:tcPr/>
-          <w:p>
-            <w:pPr>
-              <w:pStyle w:val="Compact"/>
-            </w:pPr>
-            <w:r>
-              <w:t xml:space="preserve">Foundation wave 28: HXC-1311 implemented + HXC-1301/1303 verified-already-done. HXC-1311 T1-T15 tier definitions (NEW pkg/tierdef: //go:embed tierdef.yaml with all 15 ascending tiers + min_requirements; LoadTiers parse+validate (rejects bad schema_version, missing/dup/out-of-order/wrong-count), Default(); TierDef.Meets(DeviceCaps) inclusive &gt;= per-dimension (cpu/mem/gpu/vram/net); 73 test cases assert exact parsed T1/T15 values + per-dimension below-boundary false + exact-boundary true; mutation &lt; -&gt; &lt;= fails TestMeets_ExactBoundary_True). HXC-1301 pkg/cloudspot PreemptionWatcher VERIFIED already complete (injectable PreemptionSource + 3-step graceful drain StopAdmission/Checkpoint/Deregister + deadline ForceStop + FakeSource + 9 mutation-killing tests). HXC-1303 pkg/inference provider-agnostic Backend interface + Router registry VERIFIED already complete (capability-aware Candidates/Route fallback + ReferenceBackend labeled output + ErrUnsupported; DUAL-LAYER capability correctness confirmed by me via mutation: neutering BOTH the Candidates filter AND the backend model gate fails TestRouterPicksCapabilityMatch/UnsupportedErrors – defense-in-depth, not a bluff). ZERO new deps. Gate: build/vet/vet-integration clean, full -short -race green, dataplane ok, tmux clean; 1311 boundary mutation + 1303 dual-layer mutation bite.</w:t>
             </w:r>
           </w:p>
         </w:tc>
@@ -548,7 +548,7 @@
               <w:rPr>
                 <w:rStyle w:val="VerbatimChar"/>
               </w:rPr>
-              <w:t xml:space="preserve">752a2da</w:t>
+              <w:t xml:space="preserve">37c2a9a</w:t>
             </w:r>
           </w:p>
         </w:tc>
@@ -576,7 +576,7 @@
               <w:pStyle w:val="Compact"/>
             </w:pPr>
             <w:r>
-              <w:t xml:space="preserve">2026-06-02T01:25:23Z</w:t>
+              <w:t xml:space="preserve">2026-06-02T01:26:06Z</w:t>
             </w:r>
           </w:p>
         </w:tc>

</xml_diff>

<commit_message>
Foundation wave 34: mark 3 items Completed (HXC-1365/1342/1353) — latency-aware spot scheduler scoring / federation API aggregation (verified) / WireGuard key-rotation overlap (verified). Mutation spot-checks confirm bites. Registry 219->222 Completed / 417 Queued.
</commit_message>
<xml_diff>
--- a/docs/export/continuation.docx
+++ b/docs/export/continuation.docx
@@ -34,7 +34,7 @@
         <w:t xml:space="preserve"> </w:t>
       </w:r>
       <w:r>
-        <w:t xml:space="preserve">102</w:t>
+        <w:t xml:space="preserve">103</w:t>
       </w:r>
       <w:r>
         <w:t xml:space="preserve"> </w:t>
@@ -50,7 +50,7 @@
         <w:t xml:space="preserve"> </w:t>
       </w:r>
       <w:r>
-        <w:t xml:space="preserve">2026-06-02T01:37:02Z</w:t>
+        <w:t xml:space="preserve">2026-06-02T01:37:45Z</w:t>
       </w:r>
       <w:r>
         <w:t xml:space="preserve"> </w:t>
@@ -184,6 +184,33 @@
               <w:rPr>
                 <w:rStyle w:val="VerbatimChar"/>
               </w:rPr>
+              <w:t xml:space="preserve">0c8b4ca</w:t>
+            </w:r>
+          </w:p>
+        </w:tc>
+        <w:tc>
+          <w:tcPr/>
+          <w:p>
+            <w:pPr>
+              <w:pStyle w:val="Compact"/>
+            </w:pPr>
+            <w:r>
+              <w:t xml:space="preserve">Foundation wave 34: HXC-1365 built + HXC-1342/1353 verified. HXC-1365 latency-aware spot/preemptible scheduler scoring (NEW pkg/scheduler/latency_spot.go LatencySpotPolicy Plugin: Score = base - latency_ms*k - preemptible-penalty(latency-sensitive jobs) + spot-bonus(batch); optional MaxLatencyMs Filter; absent-label assume-safe; 20 tests; mutation flip penalty-sign -&gt; higher-latency scores higher FAILS LowerLatencyScoresHigher, mutation remove preemptible-penalty -&gt; sensitive-job ordering FAILS). HXC-1342 federation API aggregation w/ partial failure VERIFIED (pkg/federation/aggregate.go CellError/Aggregate.Errors/AllCells; mutation drop-error-recording fails TestAllCells_PartialFailure). HXC-1353 WireGuard zero-downtime key rotation w/ overlap window VERIFIED (pkg/wireguard/keyrotation.go KeyOverlap grace + ActiveKeys; mutation drop-retain fails TestActiveKeysGraceWindow). ZERO new deps, ZERO edits to existing files. Gate: build/vet/vet-integration clean, full -short -race green, dataplane ok, tmux clean; 1365 latency-sign + 1342 + 1353 mutations bite.</w:t>
+            </w:r>
+          </w:p>
+        </w:tc>
+      </w:tr>
+      <w:tr>
+        <w:tc>
+          <w:tcPr/>
+          <w:p>
+            <w:pPr>
+              <w:pStyle w:val="Compact"/>
+            </w:pPr>
+            <w:r>
+              <w:rPr>
+                <w:rStyle w:val="VerbatimChar"/>
+              </w:rPr>
               <w:t xml:space="preserve">6b9135e</w:t>
             </w:r>
           </w:p>
@@ -412,33 +439,6 @@
             </w:pPr>
             <w:r>
               <w:t xml:space="preserve">Foundation wave 29: mark 3 items Completed (HXC-1298/1296/1310) — handheld scheduling policy / device&lt;-&gt;pb mapping (honest lossy) / per-tier security model. Mutation spot-checks confirm bites. Registry 199-&gt;202 Completed (crossed 200) / 437 Queued.</w:t>
-            </w:r>
-          </w:p>
-        </w:tc>
-      </w:tr>
-      <w:tr>
-        <w:tc>
-          <w:tcPr/>
-          <w:p>
-            <w:pPr>
-              <w:pStyle w:val="Compact"/>
-            </w:pPr>
-            <w:r>
-              <w:rPr>
-                <w:rStyle w:val="VerbatimChar"/>
-              </w:rPr>
-              <w:t xml:space="preserve">441c7fe</w:t>
-            </w:r>
-          </w:p>
-        </w:tc>
-        <w:tc>
-          <w:tcPr/>
-          <w:p>
-            <w:pPr>
-              <w:pStyle w:val="Compact"/>
-            </w:pPr>
-            <w:r>
-              <w:t xml:space="preserve">Foundation wave 29: 3 disjoint streams (all approved; A minor dead-helper + comment-lie fixed by me). HXC-1298 power/battery/thermal-aware handheld scheduling policy (pkg/scheduler/handheld.go HandheldPolicy Plugin reusing edgeaware battery/thermal/charging helpers: filter low-battery/over-thermal/unavailable/discharging-below-floor, score by battery/thermal/charging; absent-label assume-safe; 22 tests; mutation pct&lt; -&gt; pct&gt; fails LowBatteryRejected). HXC-1296 device.Descriptor&lt;-&gt;pb.Node round-trip mapping (NEW pkg/devicemap: DescriptorToNode/NodeToDescriptor over MAPPABLE fields; HONEST lossy – round-trip identity over mapped subset + explicit test that device-only fields NPU/power/battery/trust are LOST (no false-recovery bluff); no import cycle; 7 tests). HXC-1310 per-tier security model enforcement (NEW pkg/tiersec reusing sandbox.Capability+edge+tierdef: ProfileForTier + Enforce(tier,op)-&gt;Decision over capability/data-class(inclusive)/network-egress CIDR allowlist via stdlib net; low-tier denied / high-tier allowed both directions; 24 tests; mutation data-class &gt; -&gt; &gt;= fails inclusive-boundary). ZERO new deps, ZERO edits to existing files. Gate: build/vet/vet-integration clean, full -short -race green, dataplane ok, tmux clean; A+C mutations bite, B honest-loss reviewer-verified.</w:t>
             </w:r>
           </w:p>
         </w:tc>
@@ -548,7 +548,7 @@
               <w:rPr>
                 <w:rStyle w:val="VerbatimChar"/>
               </w:rPr>
-              <w:t xml:space="preserve">6b9135e</w:t>
+              <w:t xml:space="preserve">0c8b4ca</w:t>
             </w:r>
           </w:p>
         </w:tc>
@@ -576,7 +576,7 @@
               <w:pStyle w:val="Compact"/>
             </w:pPr>
             <w:r>
-              <w:t xml:space="preserve">2026-06-02T01:37:02Z</w:t>
+              <w:t xml:space="preserve">2026-06-02T01:37:45Z</w:t>
             </w:r>
           </w:p>
         </w:tc>

</xml_diff>